<commit_message>
Add Chap5 Bug Reports
</commit_message>
<xml_diff>
--- a/reports/Software Testing and Evaluation.docx
+++ b/reports/Software Testing and Evaluation.docx
@@ -1,6 +1,6 @@
 
 <file path=word/document.xml><?xml version="1.0" encoding="utf-8"?>
-<w:document xmlns:wpc="http://schemas.microsoft.com/office/word/2010/wordprocessingCanvas" xmlns:cx="http://schemas.microsoft.com/office/drawing/2014/chartex" xmlns:cx1="http://schemas.microsoft.com/office/drawing/2015/9/8/chartex" xmlns:cx2="http://schemas.microsoft.com/office/drawing/2015/10/21/chartex" xmlns:cx3="http://schemas.microsoft.com/office/drawing/2016/5/9/chartex" xmlns:cx4="http://schemas.microsoft.com/office/drawing/2016/5/10/chartex" xmlns:cx5="http://schemas.microsoft.com/office/drawing/2016/5/11/chartex" xmlns:cx6="http://schemas.microsoft.com/office/drawing/2016/5/12/chartex" xmlns:cx7="http://schemas.microsoft.com/office/drawing/2016/5/13/chartex" xmlns:cx8="http://schemas.microsoft.com/office/drawing/2016/5/14/chartex" xmlns:mc="http://schemas.openxmlformats.org/markup-compatibility/2006" xmlns:aink="http://schemas.microsoft.com/office/drawing/2016/ink" xmlns:am3d="http://schemas.microsoft.com/office/drawing/2017/model3d" xmlns:o="urn:schemas-microsoft-com:office:office" xmlns:oel="http://schemas.microsoft.com/office/2019/extlst" xmlns:r="http://schemas.openxmlformats.org/officeDocument/2006/relationships" xmlns:m="http://schemas.openxmlformats.org/officeDocument/2006/math" xmlns:v="urn:schemas-microsoft-com:vml" xmlns:wp14="http://schemas.microsoft.com/office/word/2010/wordprocessingDrawing" xmlns:wp="http://schemas.openxmlformats.org/drawingml/2006/wordprocessingDrawing" xmlns:w10="urn:schemas-microsoft-com:office:word" xmlns:w="http://schemas.openxmlformats.org/wordprocessingml/2006/main" xmlns:w14="http://schemas.microsoft.com/office/word/2010/wordml" xmlns:w15="http://schemas.microsoft.com/office/word/2012/wordml" xmlns:w16cex="http://schemas.microsoft.com/office/word/2018/wordml/cex" xmlns:w16cid="http://schemas.microsoft.com/office/word/2016/wordml/cid" xmlns:w16="http://schemas.microsoft.com/office/word/2018/wordml" xmlns:w16du="http://schemas.microsoft.com/office/word/2023/wordml/word16du" xmlns:w16sdtdh="http://schemas.microsoft.com/office/word/2020/wordml/sdtdatahash" xmlns:w16sdtfl="http://schemas.microsoft.com/office/word/2024/wordml/sdtformatlock" xmlns:w16se="http://schemas.microsoft.com/office/word/2015/wordml/symex" xmlns:wpg="http://schemas.microsoft.com/office/word/2010/wordprocessingGroup" xmlns:wpi="http://schemas.microsoft.com/office/word/2010/wordprocessingInk" xmlns:wne="http://schemas.microsoft.com/office/word/2006/wordml" xmlns:wps="http://schemas.microsoft.com/office/word/2010/wordprocessingShape" xmlns:a="http://schemas.openxmlformats.org/drawingml/2006/main" xmlns:pic="http://schemas.openxmlformats.org/drawingml/2006/picture" mc:Ignorable="w14 w15 w16se w16cid w16 w16cex w16sdtdh w16sdtfl w16du wp14">
+<w:document xmlns:wpc="http://schemas.microsoft.com/office/word/2010/wordprocessingCanvas" xmlns:cx="http://schemas.microsoft.com/office/drawing/2014/chartex" xmlns:cx1="http://schemas.microsoft.com/office/drawing/2015/9/8/chartex" xmlns:cx2="http://schemas.microsoft.com/office/drawing/2015/10/21/chartex" xmlns:cx3="http://schemas.microsoft.com/office/drawing/2016/5/9/chartex" xmlns:cx4="http://schemas.microsoft.com/office/drawing/2016/5/10/chartex" xmlns:cx5="http://schemas.microsoft.com/office/drawing/2016/5/11/chartex" xmlns:cx6="http://schemas.microsoft.com/office/drawing/2016/5/12/chartex" xmlns:cx7="http://schemas.microsoft.com/office/drawing/2016/5/13/chartex" xmlns:cx8="http://schemas.microsoft.com/office/drawing/2016/5/14/chartex" xmlns:mc="http://schemas.openxmlformats.org/markup-compatibility/2006" xmlns:aink="http://schemas.microsoft.com/office/drawing/2016/ink" xmlns:am3d="http://schemas.microsoft.com/office/drawing/2017/model3d" xmlns:o="urn:schemas-microsoft-com:office:office" xmlns:oel="http://schemas.microsoft.com/office/2019/extlst" xmlns:r="http://schemas.openxmlformats.org/officeDocument/2006/relationships" xmlns:m="http://schemas.openxmlformats.org/officeDocument/2006/math" xmlns:v="urn:schemas-microsoft-com:vml" xmlns:wp14="http://schemas.microsoft.com/office/word/2010/wordprocessingDrawing" xmlns:wp="http://schemas.openxmlformats.org/drawingml/2006/wordprocessingDrawing" xmlns:w10="urn:schemas-microsoft-com:office:word" xmlns:w="http://schemas.openxmlformats.org/wordprocessingml/2006/main" xmlns:w14="http://schemas.microsoft.com/office/word/2010/wordml" xmlns:w15="http://schemas.microsoft.com/office/word/2012/wordml" xmlns:w16cex="http://schemas.microsoft.com/office/word/2018/wordml/cex" xmlns:w16cid="http://schemas.microsoft.com/office/word/2016/wordml/cid" xmlns:w16="http://schemas.microsoft.com/office/word/2018/wordml" xmlns:w16du="http://schemas.microsoft.com/office/word/2023/wordml/word16du" xmlns:w16sdtdh="http://schemas.microsoft.com/office/word/2020/wordml/sdtdatahash" xmlns:w16sdtfl="http://schemas.microsoft.com/office/word/2024/wordml/sdtformatlock" xmlns:w16se="http://schemas.microsoft.com/office/word/2015/wordml/symex" xmlns:wpg="http://schemas.microsoft.com/office/word/2010/wordprocessingGroup" xmlns:wpi="http://schemas.microsoft.com/office/word/2010/wordprocessingInk" xmlns:wne="http://schemas.microsoft.com/office/word/2006/wordml" xmlns:wps="http://schemas.microsoft.com/office/word/2010/wordprocessingShape" xmlns:a="http://schemas.openxmlformats.org/drawingml/2006/main" xmlns:pic="http://schemas.openxmlformats.org/drawingml/2006/picture" xmlns:a14="http://schemas.microsoft.com/office/drawing/2010/main" mc:Ignorable="w14 w15 w16se w16cid w16 w16cex w16sdtdh w16sdtfl w16du wp14">
   <w:body>
     <w:p>
       <w:pPr>
@@ -26372,350 +26372,121 @@
         </w:tc>
       </w:tr>
     </w:tbl>
-    <w:p>
-      <w:pPr>
-        <w:rPr>
-          <w:rFonts w:asciiTheme="majorBidi" w:hAnsiTheme="majorBidi" w:cstheme="majorBidi"/>
+    <w:p w14:noSpellErr="1">
+      <w:pPr>
+        <w:rPr>
+          <w:rFonts w:ascii="Angsana New" w:hAnsi="Angsana New" w:cs="Angsana New" w:asciiTheme="majorBidi" w:hAnsiTheme="majorBidi" w:cstheme="majorBidi"/>
           <w:sz w:val="32"/>
           <w:szCs w:val="32"/>
           <w:cs/>
         </w:rPr>
       </w:pPr>
+    </w:p>
+    <w:p w14:noSpellErr="1">
+      <w:pPr>
+        <w:rPr>
+          <w:rFonts w:ascii="Angsana New" w:hAnsi="Angsana New" w:cs="Angsana New" w:asciiTheme="majorBidi" w:hAnsiTheme="majorBidi" w:cstheme="majorBidi"/>
+          <w:sz w:val="32"/>
+          <w:szCs w:val="32"/>
+        </w:rPr>
+      </w:pPr>
+      <w:r>
+        <w:rPr>
+          <w:rFonts w:ascii="Angsana New" w:hAnsi="Angsana New" w:cs="Angsana New" w:asciiTheme="majorBidi" w:hAnsiTheme="majorBidi" w:cstheme="majorBidi"/>
+          <w:sz w:val="32"/>
+          <w:szCs w:val="32"/>
+        </w:rPr>
+        <w:br w:type="page"/>
+      </w:r>
     </w:p>
     <w:p>
       <w:pPr>
-        <w:rPr>
-          <w:rFonts w:hint="cs" w:asciiTheme="majorBidi" w:hAnsiTheme="majorBidi" w:cstheme="majorBidi"/>
-          <w:sz w:val="32"/>
-          <w:szCs w:val="32"/>
-        </w:rPr>
-      </w:pPr>
-      <w:r>
-        <w:rPr>
-          <w:rFonts w:asciiTheme="majorBidi" w:hAnsiTheme="majorBidi" w:cstheme="majorBidi"/>
-          <w:sz w:val="32"/>
-          <w:szCs w:val="32"/>
-          <w:cs/>
-        </w:rPr>
-        <w:br w:type="page"/>
-      </w:r>
-    </w:p>
-    <w:p>
-      <w:pPr>
         <w:pStyle w:val="1"/>
-        <w:rPr>
-          <w:rFonts w:asciiTheme="majorBidi" w:hAnsiTheme="majorBidi"/>
-          <w:b/>
-          <w:bCs/>
-          <w:color w:val="auto"/>
+        <w:keepNext w:val="1"/>
+        <w:keepLines w:val="1"/>
+        <w:spacing w:before="360" w:after="80"/>
+        <w:rPr>
+          <w:rFonts w:ascii="Angsana New" w:hAnsi="Angsana New" w:eastAsia="Angsana New" w:cs="Angsana New"/>
+          <w:b w:val="0"/>
+          <w:bCs w:val="0"/>
+          <w:i w:val="0"/>
+          <w:iCs w:val="0"/>
+          <w:caps w:val="0"/>
+          <w:smallCaps w:val="0"/>
+          <w:noProof w:val="0"/>
+          <w:color w:val="0F4761" w:themeColor="accent1" w:themeTint="FF" w:themeShade="BF"/>
+          <w:sz w:val="40"/>
           <w:szCs w:val="40"/>
-        </w:rPr>
-      </w:pPr>
-      <w:bookmarkStart w:name="_Toc225606401" w:id="16"/>
-      <w:r>
-        <w:rPr>
-          <w:rFonts w:asciiTheme="majorBidi" w:hAnsiTheme="majorBidi"/>
-          <w:b/>
-          <w:bCs/>
-          <w:color w:val="auto"/>
+          <w:lang w:bidi="th-TH"/>
+        </w:rPr>
+      </w:pPr>
+      <w:r>
+        <w:rPr>
+          <w:rFonts w:ascii="Angsana New" w:hAnsi="Angsana New" w:eastAsia="Angsana New" w:cs="Angsana New"/>
+          <w:b w:val="1"/>
+          <w:bCs w:val="1"/>
+          <w:i w:val="0"/>
+          <w:iCs w:val="0"/>
+          <w:caps w:val="0"/>
+          <w:smallCaps w:val="0"/>
+          <w:noProof w:val="0"/>
+          <w:color w:val="0F4761" w:themeColor="accent1" w:themeTint="FF" w:themeShade="BF"/>
+          <w:sz w:val="40"/>
           <w:szCs w:val="40"/>
-          <w:cs/>
+          <w:lang w:bidi="th-TH"/>
         </w:rPr>
         <w:t xml:space="preserve">บทที่ </w:t>
       </w:r>
       <w:r>
         <w:rPr>
-          <w:rFonts w:asciiTheme="majorBidi" w:hAnsiTheme="majorBidi"/>
-          <w:b/>
-          <w:bCs/>
-          <w:color w:val="auto"/>
+          <w:rFonts w:ascii="Angsana New" w:hAnsi="Angsana New" w:eastAsia="Angsana New" w:cs="Angsana New"/>
+          <w:b w:val="1"/>
+          <w:bCs w:val="1"/>
+          <w:i w:val="0"/>
+          <w:iCs w:val="0"/>
+          <w:caps w:val="0"/>
+          <w:smallCaps w:val="0"/>
+          <w:noProof w:val="0"/>
+          <w:color w:val="0F4761" w:themeColor="accent1" w:themeTint="FF" w:themeShade="BF"/>
+          <w:sz w:val="40"/>
           <w:szCs w:val="40"/>
+          <w:lang w:val="en-US" w:bidi="th-TH"/>
         </w:rPr>
         <w:t xml:space="preserve">5: </w:t>
       </w:r>
       <w:r>
         <w:rPr>
-          <w:rFonts w:asciiTheme="majorBidi" w:hAnsiTheme="majorBidi"/>
-          <w:b/>
-          <w:bCs/>
-          <w:color w:val="auto"/>
+          <w:rFonts w:ascii="Angsana New" w:hAnsi="Angsana New" w:eastAsia="Angsana New" w:cs="Angsana New"/>
+          <w:b w:val="1"/>
+          <w:bCs w:val="1"/>
+          <w:i w:val="0"/>
+          <w:iCs w:val="0"/>
+          <w:caps w:val="0"/>
+          <w:smallCaps w:val="0"/>
+          <w:noProof w:val="0"/>
+          <w:color w:val="0F4761" w:themeColor="accent1" w:themeTint="FF" w:themeShade="BF"/>
+          <w:sz w:val="40"/>
           <w:szCs w:val="40"/>
-          <w:cs/>
+          <w:lang w:bidi="th-TH"/>
         </w:rPr>
         <w:t>รายงานข้อผิดพลาด (</w:t>
       </w:r>
       <w:r>
         <w:rPr>
-          <w:rFonts w:asciiTheme="majorBidi" w:hAnsiTheme="majorBidi"/>
-          <w:b/>
-          <w:bCs/>
-          <w:color w:val="auto"/>
+          <w:rFonts w:ascii="Angsana New" w:hAnsi="Angsana New" w:eastAsia="Angsana New" w:cs="Angsana New"/>
+          <w:b w:val="1"/>
+          <w:bCs w:val="1"/>
+          <w:i w:val="0"/>
+          <w:iCs w:val="0"/>
+          <w:caps w:val="0"/>
+          <w:smallCaps w:val="0"/>
+          <w:noProof w:val="0"/>
+          <w:color w:val="0F4761" w:themeColor="accent1" w:themeTint="FF" w:themeShade="BF"/>
+          <w:sz w:val="40"/>
           <w:szCs w:val="40"/>
+          <w:lang w:val="en-US" w:bidi="th-TH"/>
         </w:rPr>
         <w:t>Bug Reports)</w:t>
-      </w:r>
-      <w:bookmarkEnd w:id="16"/>
-    </w:p>
-    <w:p>
-      <w:pPr>
-        <w:tabs>
-          <w:tab w:val="left" w:pos="6300"/>
-        </w:tabs>
-        <w:rPr>
-          <w:rFonts w:asciiTheme="majorBidi" w:hAnsiTheme="majorBidi" w:cstheme="majorBidi"/>
-          <w:sz w:val="32"/>
-          <w:szCs w:val="32"/>
-        </w:rPr>
-      </w:pPr>
-      <w:r>
-        <w:rPr>
-          <w:rFonts w:asciiTheme="majorBidi" w:hAnsiTheme="majorBidi" w:cstheme="majorBidi"/>
-          <w:sz w:val="32"/>
-          <w:szCs w:val="32"/>
-          <w:highlight w:val="red"/>
-        </w:rPr>
-        <w:t>[</w:t>
-      </w:r>
-      <w:r>
-        <w:rPr>
-          <w:rFonts w:asciiTheme="majorBidi" w:hAnsiTheme="majorBidi" w:cstheme="majorBidi"/>
-          <w:sz w:val="32"/>
-          <w:szCs w:val="32"/>
-          <w:highlight w:val="red"/>
-          <w:cs/>
-        </w:rPr>
-        <w:t xml:space="preserve">หน้าที่ </w:t>
-      </w:r>
-      <w:r>
-        <w:rPr>
-          <w:rFonts w:asciiTheme="majorBidi" w:hAnsiTheme="majorBidi" w:cstheme="majorBidi"/>
-          <w:sz w:val="32"/>
-          <w:szCs w:val="32"/>
-          <w:highlight w:val="red"/>
-        </w:rPr>
-        <w:t xml:space="preserve">Manual Tester </w:t>
-      </w:r>
-      <w:r>
-        <w:rPr>
-          <w:rFonts w:asciiTheme="majorBidi" w:hAnsiTheme="majorBidi" w:cstheme="majorBidi"/>
-          <w:sz w:val="32"/>
-          <w:szCs w:val="32"/>
-          <w:highlight w:val="red"/>
-          <w:cs/>
-        </w:rPr>
-        <w:t>และ</w:t>
-      </w:r>
-      <w:r>
-        <w:rPr>
-          <w:rFonts w:asciiTheme="majorBidi" w:hAnsiTheme="majorBidi" w:cstheme="majorBidi"/>
-          <w:sz w:val="32"/>
-          <w:szCs w:val="32"/>
-          <w:highlight w:val="red"/>
-        </w:rPr>
-        <w:t xml:space="preserve"> Automation Engineer]</w:t>
-      </w:r>
-      <w:r>
-        <w:rPr>
-          <w:rFonts w:asciiTheme="majorBidi" w:hAnsiTheme="majorBidi" w:cstheme="majorBidi"/>
-          <w:sz w:val="32"/>
-          <w:szCs w:val="32"/>
-        </w:rPr>
-        <w:tab/>
-      </w:r>
-    </w:p>
-    <w:p>
-      <w:pPr>
-        <w:numPr>
-          <w:ilvl w:val="0"/>
-          <w:numId w:val="5"/>
-        </w:numPr>
-        <w:rPr>
-          <w:rFonts w:asciiTheme="majorBidi" w:hAnsiTheme="majorBidi" w:cstheme="majorBidi"/>
-          <w:sz w:val="32"/>
-          <w:szCs w:val="32"/>
-          <w:highlight w:val="yellow"/>
-        </w:rPr>
-      </w:pPr>
-      <w:r>
-        <w:rPr>
-          <w:rFonts w:asciiTheme="majorBidi" w:hAnsiTheme="majorBidi" w:cstheme="majorBidi"/>
-          <w:b/>
-          <w:bCs/>
-          <w:sz w:val="36"/>
-          <w:szCs w:val="36"/>
-          <w:highlight w:val="yellow"/>
-          <w:cs/>
-        </w:rPr>
-        <w:t>รายละเอียดบั๊กแต่ละตัว</w:t>
-      </w:r>
-      <w:r>
-        <w:rPr>
-          <w:rFonts w:asciiTheme="majorBidi" w:hAnsiTheme="majorBidi" w:cstheme="majorBidi"/>
-          <w:sz w:val="32"/>
-          <w:szCs w:val="32"/>
-          <w:highlight w:val="yellow"/>
-          <w:cs/>
-        </w:rPr>
-        <w:t>:</w:t>
-      </w:r>
-    </w:p>
-    <w:p>
-      <w:pPr>
-        <w:numPr>
-          <w:ilvl w:val="1"/>
-          <w:numId w:val="5"/>
-        </w:numPr>
-        <w:rPr>
-          <w:rFonts w:asciiTheme="majorBidi" w:hAnsiTheme="majorBidi" w:cstheme="majorBidi"/>
-          <w:sz w:val="32"/>
-          <w:szCs w:val="32"/>
-          <w:highlight w:val="yellow"/>
-        </w:rPr>
-      </w:pPr>
-      <w:r>
-        <w:rPr>
-          <w:rFonts w:asciiTheme="majorBidi" w:hAnsiTheme="majorBidi" w:cstheme="majorBidi"/>
-          <w:sz w:val="32"/>
-          <w:szCs w:val="32"/>
-          <w:highlight w:val="yellow"/>
-        </w:rPr>
-        <w:t xml:space="preserve">Bug ID: </w:t>
-      </w:r>
-      <w:r>
-        <w:rPr>
-          <w:rFonts w:asciiTheme="majorBidi" w:hAnsiTheme="majorBidi" w:cstheme="majorBidi"/>
-          <w:sz w:val="32"/>
-          <w:szCs w:val="32"/>
-          <w:highlight w:val="yellow"/>
-          <w:cs/>
-        </w:rPr>
-        <w:t xml:space="preserve">เช่น </w:t>
-      </w:r>
-      <w:r>
-        <w:rPr>
-          <w:rFonts w:asciiTheme="majorBidi" w:hAnsiTheme="majorBidi" w:cstheme="majorBidi"/>
-          <w:sz w:val="32"/>
-          <w:szCs w:val="32"/>
-          <w:highlight w:val="yellow"/>
-        </w:rPr>
-        <w:t>BUG-001</w:t>
-      </w:r>
-    </w:p>
-    <w:p>
-      <w:pPr>
-        <w:numPr>
-          <w:ilvl w:val="1"/>
-          <w:numId w:val="5"/>
-        </w:numPr>
-        <w:rPr>
-          <w:rFonts w:asciiTheme="majorBidi" w:hAnsiTheme="majorBidi" w:cstheme="majorBidi"/>
-          <w:sz w:val="32"/>
-          <w:szCs w:val="32"/>
-          <w:highlight w:val="yellow"/>
-        </w:rPr>
-      </w:pPr>
-      <w:r>
-        <w:rPr>
-          <w:rFonts w:asciiTheme="majorBidi" w:hAnsiTheme="majorBidi" w:cstheme="majorBidi"/>
-          <w:sz w:val="32"/>
-          <w:szCs w:val="32"/>
-          <w:highlight w:val="yellow"/>
-        </w:rPr>
-        <w:t>Severity: (Critical / High / Medium / Low)</w:t>
-      </w:r>
-    </w:p>
-    <w:p>
-      <w:pPr>
-        <w:numPr>
-          <w:ilvl w:val="1"/>
-          <w:numId w:val="5"/>
-        </w:numPr>
-        <w:rPr>
-          <w:rFonts w:asciiTheme="majorBidi" w:hAnsiTheme="majorBidi" w:cstheme="majorBidi"/>
-          <w:sz w:val="32"/>
-          <w:szCs w:val="32"/>
-          <w:highlight w:val="yellow"/>
-        </w:rPr>
-      </w:pPr>
-      <w:r>
-        <w:rPr>
-          <w:rFonts w:asciiTheme="majorBidi" w:hAnsiTheme="majorBidi" w:cstheme="majorBidi"/>
-          <w:sz w:val="32"/>
-          <w:szCs w:val="32"/>
-          <w:highlight w:val="yellow"/>
-        </w:rPr>
-        <w:t xml:space="preserve">Steps to Reproduce: </w:t>
-      </w:r>
-      <w:r>
-        <w:rPr>
-          <w:rFonts w:asciiTheme="majorBidi" w:hAnsiTheme="majorBidi" w:cstheme="majorBidi"/>
-          <w:sz w:val="32"/>
-          <w:szCs w:val="32"/>
-          <w:highlight w:val="yellow"/>
-          <w:cs/>
-        </w:rPr>
-        <w:t>ขั้นตอนที่ทำให้เกิดบั๊ก</w:t>
-      </w:r>
-    </w:p>
-    <w:p>
-      <w:pPr>
-        <w:numPr>
-          <w:ilvl w:val="1"/>
-          <w:numId w:val="5"/>
-        </w:numPr>
-        <w:rPr>
-          <w:rFonts w:asciiTheme="majorBidi" w:hAnsiTheme="majorBidi" w:cstheme="majorBidi"/>
-          <w:sz w:val="32"/>
-          <w:szCs w:val="32"/>
-          <w:highlight w:val="yellow"/>
-        </w:rPr>
-      </w:pPr>
-      <w:r>
-        <w:rPr>
-          <w:rFonts w:asciiTheme="majorBidi" w:hAnsiTheme="majorBidi" w:cstheme="majorBidi"/>
-          <w:sz w:val="32"/>
-          <w:szCs w:val="32"/>
-          <w:highlight w:val="yellow"/>
-        </w:rPr>
-        <w:t xml:space="preserve">Evidence: </w:t>
-      </w:r>
-      <w:r>
-        <w:rPr>
-          <w:rFonts w:asciiTheme="majorBidi" w:hAnsiTheme="majorBidi" w:cstheme="majorBidi"/>
-          <w:sz w:val="32"/>
-          <w:szCs w:val="32"/>
-          <w:highlight w:val="yellow"/>
-          <w:cs/>
-        </w:rPr>
-        <w:t xml:space="preserve">รูปภาพ </w:t>
-      </w:r>
-      <w:r>
-        <w:rPr>
-          <w:rFonts w:asciiTheme="majorBidi" w:hAnsiTheme="majorBidi" w:cstheme="majorBidi"/>
-          <w:sz w:val="32"/>
-          <w:szCs w:val="32"/>
-          <w:highlight w:val="yellow"/>
-        </w:rPr>
-        <w:t xml:space="preserve">Screenshot </w:t>
-      </w:r>
-      <w:r>
-        <w:rPr>
-          <w:rFonts w:asciiTheme="majorBidi" w:hAnsiTheme="majorBidi" w:cstheme="majorBidi"/>
-          <w:sz w:val="32"/>
-          <w:szCs w:val="32"/>
-          <w:highlight w:val="yellow"/>
-          <w:cs/>
-        </w:rPr>
-        <w:t xml:space="preserve">หรือ </w:t>
-      </w:r>
-      <w:r>
-        <w:rPr>
-          <w:rFonts w:asciiTheme="majorBidi" w:hAnsiTheme="majorBidi" w:cstheme="majorBidi"/>
-          <w:sz w:val="32"/>
-          <w:szCs w:val="32"/>
-          <w:highlight w:val="yellow"/>
-        </w:rPr>
-        <w:t>Error Log</w:t>
       </w:r>
     </w:p>
     <w:p>
@@ -26723,87 +26494,1806 @@
         <w:pStyle w:val="a9"/>
         <w:numPr>
           <w:ilvl w:val="0"/>
-          <w:numId w:val="5"/>
+          <w:numId w:val="26"/>
         </w:numPr>
         <w:rPr>
-          <w:rFonts w:asciiTheme="majorBidi" w:hAnsiTheme="majorBidi" w:cstheme="majorBidi"/>
-          <w:sz w:val="32"/>
-          <w:szCs w:val="32"/>
-          <w:highlight w:val="yellow"/>
-        </w:rPr>
-      </w:pPr>
-      <w:r>
-        <w:rPr>
-          <w:rFonts w:asciiTheme="majorBidi" w:hAnsiTheme="majorBidi" w:cstheme="majorBidi"/>
-          <w:b/>
-          <w:bCs/>
+          <w:rFonts w:ascii="Angsana New" w:hAnsi="Angsana New" w:eastAsia="Angsana New" w:cs="Angsana New"/>
+          <w:b w:val="0"/>
+          <w:bCs w:val="0"/>
+          <w:i w:val="0"/>
+          <w:iCs w:val="0"/>
+          <w:caps w:val="0"/>
+          <w:smallCaps w:val="0"/>
+          <w:noProof w:val="0"/>
+          <w:color w:val="000000" w:themeColor="text1" w:themeTint="FF" w:themeShade="FF"/>
+          <w:sz w:val="32"/>
+          <w:szCs w:val="32"/>
+          <w:lang w:bidi="th-TH"/>
+        </w:rPr>
+      </w:pPr>
+      <w:r>
+        <w:rPr>
+          <w:rFonts w:ascii="Angsana New" w:hAnsi="Angsana New" w:eastAsia="Angsana New" w:cs="Angsana New"/>
+          <w:b w:val="1"/>
+          <w:bCs w:val="1"/>
+          <w:i w:val="0"/>
+          <w:iCs w:val="0"/>
+          <w:caps w:val="0"/>
+          <w:smallCaps w:val="0"/>
+          <w:noProof w:val="0"/>
+          <w:color w:val="000000" w:themeColor="text1" w:themeTint="FF" w:themeShade="FF"/>
           <w:sz w:val="36"/>
           <w:szCs w:val="36"/>
-          <w:highlight w:val="yellow"/>
-          <w:cs/>
-        </w:rPr>
-        <w:t>แนวทางการแก้ไข</w:t>
-      </w:r>
-      <w:r>
-        <w:rPr>
-          <w:rFonts w:asciiTheme="majorBidi" w:hAnsiTheme="majorBidi" w:cstheme="majorBidi"/>
-          <w:sz w:val="32"/>
-          <w:szCs w:val="32"/>
-          <w:highlight w:val="yellow"/>
-        </w:rPr>
-        <w:t>[</w:t>
-      </w:r>
-      <w:r>
-        <w:rPr>
-          <w:rFonts w:asciiTheme="majorBidi" w:hAnsiTheme="majorBidi" w:cstheme="majorBidi"/>
-          <w:sz w:val="32"/>
-          <w:szCs w:val="32"/>
-          <w:highlight w:val="yellow"/>
-          <w:cs/>
-        </w:rPr>
-        <w:t>กรณีแก้</w:t>
-      </w:r>
-      <w:proofErr w:type="spellStart"/>
-      <w:r>
-        <w:rPr>
-          <w:rFonts w:asciiTheme="majorBidi" w:hAnsiTheme="majorBidi" w:cstheme="majorBidi"/>
-          <w:sz w:val="32"/>
-          <w:szCs w:val="32"/>
-          <w:highlight w:val="yellow"/>
-          <w:cs/>
-        </w:rPr>
-        <w:t>บัค</w:t>
-      </w:r>
-      <w:proofErr w:type="spellEnd"/>
-      <w:r>
-        <w:rPr>
-          <w:rFonts w:asciiTheme="majorBidi" w:hAnsiTheme="majorBidi" w:cstheme="majorBidi"/>
-          <w:sz w:val="32"/>
-          <w:szCs w:val="32"/>
-          <w:highlight w:val="yellow"/>
-          <w:cs/>
-        </w:rPr>
-        <w:t xml:space="preserve"> แล้วเขียนโค้ดแก้</w:t>
-      </w:r>
-      <w:r>
-        <w:rPr>
-          <w:rFonts w:asciiTheme="majorBidi" w:hAnsiTheme="majorBidi" w:cstheme="majorBidi"/>
-          <w:sz w:val="32"/>
-          <w:szCs w:val="32"/>
-          <w:highlight w:val="yellow"/>
-          <w:cs/>
-        </w:rPr>
-        <w:t>ที่น้ำหนึ่งทำ</w:t>
-      </w:r>
-      <w:r>
-        <w:rPr>
-          <w:rFonts w:asciiTheme="majorBidi" w:hAnsiTheme="majorBidi" w:cstheme="majorBidi"/>
-          <w:sz w:val="32"/>
-          <w:szCs w:val="32"/>
-          <w:highlight w:val="yellow"/>
-        </w:rPr>
-        <w:t>]</w:t>
-      </w:r>
+          <w:lang w:bidi="th-TH"/>
+        </w:rPr>
+        <w:t>รายละเอียดบั๊กแต่ละตัว</w:t>
+      </w:r>
+      <w:r>
+        <w:rPr>
+          <w:rFonts w:ascii="Angsana New" w:hAnsi="Angsana New" w:eastAsia="Angsana New" w:cs="Angsana New"/>
+          <w:b w:val="0"/>
+          <w:bCs w:val="0"/>
+          <w:i w:val="0"/>
+          <w:iCs w:val="0"/>
+          <w:caps w:val="0"/>
+          <w:smallCaps w:val="0"/>
+          <w:noProof w:val="0"/>
+          <w:color w:val="000000" w:themeColor="text1" w:themeTint="FF" w:themeShade="FF"/>
+          <w:sz w:val="32"/>
+          <w:szCs w:val="32"/>
+          <w:lang w:val="en-US" w:bidi="th-TH"/>
+        </w:rPr>
+        <w:t>:</w:t>
+      </w:r>
+    </w:p>
+    <w:p>
+      <w:pPr>
+        <w:pStyle w:val="a9"/>
+        <w:numPr>
+          <w:ilvl w:val="1"/>
+          <w:numId w:val="26"/>
+        </w:numPr>
+        <w:rPr>
+          <w:rFonts w:ascii="Angsana New" w:hAnsi="Angsana New" w:eastAsia="Angsana New" w:cs="Angsana New"/>
+          <w:b w:val="0"/>
+          <w:bCs w:val="0"/>
+          <w:i w:val="0"/>
+          <w:iCs w:val="0"/>
+          <w:caps w:val="0"/>
+          <w:smallCaps w:val="0"/>
+          <w:noProof w:val="0"/>
+          <w:color w:val="000000" w:themeColor="text1" w:themeTint="FF" w:themeShade="FF"/>
+          <w:sz w:val="32"/>
+          <w:szCs w:val="32"/>
+          <w:lang w:bidi="th-TH"/>
+        </w:rPr>
+      </w:pPr>
+      <w:r>
+        <w:rPr>
+          <w:rFonts w:ascii="Angsana New" w:hAnsi="Angsana New" w:eastAsia="Angsana New" w:cs="Angsana New"/>
+          <w:b w:val="0"/>
+          <w:bCs w:val="0"/>
+          <w:i w:val="0"/>
+          <w:iCs w:val="0"/>
+          <w:caps w:val="0"/>
+          <w:smallCaps w:val="0"/>
+          <w:noProof w:val="0"/>
+          <w:color w:val="000000" w:themeColor="text1" w:themeTint="FF" w:themeShade="FF"/>
+          <w:sz w:val="32"/>
+          <w:szCs w:val="32"/>
+          <w:lang w:val="en-US" w:bidi="th-TH"/>
+        </w:rPr>
+        <w:t>Bug ID: BUG-001</w:t>
+      </w:r>
+    </w:p>
+    <w:p>
+      <w:pPr>
+        <w:pStyle w:val="a9"/>
+        <w:numPr>
+          <w:ilvl w:val="1"/>
+          <w:numId w:val="26"/>
+        </w:numPr>
+        <w:rPr>
+          <w:rFonts w:ascii="Angsana New" w:hAnsi="Angsana New" w:eastAsia="Angsana New" w:cs="Angsana New"/>
+          <w:b w:val="0"/>
+          <w:bCs w:val="0"/>
+          <w:i w:val="0"/>
+          <w:iCs w:val="0"/>
+          <w:caps w:val="0"/>
+          <w:smallCaps w:val="0"/>
+          <w:noProof w:val="0"/>
+          <w:color w:val="000000" w:themeColor="text1" w:themeTint="FF" w:themeShade="FF"/>
+          <w:sz w:val="32"/>
+          <w:szCs w:val="32"/>
+          <w:lang w:bidi="th-TH"/>
+        </w:rPr>
+      </w:pPr>
+      <w:r>
+        <w:rPr>
+          <w:rFonts w:ascii="Angsana New" w:hAnsi="Angsana New" w:eastAsia="Angsana New" w:cs="Angsana New"/>
+          <w:b w:val="0"/>
+          <w:bCs w:val="0"/>
+          <w:i w:val="0"/>
+          <w:iCs w:val="0"/>
+          <w:caps w:val="0"/>
+          <w:smallCaps w:val="0"/>
+          <w:noProof w:val="0"/>
+          <w:color w:val="000000" w:themeColor="text1" w:themeTint="FF" w:themeShade="FF"/>
+          <w:sz w:val="32"/>
+          <w:szCs w:val="32"/>
+          <w:lang w:val="en-US" w:bidi="th-TH"/>
+        </w:rPr>
+        <w:t>Severity: High</w:t>
+      </w:r>
+    </w:p>
+    <w:p>
+      <w:pPr>
+        <w:pStyle w:val="a9"/>
+        <w:numPr>
+          <w:ilvl w:val="1"/>
+          <w:numId w:val="26"/>
+        </w:numPr>
+        <w:rPr>
+          <w:rFonts w:ascii="Angsana New" w:hAnsi="Angsana New" w:eastAsia="Angsana New" w:cs="Angsana New"/>
+          <w:b w:val="0"/>
+          <w:bCs w:val="0"/>
+          <w:i w:val="0"/>
+          <w:iCs w:val="0"/>
+          <w:caps w:val="0"/>
+          <w:smallCaps w:val="0"/>
+          <w:noProof w:val="0"/>
+          <w:color w:val="000000" w:themeColor="text1" w:themeTint="FF" w:themeShade="FF"/>
+          <w:sz w:val="32"/>
+          <w:szCs w:val="32"/>
+          <w:lang w:bidi="th-TH"/>
+        </w:rPr>
+      </w:pPr>
+      <w:r>
+        <w:rPr>
+          <w:rFonts w:ascii="Angsana New" w:hAnsi="Angsana New" w:eastAsia="Angsana New" w:cs="Angsana New"/>
+          <w:b w:val="0"/>
+          <w:bCs w:val="0"/>
+          <w:i w:val="0"/>
+          <w:iCs w:val="0"/>
+          <w:caps w:val="0"/>
+          <w:smallCaps w:val="0"/>
+          <w:noProof w:val="0"/>
+          <w:color w:val="000000" w:themeColor="text1" w:themeTint="FF" w:themeShade="FF"/>
+          <w:sz w:val="32"/>
+          <w:szCs w:val="32"/>
+          <w:lang w:val="en-US" w:bidi="th-TH"/>
+        </w:rPr>
+        <w:t xml:space="preserve">Steps to Reproduce: </w:t>
+      </w:r>
+    </w:p>
+    <w:p>
+      <w:pPr>
+        <w:pStyle w:val="a9"/>
+        <w:numPr>
+          <w:ilvl w:val="2"/>
+          <w:numId w:val="26"/>
+        </w:numPr>
+        <w:rPr>
+          <w:rFonts w:ascii="Angsana New" w:hAnsi="Angsana New" w:eastAsia="Angsana New" w:cs="Angsana New"/>
+          <w:b w:val="0"/>
+          <w:bCs w:val="0"/>
+          <w:i w:val="0"/>
+          <w:iCs w:val="0"/>
+          <w:caps w:val="0"/>
+          <w:smallCaps w:val="0"/>
+          <w:noProof w:val="0"/>
+          <w:color w:val="000000" w:themeColor="text1" w:themeTint="FF" w:themeShade="FF"/>
+          <w:sz w:val="32"/>
+          <w:szCs w:val="32"/>
+          <w:lang w:bidi="th-TH"/>
+        </w:rPr>
+      </w:pPr>
+      <w:r>
+        <w:rPr>
+          <w:rFonts w:ascii="Angsana New" w:hAnsi="Angsana New" w:eastAsia="Angsana New" w:cs="Angsana New"/>
+          <w:b w:val="0"/>
+          <w:bCs w:val="0"/>
+          <w:i w:val="0"/>
+          <w:iCs w:val="0"/>
+          <w:caps w:val="0"/>
+          <w:smallCaps w:val="0"/>
+          <w:noProof w:val="0"/>
+          <w:color w:val="000000" w:themeColor="text1" w:themeTint="FF" w:themeShade="FF"/>
+          <w:sz w:val="32"/>
+          <w:szCs w:val="32"/>
+          <w:lang w:bidi="th-TH"/>
+        </w:rPr>
+        <w:t>ล็อกอินเข้าสู่ระบบในสิทธิ์ System Administrator</w:t>
+      </w:r>
+    </w:p>
+    <w:p>
+      <w:pPr>
+        <w:pStyle w:val="a9"/>
+        <w:numPr>
+          <w:ilvl w:val="2"/>
+          <w:numId w:val="26"/>
+        </w:numPr>
+        <w:rPr>
+          <w:rFonts w:ascii="Angsana New" w:hAnsi="Angsana New" w:eastAsia="Angsana New" w:cs="Angsana New"/>
+          <w:b w:val="0"/>
+          <w:bCs w:val="0"/>
+          <w:i w:val="0"/>
+          <w:iCs w:val="0"/>
+          <w:caps w:val="0"/>
+          <w:smallCaps w:val="0"/>
+          <w:noProof w:val="0"/>
+          <w:color w:val="000000" w:themeColor="text1" w:themeTint="FF" w:themeShade="FF"/>
+          <w:sz w:val="32"/>
+          <w:szCs w:val="32"/>
+          <w:lang w:bidi="th-TH"/>
+        </w:rPr>
+      </w:pPr>
+      <w:r>
+        <w:rPr>
+          <w:rFonts w:ascii="Angsana New" w:hAnsi="Angsana New" w:eastAsia="Angsana New" w:cs="Angsana New"/>
+          <w:b w:val="0"/>
+          <w:bCs w:val="0"/>
+          <w:i w:val="0"/>
+          <w:iCs w:val="0"/>
+          <w:caps w:val="0"/>
+          <w:smallCaps w:val="0"/>
+          <w:noProof w:val="0"/>
+          <w:color w:val="000000" w:themeColor="text1" w:themeTint="FF" w:themeShade="FF"/>
+          <w:sz w:val="32"/>
+          <w:szCs w:val="32"/>
+          <w:lang w:bidi="th-TH"/>
+        </w:rPr>
+        <w:t>คลิกไปที่เมนู "Books" เพื่อเข้าสู่หน้า Books Management</w:t>
+      </w:r>
+    </w:p>
+    <w:p>
+      <w:pPr>
+        <w:pStyle w:val="a9"/>
+        <w:numPr>
+          <w:ilvl w:val="2"/>
+          <w:numId w:val="26"/>
+        </w:numPr>
+        <w:rPr>
+          <w:rFonts w:ascii="Angsana New" w:hAnsi="Angsana New" w:eastAsia="Angsana New" w:cs="Angsana New"/>
+          <w:b w:val="0"/>
+          <w:bCs w:val="0"/>
+          <w:i w:val="0"/>
+          <w:iCs w:val="0"/>
+          <w:caps w:val="0"/>
+          <w:smallCaps w:val="0"/>
+          <w:noProof w:val="0"/>
+          <w:color w:val="000000" w:themeColor="text1" w:themeTint="FF" w:themeShade="FF"/>
+          <w:sz w:val="32"/>
+          <w:szCs w:val="32"/>
+          <w:lang w:bidi="th-TH"/>
+        </w:rPr>
+      </w:pPr>
+      <w:r>
+        <w:rPr>
+          <w:rFonts w:ascii="Angsana New" w:hAnsi="Angsana New" w:eastAsia="Angsana New" w:cs="Angsana New"/>
+          <w:b w:val="0"/>
+          <w:bCs w:val="0"/>
+          <w:i w:val="0"/>
+          <w:iCs w:val="0"/>
+          <w:caps w:val="0"/>
+          <w:smallCaps w:val="0"/>
+          <w:noProof w:val="0"/>
+          <w:color w:val="000000" w:themeColor="text1" w:themeTint="FF" w:themeShade="FF"/>
+          <w:sz w:val="32"/>
+          <w:szCs w:val="32"/>
+          <w:lang w:bidi="th-TH"/>
+        </w:rPr>
+        <w:t xml:space="preserve">ตรวจสอบข้อมูลในตารางรายการหนังสือ แถวที่ ID 8 </w:t>
+      </w:r>
+    </w:p>
+    <w:p>
+      <w:pPr>
+        <w:pStyle w:val="a9"/>
+        <w:numPr>
+          <w:ilvl w:val="2"/>
+          <w:numId w:val="26"/>
+        </w:numPr>
+        <w:rPr>
+          <w:rFonts w:ascii="Angsana New" w:hAnsi="Angsana New" w:eastAsia="Angsana New" w:cs="Angsana New"/>
+          <w:b w:val="0"/>
+          <w:bCs w:val="0"/>
+          <w:i w:val="0"/>
+          <w:iCs w:val="0"/>
+          <w:caps w:val="0"/>
+          <w:smallCaps w:val="0"/>
+          <w:noProof w:val="0"/>
+          <w:color w:val="000000" w:themeColor="text1" w:themeTint="FF" w:themeShade="FF"/>
+          <w:sz w:val="32"/>
+          <w:szCs w:val="32"/>
+          <w:lang w:bidi="th-TH"/>
+        </w:rPr>
+      </w:pPr>
+      <w:r>
+        <w:rPr>
+          <w:rFonts w:ascii="Angsana New" w:hAnsi="Angsana New" w:eastAsia="Angsana New" w:cs="Angsana New"/>
+          <w:b w:val="0"/>
+          <w:bCs w:val="0"/>
+          <w:i w:val="0"/>
+          <w:iCs w:val="0"/>
+          <w:caps w:val="0"/>
+          <w:smallCaps w:val="0"/>
+          <w:noProof w:val="0"/>
+          <w:color w:val="000000" w:themeColor="text1" w:themeTint="FF" w:themeShade="FF"/>
+          <w:sz w:val="32"/>
+          <w:szCs w:val="32"/>
+          <w:lang w:bidi="th-TH"/>
+        </w:rPr>
+        <w:t xml:space="preserve">ดูที่คอลัมน์ "Total Copies" จะพบว่าระบบแสดงค่าเป็น -1 ซึ่งผิดปกติ </w:t>
+      </w:r>
+    </w:p>
+    <w:p>
+      <w:pPr>
+        <w:ind w:left="2160"/>
+        <w:rPr>
+          <w:rFonts w:ascii="Angsana New" w:hAnsi="Angsana New" w:eastAsia="Angsana New" w:cs="Angsana New"/>
+          <w:b w:val="0"/>
+          <w:bCs w:val="0"/>
+          <w:i w:val="0"/>
+          <w:iCs w:val="0"/>
+          <w:caps w:val="0"/>
+          <w:smallCaps w:val="0"/>
+          <w:noProof w:val="0"/>
+          <w:color w:val="000000" w:themeColor="text1" w:themeTint="FF" w:themeShade="FF"/>
+          <w:sz w:val="32"/>
+          <w:szCs w:val="32"/>
+          <w:lang w:bidi="th-TH"/>
+        </w:rPr>
+      </w:pPr>
+      <w:r>
+        <w:rPr>
+          <w:rFonts w:ascii="Angsana New" w:hAnsi="Angsana New" w:eastAsia="Angsana New" w:cs="Angsana New"/>
+          <w:b w:val="0"/>
+          <w:bCs w:val="0"/>
+          <w:i w:val="0"/>
+          <w:iCs w:val="0"/>
+          <w:caps w:val="0"/>
+          <w:smallCaps w:val="0"/>
+          <w:noProof w:val="0"/>
+          <w:color w:val="000000" w:themeColor="text1" w:themeTint="FF" w:themeShade="FF"/>
+          <w:sz w:val="32"/>
+          <w:szCs w:val="32"/>
+          <w:lang w:bidi="th-TH"/>
+        </w:rPr>
+        <w:t>(จำนวนหนังสือรวมไม่ควรติดลบ)</w:t>
+      </w:r>
+    </w:p>
+    <w:p>
+      <w:pPr>
+        <w:pStyle w:val="a9"/>
+        <w:numPr>
+          <w:ilvl w:val="1"/>
+          <w:numId w:val="26"/>
+        </w:numPr>
+        <w:rPr>
+          <w:rFonts w:ascii="Angsana New" w:hAnsi="Angsana New" w:eastAsia="Angsana New" w:cs="Angsana New"/>
+          <w:b w:val="0"/>
+          <w:bCs w:val="0"/>
+          <w:i w:val="0"/>
+          <w:iCs w:val="0"/>
+          <w:caps w:val="0"/>
+          <w:smallCaps w:val="0"/>
+          <w:noProof w:val="0"/>
+          <w:color w:val="000000" w:themeColor="text1" w:themeTint="FF" w:themeShade="FF"/>
+          <w:sz w:val="32"/>
+          <w:szCs w:val="32"/>
+          <w:lang w:bidi="th-TH"/>
+        </w:rPr>
+      </w:pPr>
+      <w:r>
+        <w:rPr>
+          <w:rFonts w:ascii="Angsana New" w:hAnsi="Angsana New" w:eastAsia="Angsana New" w:cs="Angsana New"/>
+          <w:b w:val="0"/>
+          <w:bCs w:val="0"/>
+          <w:i w:val="0"/>
+          <w:iCs w:val="0"/>
+          <w:caps w:val="0"/>
+          <w:smallCaps w:val="0"/>
+          <w:noProof w:val="0"/>
+          <w:color w:val="000000" w:themeColor="text1" w:themeTint="FF" w:themeShade="FF"/>
+          <w:sz w:val="32"/>
+          <w:szCs w:val="32"/>
+          <w:lang w:val="en-US" w:bidi="th-TH"/>
+        </w:rPr>
+        <w:t xml:space="preserve">Evidence: </w:t>
+      </w:r>
+      <w:r>
+        <w:rPr>
+          <w:rFonts w:ascii="Angsana New" w:hAnsi="Angsana New" w:eastAsia="Angsana New" w:cs="Angsana New"/>
+          <w:b w:val="0"/>
+          <w:bCs w:val="0"/>
+          <w:i w:val="0"/>
+          <w:iCs w:val="0"/>
+          <w:caps w:val="0"/>
+          <w:smallCaps w:val="0"/>
+          <w:noProof w:val="0"/>
+          <w:color w:val="000000" w:themeColor="text1" w:themeTint="FF" w:themeShade="FF"/>
+          <w:sz w:val="32"/>
+          <w:szCs w:val="32"/>
+          <w:lang w:bidi="th-TH"/>
+        </w:rPr>
+        <w:t xml:space="preserve">รูปภาพ </w:t>
+      </w:r>
+      <w:r>
+        <w:rPr>
+          <w:rFonts w:ascii="Angsana New" w:hAnsi="Angsana New" w:eastAsia="Angsana New" w:cs="Angsana New"/>
+          <w:b w:val="0"/>
+          <w:bCs w:val="0"/>
+          <w:i w:val="0"/>
+          <w:iCs w:val="0"/>
+          <w:caps w:val="0"/>
+          <w:smallCaps w:val="0"/>
+          <w:noProof w:val="0"/>
+          <w:color w:val="000000" w:themeColor="text1" w:themeTint="FF" w:themeShade="FF"/>
+          <w:sz w:val="32"/>
+          <w:szCs w:val="32"/>
+          <w:lang w:val="en-US" w:bidi="th-TH"/>
+        </w:rPr>
+        <w:t xml:space="preserve">Screenshot </w:t>
+      </w:r>
+    </w:p>
+    <w:p>
+      <w:pPr>
+        <w:ind w:left="720"/>
+        <w:rPr>
+          <w:rFonts w:ascii="Angsana New" w:hAnsi="Angsana New" w:eastAsia="Angsana New" w:cs="Angsana New"/>
+          <w:b w:val="0"/>
+          <w:bCs w:val="0"/>
+          <w:i w:val="0"/>
+          <w:iCs w:val="0"/>
+          <w:caps w:val="0"/>
+          <w:smallCaps w:val="0"/>
+          <w:noProof w:val="0"/>
+          <w:color w:val="000000" w:themeColor="text1" w:themeTint="FF" w:themeShade="FF"/>
+          <w:sz w:val="32"/>
+          <w:szCs w:val="32"/>
+          <w:lang w:bidi="th-TH"/>
+        </w:rPr>
+      </w:pPr>
+      <w:r>
+        <w:drawing>
+          <wp:inline wp14:editId="1A9D9593" wp14:anchorId="17A9E68D">
+            <wp:extent cx="4972050" cy="2495550"/>
+            <wp:effectExtent l="0" t="0" r="0" b="0"/>
+            <wp:docPr id="666721808" name="drawing"/>
+            <wp:cNvGraphicFramePr>
+              <a:graphicFrameLocks noChangeAspect="1"/>
+            </wp:cNvGraphicFramePr>
+            <a:graphic>
+              <a:graphicData xmlns:a="http://schemas.openxmlformats.org/drawingml/2006/main" uri="http://schemas.openxmlformats.org/drawingml/2006/picture">
+                <pic:pic xmlns:pic="http://schemas.openxmlformats.org/drawingml/2006/picture">
+                  <pic:nvPicPr>
+                    <pic:cNvPr id="666721808" name="Picture 666721808"/>
+                    <pic:cNvPicPr/>
+                  </pic:nvPicPr>
+                  <pic:blipFill>
+                    <a:blip xmlns:r="http://schemas.openxmlformats.org/officeDocument/2006/relationships" r:embed="rId1564004803">
+                      <a:extLst>
+                        <a:ext uri="{28A0092B-C50C-407E-A947-70E740481C1C}">
+                          <a14:useLocalDpi xmlns:a14="http://schemas.microsoft.com/office/drawing/2010/main"/>
+                        </a:ext>
+                      </a:extLst>
+                    </a:blip>
+                    <a:stretch>
+                      <a:fillRect/>
+                    </a:stretch>
+                  </pic:blipFill>
+                  <pic:spPr>
+                    <a:xfrm>
+                      <a:off x="0" y="0"/>
+                      <a:ext cx="4972050" cy="2495550"/>
+                    </a:xfrm>
+                    <a:prstGeom prst="rect">
+                      <a:avLst/>
+                    </a:prstGeom>
+                  </pic:spPr>
+                </pic:pic>
+              </a:graphicData>
+            </a:graphic>
+          </wp:inline>
+        </w:drawing>
+      </w:r>
+    </w:p>
+    <w:p>
+      <w:pPr>
+        <w:ind w:left="1440"/>
+        <w:rPr>
+          <w:rFonts w:ascii="Angsana New" w:hAnsi="Angsana New" w:eastAsia="Angsana New" w:cs="Angsana New"/>
+          <w:b w:val="0"/>
+          <w:bCs w:val="0"/>
+          <w:i w:val="0"/>
+          <w:iCs w:val="0"/>
+          <w:caps w:val="0"/>
+          <w:smallCaps w:val="0"/>
+          <w:noProof w:val="0"/>
+          <w:color w:val="000000" w:themeColor="text1" w:themeTint="FF" w:themeShade="FF"/>
+          <w:sz w:val="32"/>
+          <w:szCs w:val="32"/>
+          <w:lang w:bidi="th-TH"/>
+        </w:rPr>
+      </w:pPr>
+    </w:p>
+    <w:p>
+      <w:pPr>
+        <w:ind w:left="1440"/>
+        <w:rPr>
+          <w:rFonts w:ascii="Angsana New" w:hAnsi="Angsana New" w:eastAsia="Angsana New" w:cs="Angsana New"/>
+          <w:b w:val="0"/>
+          <w:bCs w:val="0"/>
+          <w:i w:val="0"/>
+          <w:iCs w:val="0"/>
+          <w:caps w:val="0"/>
+          <w:smallCaps w:val="0"/>
+          <w:noProof w:val="0"/>
+          <w:color w:val="000000" w:themeColor="text1" w:themeTint="FF" w:themeShade="FF"/>
+          <w:sz w:val="32"/>
+          <w:szCs w:val="32"/>
+          <w:lang w:bidi="th-TH"/>
+        </w:rPr>
+      </w:pPr>
+    </w:p>
+    <w:p>
+      <w:pPr>
+        <w:ind w:left="1440"/>
+        <w:rPr>
+          <w:rFonts w:ascii="Angsana New" w:hAnsi="Angsana New" w:eastAsia="Angsana New" w:cs="Angsana New"/>
+          <w:b w:val="0"/>
+          <w:bCs w:val="0"/>
+          <w:i w:val="0"/>
+          <w:iCs w:val="0"/>
+          <w:caps w:val="0"/>
+          <w:smallCaps w:val="0"/>
+          <w:noProof w:val="0"/>
+          <w:color w:val="000000" w:themeColor="text1" w:themeTint="FF" w:themeShade="FF"/>
+          <w:sz w:val="32"/>
+          <w:szCs w:val="32"/>
+          <w:lang w:bidi="th-TH"/>
+        </w:rPr>
+      </w:pPr>
+    </w:p>
+    <w:p>
+      <w:pPr>
+        <w:pStyle w:val="a"/>
+        <w:ind w:left="1440"/>
+        <w:rPr>
+          <w:rFonts w:ascii="Angsana New" w:hAnsi="Angsana New" w:eastAsia="Angsana New" w:cs="Angsana New"/>
+          <w:b w:val="0"/>
+          <w:bCs w:val="0"/>
+          <w:i w:val="0"/>
+          <w:iCs w:val="0"/>
+          <w:caps w:val="0"/>
+          <w:smallCaps w:val="0"/>
+          <w:noProof w:val="0"/>
+          <w:color w:val="000000" w:themeColor="text1" w:themeTint="FF" w:themeShade="FF"/>
+          <w:sz w:val="32"/>
+          <w:szCs w:val="32"/>
+          <w:lang w:bidi="th-TH"/>
+        </w:rPr>
+      </w:pPr>
+    </w:p>
+    <w:p>
+      <w:pPr>
+        <w:pStyle w:val="a"/>
+        <w:ind w:left="1440"/>
+        <w:rPr>
+          <w:rFonts w:ascii="Angsana New" w:hAnsi="Angsana New" w:eastAsia="Angsana New" w:cs="Angsana New"/>
+          <w:b w:val="0"/>
+          <w:bCs w:val="0"/>
+          <w:i w:val="0"/>
+          <w:iCs w:val="0"/>
+          <w:caps w:val="0"/>
+          <w:smallCaps w:val="0"/>
+          <w:noProof w:val="0"/>
+          <w:color w:val="000000" w:themeColor="text1" w:themeTint="FF" w:themeShade="FF"/>
+          <w:sz w:val="32"/>
+          <w:szCs w:val="32"/>
+          <w:lang w:bidi="th-TH"/>
+        </w:rPr>
+      </w:pPr>
+    </w:p>
+    <w:p>
+      <w:pPr>
+        <w:pStyle w:val="a9"/>
+        <w:numPr>
+          <w:ilvl w:val="1"/>
+          <w:numId w:val="26"/>
+        </w:numPr>
+        <w:rPr>
+          <w:rFonts w:ascii="Angsana New" w:hAnsi="Angsana New" w:eastAsia="Angsana New" w:cs="Angsana New"/>
+          <w:b w:val="0"/>
+          <w:bCs w:val="0"/>
+          <w:i w:val="0"/>
+          <w:iCs w:val="0"/>
+          <w:caps w:val="0"/>
+          <w:smallCaps w:val="0"/>
+          <w:noProof w:val="0"/>
+          <w:color w:val="000000" w:themeColor="text1" w:themeTint="FF" w:themeShade="FF"/>
+          <w:sz w:val="32"/>
+          <w:szCs w:val="32"/>
+          <w:lang w:bidi="th-TH"/>
+        </w:rPr>
+      </w:pPr>
+      <w:r>
+        <w:rPr>
+          <w:rFonts w:ascii="Angsana New" w:hAnsi="Angsana New" w:eastAsia="Angsana New" w:cs="Angsana New"/>
+          <w:b w:val="0"/>
+          <w:bCs w:val="0"/>
+          <w:i w:val="0"/>
+          <w:iCs w:val="0"/>
+          <w:caps w:val="0"/>
+          <w:smallCaps w:val="0"/>
+          <w:noProof w:val="0"/>
+          <w:color w:val="000000" w:themeColor="text1" w:themeTint="FF" w:themeShade="FF"/>
+          <w:sz w:val="32"/>
+          <w:szCs w:val="32"/>
+          <w:lang w:val="en-US" w:bidi="th-TH"/>
+        </w:rPr>
+        <w:t>Bug ID: BUG-002</w:t>
+      </w:r>
+    </w:p>
+    <w:p>
+      <w:pPr>
+        <w:pStyle w:val="a9"/>
+        <w:numPr>
+          <w:ilvl w:val="1"/>
+          <w:numId w:val="26"/>
+        </w:numPr>
+        <w:rPr>
+          <w:rFonts w:ascii="Angsana New" w:hAnsi="Angsana New" w:eastAsia="Angsana New" w:cs="Angsana New"/>
+          <w:b w:val="0"/>
+          <w:bCs w:val="0"/>
+          <w:i w:val="0"/>
+          <w:iCs w:val="0"/>
+          <w:caps w:val="0"/>
+          <w:smallCaps w:val="0"/>
+          <w:noProof w:val="0"/>
+          <w:color w:val="000000" w:themeColor="text1" w:themeTint="FF" w:themeShade="FF"/>
+          <w:sz w:val="32"/>
+          <w:szCs w:val="32"/>
+          <w:lang w:bidi="th-TH"/>
+        </w:rPr>
+      </w:pPr>
+      <w:r>
+        <w:rPr>
+          <w:rFonts w:ascii="Angsana New" w:hAnsi="Angsana New" w:eastAsia="Angsana New" w:cs="Angsana New"/>
+          <w:b w:val="0"/>
+          <w:bCs w:val="0"/>
+          <w:i w:val="0"/>
+          <w:iCs w:val="0"/>
+          <w:caps w:val="0"/>
+          <w:smallCaps w:val="0"/>
+          <w:noProof w:val="0"/>
+          <w:color w:val="000000" w:themeColor="text1" w:themeTint="FF" w:themeShade="FF"/>
+          <w:sz w:val="32"/>
+          <w:szCs w:val="32"/>
+          <w:lang w:val="en-US" w:bidi="th-TH"/>
+        </w:rPr>
+        <w:t>Severity: High</w:t>
+      </w:r>
+    </w:p>
+    <w:p>
+      <w:pPr>
+        <w:pStyle w:val="a9"/>
+        <w:numPr>
+          <w:ilvl w:val="1"/>
+          <w:numId w:val="26"/>
+        </w:numPr>
+        <w:rPr>
+          <w:rFonts w:ascii="Angsana New" w:hAnsi="Angsana New" w:eastAsia="Angsana New" w:cs="Angsana New"/>
+          <w:b w:val="0"/>
+          <w:bCs w:val="0"/>
+          <w:i w:val="0"/>
+          <w:iCs w:val="0"/>
+          <w:caps w:val="0"/>
+          <w:smallCaps w:val="0"/>
+          <w:noProof w:val="0"/>
+          <w:color w:val="000000" w:themeColor="text1" w:themeTint="FF" w:themeShade="FF"/>
+          <w:sz w:val="32"/>
+          <w:szCs w:val="32"/>
+          <w:lang w:bidi="th-TH"/>
+        </w:rPr>
+      </w:pPr>
+      <w:r>
+        <w:rPr>
+          <w:rFonts w:ascii="Angsana New" w:hAnsi="Angsana New" w:eastAsia="Angsana New" w:cs="Angsana New"/>
+          <w:b w:val="0"/>
+          <w:bCs w:val="0"/>
+          <w:i w:val="0"/>
+          <w:iCs w:val="0"/>
+          <w:caps w:val="0"/>
+          <w:smallCaps w:val="0"/>
+          <w:noProof w:val="0"/>
+          <w:color w:val="000000" w:themeColor="text1" w:themeTint="FF" w:themeShade="FF"/>
+          <w:sz w:val="32"/>
+          <w:szCs w:val="32"/>
+          <w:lang w:val="en-US" w:bidi="th-TH"/>
+        </w:rPr>
+        <w:t>Steps to Reproduce:</w:t>
+      </w:r>
+    </w:p>
+    <w:p>
+      <w:pPr>
+        <w:pStyle w:val="a9"/>
+        <w:numPr>
+          <w:ilvl w:val="2"/>
+          <w:numId w:val="26"/>
+        </w:numPr>
+        <w:rPr>
+          <w:rFonts w:ascii="Angsana New" w:hAnsi="Angsana New" w:eastAsia="Angsana New" w:cs="Angsana New"/>
+          <w:b w:val="0"/>
+          <w:bCs w:val="0"/>
+          <w:i w:val="0"/>
+          <w:iCs w:val="0"/>
+          <w:caps w:val="0"/>
+          <w:smallCaps w:val="0"/>
+          <w:noProof w:val="0"/>
+          <w:color w:val="000000" w:themeColor="text1" w:themeTint="FF" w:themeShade="FF"/>
+          <w:sz w:val="32"/>
+          <w:szCs w:val="32"/>
+          <w:lang w:bidi="th-TH"/>
+        </w:rPr>
+      </w:pPr>
+      <w:r>
+        <w:rPr>
+          <w:rFonts w:ascii="Angsana New" w:hAnsi="Angsana New" w:eastAsia="Angsana New" w:cs="Angsana New"/>
+          <w:b w:val="0"/>
+          <w:bCs w:val="0"/>
+          <w:i w:val="0"/>
+          <w:iCs w:val="0"/>
+          <w:caps w:val="0"/>
+          <w:smallCaps w:val="0"/>
+          <w:noProof w:val="0"/>
+          <w:color w:val="000000" w:themeColor="text1" w:themeTint="FF" w:themeShade="FF"/>
+          <w:sz w:val="32"/>
+          <w:szCs w:val="32"/>
+          <w:lang w:bidi="th-TH"/>
+        </w:rPr>
+        <w:t>เข้าสู่ระบบด้วยสิทธิ์ System Administrator</w:t>
+      </w:r>
+    </w:p>
+    <w:p>
+      <w:pPr>
+        <w:pStyle w:val="a9"/>
+        <w:numPr>
+          <w:ilvl w:val="2"/>
+          <w:numId w:val="26"/>
+        </w:numPr>
+        <w:rPr>
+          <w:rFonts w:ascii="Angsana New" w:hAnsi="Angsana New" w:eastAsia="Angsana New" w:cs="Angsana New"/>
+          <w:b w:val="0"/>
+          <w:bCs w:val="0"/>
+          <w:i w:val="0"/>
+          <w:iCs w:val="0"/>
+          <w:caps w:val="0"/>
+          <w:smallCaps w:val="0"/>
+          <w:noProof w:val="0"/>
+          <w:color w:val="000000" w:themeColor="text1" w:themeTint="FF" w:themeShade="FF"/>
+          <w:sz w:val="32"/>
+          <w:szCs w:val="32"/>
+          <w:lang w:bidi="th-TH"/>
+        </w:rPr>
+      </w:pPr>
+      <w:r>
+        <w:rPr>
+          <w:rFonts w:ascii="Angsana New" w:hAnsi="Angsana New" w:eastAsia="Angsana New" w:cs="Angsana New"/>
+          <w:b w:val="0"/>
+          <w:bCs w:val="0"/>
+          <w:i w:val="0"/>
+          <w:iCs w:val="0"/>
+          <w:caps w:val="0"/>
+          <w:smallCaps w:val="0"/>
+          <w:noProof w:val="0"/>
+          <w:color w:val="000000" w:themeColor="text1" w:themeTint="FF" w:themeShade="FF"/>
+          <w:sz w:val="32"/>
+          <w:szCs w:val="32"/>
+          <w:lang w:bidi="th-TH"/>
+        </w:rPr>
+        <w:t>ไปที่เมนู "Books" เพื่อเข้าสู่หน้า Books Management</w:t>
+      </w:r>
+    </w:p>
+    <w:p>
+      <w:pPr>
+        <w:pStyle w:val="a9"/>
+        <w:numPr>
+          <w:ilvl w:val="2"/>
+          <w:numId w:val="26"/>
+        </w:numPr>
+        <w:rPr>
+          <w:rFonts w:ascii="Angsana New" w:hAnsi="Angsana New" w:eastAsia="Angsana New" w:cs="Angsana New"/>
+          <w:b w:val="0"/>
+          <w:bCs w:val="0"/>
+          <w:i w:val="0"/>
+          <w:iCs w:val="0"/>
+          <w:caps w:val="0"/>
+          <w:smallCaps w:val="0"/>
+          <w:noProof w:val="0"/>
+          <w:color w:val="000000" w:themeColor="text1" w:themeTint="FF" w:themeShade="FF"/>
+          <w:sz w:val="32"/>
+          <w:szCs w:val="32"/>
+          <w:lang w:bidi="th-TH"/>
+        </w:rPr>
+      </w:pPr>
+      <w:r>
+        <w:rPr>
+          <w:rFonts w:ascii="Angsana New" w:hAnsi="Angsana New" w:eastAsia="Angsana New" w:cs="Angsana New"/>
+          <w:b w:val="0"/>
+          <w:bCs w:val="0"/>
+          <w:i w:val="0"/>
+          <w:iCs w:val="0"/>
+          <w:caps w:val="0"/>
+          <w:smallCaps w:val="0"/>
+          <w:noProof w:val="0"/>
+          <w:color w:val="000000" w:themeColor="text1" w:themeTint="FF" w:themeShade="FF"/>
+          <w:sz w:val="32"/>
+          <w:szCs w:val="32"/>
+          <w:lang w:bidi="th-TH"/>
+        </w:rPr>
+        <w:t>เลือกหนังสือ 1 รายการ แล้วคลิกปุ่ม "Edit"</w:t>
+      </w:r>
+    </w:p>
+    <w:p>
+      <w:pPr>
+        <w:pStyle w:val="a9"/>
+        <w:numPr>
+          <w:ilvl w:val="2"/>
+          <w:numId w:val="26"/>
+        </w:numPr>
+        <w:rPr>
+          <w:rFonts w:ascii="Angsana New" w:hAnsi="Angsana New" w:eastAsia="Angsana New" w:cs="Angsana New"/>
+          <w:b w:val="0"/>
+          <w:bCs w:val="0"/>
+          <w:i w:val="0"/>
+          <w:iCs w:val="0"/>
+          <w:caps w:val="0"/>
+          <w:smallCaps w:val="0"/>
+          <w:noProof w:val="0"/>
+          <w:color w:val="000000" w:themeColor="text1" w:themeTint="FF" w:themeShade="FF"/>
+          <w:sz w:val="32"/>
+          <w:szCs w:val="32"/>
+          <w:lang w:bidi="th-TH"/>
+        </w:rPr>
+      </w:pPr>
+      <w:r>
+        <w:rPr>
+          <w:rFonts w:ascii="Angsana New" w:hAnsi="Angsana New" w:eastAsia="Angsana New" w:cs="Angsana New"/>
+          <w:b w:val="0"/>
+          <w:bCs w:val="0"/>
+          <w:i w:val="0"/>
+          <w:iCs w:val="0"/>
+          <w:caps w:val="0"/>
+          <w:smallCaps w:val="0"/>
+          <w:noProof w:val="0"/>
+          <w:color w:val="000000" w:themeColor="text1" w:themeTint="FF" w:themeShade="FF"/>
+          <w:sz w:val="32"/>
+          <w:szCs w:val="32"/>
+          <w:lang w:bidi="th-TH"/>
+        </w:rPr>
+        <w:t xml:space="preserve">แก้ไขข้อมูลในช่อง </w:t>
+      </w:r>
+      <w:r>
+        <w:rPr>
+          <w:rFonts w:ascii="Angsana New" w:hAnsi="Angsana New" w:eastAsia="Angsana New" w:cs="Angsana New"/>
+          <w:b w:val="0"/>
+          <w:bCs w:val="0"/>
+          <w:i w:val="0"/>
+          <w:iCs w:val="0"/>
+          <w:caps w:val="0"/>
+          <w:smallCaps w:val="0"/>
+          <w:noProof w:val="0"/>
+          <w:color w:val="000000" w:themeColor="text1" w:themeTint="FF" w:themeShade="FF"/>
+          <w:sz w:val="32"/>
+          <w:szCs w:val="32"/>
+          <w:lang w:bidi="th-TH"/>
+        </w:rPr>
+        <w:t>Total</w:t>
+      </w:r>
+      <w:r>
+        <w:rPr>
+          <w:rFonts w:ascii="Angsana New" w:hAnsi="Angsana New" w:eastAsia="Angsana New" w:cs="Angsana New"/>
+          <w:b w:val="0"/>
+          <w:bCs w:val="0"/>
+          <w:i w:val="0"/>
+          <w:iCs w:val="0"/>
+          <w:caps w:val="0"/>
+          <w:smallCaps w:val="0"/>
+          <w:noProof w:val="0"/>
+          <w:color w:val="000000" w:themeColor="text1" w:themeTint="FF" w:themeShade="FF"/>
+          <w:sz w:val="32"/>
+          <w:szCs w:val="32"/>
+          <w:lang w:bidi="th-TH"/>
+        </w:rPr>
+        <w:t xml:space="preserve"> </w:t>
+      </w:r>
+      <w:r>
+        <w:rPr>
+          <w:rFonts w:ascii="Angsana New" w:hAnsi="Angsana New" w:eastAsia="Angsana New" w:cs="Angsana New"/>
+          <w:b w:val="0"/>
+          <w:bCs w:val="0"/>
+          <w:i w:val="0"/>
+          <w:iCs w:val="0"/>
+          <w:caps w:val="0"/>
+          <w:smallCaps w:val="0"/>
+          <w:noProof w:val="0"/>
+          <w:color w:val="000000" w:themeColor="text1" w:themeTint="FF" w:themeShade="FF"/>
+          <w:sz w:val="32"/>
+          <w:szCs w:val="32"/>
+          <w:lang w:bidi="th-TH"/>
+        </w:rPr>
+        <w:t>Copies</w:t>
+      </w:r>
+      <w:r>
+        <w:rPr>
+          <w:rFonts w:ascii="Angsana New" w:hAnsi="Angsana New" w:eastAsia="Angsana New" w:cs="Angsana New"/>
+          <w:b w:val="0"/>
+          <w:bCs w:val="0"/>
+          <w:i w:val="0"/>
+          <w:iCs w:val="0"/>
+          <w:caps w:val="0"/>
+          <w:smallCaps w:val="0"/>
+          <w:noProof w:val="0"/>
+          <w:color w:val="000000" w:themeColor="text1" w:themeTint="FF" w:themeShade="FF"/>
+          <w:sz w:val="32"/>
+          <w:szCs w:val="32"/>
+          <w:lang w:bidi="th-TH"/>
+        </w:rPr>
+        <w:t xml:space="preserve"> ให้มีตัวเลข "น้อยกว่า" จำนวนในช่อง </w:t>
+      </w:r>
+      <w:r>
+        <w:rPr>
+          <w:rFonts w:ascii="Angsana New" w:hAnsi="Angsana New" w:eastAsia="Angsana New" w:cs="Angsana New"/>
+          <w:b w:val="0"/>
+          <w:bCs w:val="0"/>
+          <w:i w:val="0"/>
+          <w:iCs w:val="0"/>
+          <w:caps w:val="0"/>
+          <w:smallCaps w:val="0"/>
+          <w:noProof w:val="0"/>
+          <w:color w:val="000000" w:themeColor="text1" w:themeTint="FF" w:themeShade="FF"/>
+          <w:sz w:val="32"/>
+          <w:szCs w:val="32"/>
+          <w:lang w:bidi="th-TH"/>
+        </w:rPr>
+        <w:t>Available</w:t>
+      </w:r>
+      <w:r>
+        <w:rPr>
+          <w:rFonts w:ascii="Angsana New" w:hAnsi="Angsana New" w:eastAsia="Angsana New" w:cs="Angsana New"/>
+          <w:b w:val="0"/>
+          <w:bCs w:val="0"/>
+          <w:i w:val="0"/>
+          <w:iCs w:val="0"/>
+          <w:caps w:val="0"/>
+          <w:smallCaps w:val="0"/>
+          <w:noProof w:val="0"/>
+          <w:color w:val="000000" w:themeColor="text1" w:themeTint="FF" w:themeShade="FF"/>
+          <w:sz w:val="32"/>
+          <w:szCs w:val="32"/>
+          <w:lang w:bidi="th-TH"/>
+        </w:rPr>
+        <w:t xml:space="preserve"> (หรือแก้ไขให้น้อยกว่าจำนวนที่กำลังถูกยืมไป)</w:t>
+      </w:r>
+      <w:r>
+        <w:rPr>
+          <w:rFonts w:ascii="Angsana New" w:hAnsi="Angsana New" w:eastAsia="Angsana New" w:cs="Angsana New"/>
+          <w:b w:val="0"/>
+          <w:bCs w:val="0"/>
+          <w:i w:val="0"/>
+          <w:iCs w:val="0"/>
+          <w:caps w:val="0"/>
+          <w:smallCaps w:val="0"/>
+          <w:noProof w:val="0"/>
+          <w:color w:val="000000" w:themeColor="text1" w:themeTint="FF" w:themeShade="FF"/>
+          <w:sz w:val="32"/>
+          <w:szCs w:val="32"/>
+          <w:lang w:bidi="th-TH"/>
+        </w:rPr>
+        <w:t>w</w:t>
+      </w:r>
+    </w:p>
+    <w:p>
+      <w:pPr>
+        <w:pStyle w:val="a9"/>
+        <w:numPr>
+          <w:ilvl w:val="2"/>
+          <w:numId w:val="26"/>
+        </w:numPr>
+        <w:rPr>
+          <w:rFonts w:ascii="Angsana New" w:hAnsi="Angsana New" w:eastAsia="Angsana New" w:cs="Angsana New"/>
+          <w:b w:val="0"/>
+          <w:bCs w:val="0"/>
+          <w:i w:val="0"/>
+          <w:iCs w:val="0"/>
+          <w:caps w:val="0"/>
+          <w:smallCaps w:val="0"/>
+          <w:noProof w:val="0"/>
+          <w:color w:val="000000" w:themeColor="text1" w:themeTint="FF" w:themeShade="FF"/>
+          <w:sz w:val="32"/>
+          <w:szCs w:val="32"/>
+          <w:lang w:bidi="th-TH"/>
+        </w:rPr>
+      </w:pPr>
+      <w:r>
+        <w:rPr>
+          <w:rFonts w:ascii="Angsana New" w:hAnsi="Angsana New" w:eastAsia="Angsana New" w:cs="Angsana New"/>
+          <w:b w:val="0"/>
+          <w:bCs w:val="0"/>
+          <w:i w:val="0"/>
+          <w:iCs w:val="0"/>
+          <w:caps w:val="0"/>
+          <w:smallCaps w:val="0"/>
+          <w:noProof w:val="0"/>
+          <w:color w:val="000000" w:themeColor="text1" w:themeTint="FF" w:themeShade="FF"/>
+          <w:sz w:val="32"/>
+          <w:szCs w:val="32"/>
+          <w:lang w:bidi="th-TH"/>
+        </w:rPr>
+        <w:t>กดปุ่มบันทึกข้อมูล (Save)</w:t>
+      </w:r>
+    </w:p>
+    <w:p>
+      <w:pPr>
+        <w:pStyle w:val="a9"/>
+        <w:numPr>
+          <w:ilvl w:val="2"/>
+          <w:numId w:val="26"/>
+        </w:numPr>
+        <w:rPr>
+          <w:rFonts w:ascii="Angsana New" w:hAnsi="Angsana New" w:eastAsia="Angsana New" w:cs="Angsana New"/>
+          <w:b w:val="0"/>
+          <w:bCs w:val="0"/>
+          <w:i w:val="0"/>
+          <w:iCs w:val="0"/>
+          <w:caps w:val="0"/>
+          <w:smallCaps w:val="0"/>
+          <w:noProof w:val="0"/>
+          <w:color w:val="000000" w:themeColor="text1" w:themeTint="FF" w:themeShade="FF"/>
+          <w:sz w:val="32"/>
+          <w:szCs w:val="32"/>
+          <w:lang w:bidi="th-TH"/>
+        </w:rPr>
+      </w:pPr>
+      <w:r>
+        <w:rPr>
+          <w:rFonts w:ascii="Angsana New" w:hAnsi="Angsana New" w:eastAsia="Angsana New" w:cs="Angsana New"/>
+          <w:b w:val="0"/>
+          <w:bCs w:val="0"/>
+          <w:i w:val="0"/>
+          <w:iCs w:val="0"/>
+          <w:caps w:val="0"/>
+          <w:smallCaps w:val="0"/>
+          <w:noProof w:val="0"/>
+          <w:color w:val="000000" w:themeColor="text1" w:themeTint="FF" w:themeShade="FF"/>
+          <w:sz w:val="32"/>
+          <w:szCs w:val="32"/>
+          <w:lang w:bidi="th-TH"/>
+        </w:rPr>
+        <w:t>กลับมาดูที่ตาราง จะพบว่าระบบยอมให้บันทึก และแสดงผล Available มากกว่า Total Copies ซึ่งเป็นไปไม่ได้ในทางปฏิบัติ</w:t>
+      </w:r>
+    </w:p>
+    <w:p>
+      <w:pPr>
+        <w:pStyle w:val="a9"/>
+        <w:numPr>
+          <w:ilvl w:val="1"/>
+          <w:numId w:val="26"/>
+        </w:numPr>
+        <w:rPr>
+          <w:rFonts w:ascii="Angsana New" w:hAnsi="Angsana New" w:eastAsia="Angsana New" w:cs="Angsana New"/>
+          <w:b w:val="0"/>
+          <w:bCs w:val="0"/>
+          <w:i w:val="0"/>
+          <w:iCs w:val="0"/>
+          <w:caps w:val="0"/>
+          <w:smallCaps w:val="0"/>
+          <w:noProof w:val="0"/>
+          <w:color w:val="000000" w:themeColor="text1" w:themeTint="FF" w:themeShade="FF"/>
+          <w:sz w:val="32"/>
+          <w:szCs w:val="32"/>
+          <w:lang w:bidi="th-TH"/>
+        </w:rPr>
+      </w:pPr>
+      <w:r>
+        <w:rPr>
+          <w:rFonts w:ascii="Angsana New" w:hAnsi="Angsana New" w:eastAsia="Angsana New" w:cs="Angsana New"/>
+          <w:b w:val="0"/>
+          <w:bCs w:val="0"/>
+          <w:i w:val="0"/>
+          <w:iCs w:val="0"/>
+          <w:caps w:val="0"/>
+          <w:smallCaps w:val="0"/>
+          <w:noProof w:val="0"/>
+          <w:color w:val="000000" w:themeColor="text1" w:themeTint="FF" w:themeShade="FF"/>
+          <w:sz w:val="32"/>
+          <w:szCs w:val="32"/>
+          <w:lang w:val="en-US" w:bidi="th-TH"/>
+        </w:rPr>
+        <w:t>Evidence: รูปภาพ Screenshot</w:t>
+      </w:r>
+    </w:p>
+    <w:p>
+      <w:pPr>
+        <w:ind w:left="720"/>
+        <w:rPr>
+          <w:rFonts w:ascii="Angsana New" w:hAnsi="Angsana New" w:eastAsia="Angsana New" w:cs="Angsana New"/>
+          <w:b w:val="0"/>
+          <w:bCs w:val="0"/>
+          <w:i w:val="0"/>
+          <w:iCs w:val="0"/>
+          <w:caps w:val="0"/>
+          <w:smallCaps w:val="0"/>
+          <w:noProof w:val="0"/>
+          <w:color w:val="000000" w:themeColor="text1" w:themeTint="FF" w:themeShade="FF"/>
+          <w:sz w:val="32"/>
+          <w:szCs w:val="32"/>
+          <w:lang w:bidi="th-TH"/>
+        </w:rPr>
+      </w:pPr>
+      <w:r>
+        <w:drawing>
+          <wp:inline wp14:editId="6BD3BF48" wp14:anchorId="4D53EEE7">
+            <wp:extent cx="5019675" cy="2590800"/>
+            <wp:effectExtent l="0" t="0" r="0" b="0"/>
+            <wp:docPr id="1584533551" name="drawing"/>
+            <wp:cNvGraphicFramePr>
+              <a:graphicFrameLocks noChangeAspect="1"/>
+            </wp:cNvGraphicFramePr>
+            <a:graphic>
+              <a:graphicData xmlns:a="http://schemas.openxmlformats.org/drawingml/2006/main" uri="http://schemas.openxmlformats.org/drawingml/2006/picture">
+                <pic:pic xmlns:pic="http://schemas.openxmlformats.org/drawingml/2006/picture">
+                  <pic:nvPicPr>
+                    <pic:cNvPr id="1584533551" name="Picture 1584533551"/>
+                    <pic:cNvPicPr/>
+                  </pic:nvPicPr>
+                  <pic:blipFill>
+                    <a:blip xmlns:r="http://schemas.openxmlformats.org/officeDocument/2006/relationships" r:embed="rId602609051">
+                      <a:extLst>
+                        <a:ext uri="{28A0092B-C50C-407E-A947-70E740481C1C}">
+                          <a14:useLocalDpi xmlns:a14="http://schemas.microsoft.com/office/drawing/2010/main"/>
+                        </a:ext>
+                      </a:extLst>
+                    </a:blip>
+                    <a:stretch>
+                      <a:fillRect/>
+                    </a:stretch>
+                  </pic:blipFill>
+                  <pic:spPr>
+                    <a:xfrm>
+                      <a:off x="0" y="0"/>
+                      <a:ext cx="5019675" cy="2590800"/>
+                    </a:xfrm>
+                    <a:prstGeom prst="rect">
+                      <a:avLst/>
+                    </a:prstGeom>
+                  </pic:spPr>
+                </pic:pic>
+              </a:graphicData>
+            </a:graphic>
+          </wp:inline>
+        </w:drawing>
+      </w:r>
+    </w:p>
+    <w:p>
+      <w:pPr>
+        <w:rPr>
+          <w:rFonts w:ascii="Angsana New" w:hAnsi="Angsana New" w:eastAsia="Angsana New" w:cs="Angsana New"/>
+          <w:b w:val="0"/>
+          <w:bCs w:val="0"/>
+          <w:i w:val="0"/>
+          <w:iCs w:val="0"/>
+          <w:caps w:val="0"/>
+          <w:smallCaps w:val="0"/>
+          <w:noProof w:val="0"/>
+          <w:color w:val="000000" w:themeColor="text1" w:themeTint="FF" w:themeShade="FF"/>
+          <w:sz w:val="32"/>
+          <w:szCs w:val="32"/>
+          <w:lang w:bidi="th-TH"/>
+        </w:rPr>
+      </w:pPr>
+    </w:p>
+    <w:p>
+      <w:pPr>
+        <w:rPr>
+          <w:rFonts w:ascii="Angsana New" w:hAnsi="Angsana New" w:eastAsia="Angsana New" w:cs="Angsana New"/>
+          <w:b w:val="0"/>
+          <w:bCs w:val="0"/>
+          <w:i w:val="0"/>
+          <w:iCs w:val="0"/>
+          <w:caps w:val="0"/>
+          <w:smallCaps w:val="0"/>
+          <w:noProof w:val="0"/>
+          <w:color w:val="000000" w:themeColor="text1" w:themeTint="FF" w:themeShade="FF"/>
+          <w:sz w:val="32"/>
+          <w:szCs w:val="32"/>
+          <w:lang w:bidi="th-TH"/>
+        </w:rPr>
+      </w:pPr>
+    </w:p>
+    <w:p>
+      <w:pPr>
+        <w:rPr>
+          <w:rFonts w:ascii="Angsana New" w:hAnsi="Angsana New" w:eastAsia="Angsana New" w:cs="Angsana New"/>
+          <w:b w:val="0"/>
+          <w:bCs w:val="0"/>
+          <w:i w:val="0"/>
+          <w:iCs w:val="0"/>
+          <w:caps w:val="0"/>
+          <w:smallCaps w:val="0"/>
+          <w:noProof w:val="0"/>
+          <w:color w:val="000000" w:themeColor="text1" w:themeTint="FF" w:themeShade="FF"/>
+          <w:sz w:val="32"/>
+          <w:szCs w:val="32"/>
+          <w:lang w:bidi="th-TH"/>
+        </w:rPr>
+      </w:pPr>
+    </w:p>
+    <w:p>
+      <w:pPr>
+        <w:rPr>
+          <w:rFonts w:ascii="Angsana New" w:hAnsi="Angsana New" w:eastAsia="Angsana New" w:cs="Angsana New"/>
+          <w:b w:val="0"/>
+          <w:bCs w:val="0"/>
+          <w:i w:val="0"/>
+          <w:iCs w:val="0"/>
+          <w:caps w:val="0"/>
+          <w:smallCaps w:val="0"/>
+          <w:noProof w:val="0"/>
+          <w:color w:val="000000" w:themeColor="text1" w:themeTint="FF" w:themeShade="FF"/>
+          <w:sz w:val="32"/>
+          <w:szCs w:val="32"/>
+          <w:lang w:bidi="th-TH"/>
+        </w:rPr>
+      </w:pPr>
+    </w:p>
+    <w:p>
+      <w:pPr>
+        <w:rPr>
+          <w:rFonts w:ascii="Angsana New" w:hAnsi="Angsana New" w:eastAsia="Angsana New" w:cs="Angsana New"/>
+          <w:b w:val="0"/>
+          <w:bCs w:val="0"/>
+          <w:i w:val="0"/>
+          <w:iCs w:val="0"/>
+          <w:caps w:val="0"/>
+          <w:smallCaps w:val="0"/>
+          <w:noProof w:val="0"/>
+          <w:color w:val="000000" w:themeColor="text1" w:themeTint="FF" w:themeShade="FF"/>
+          <w:sz w:val="32"/>
+          <w:szCs w:val="32"/>
+          <w:lang w:bidi="th-TH"/>
+        </w:rPr>
+      </w:pPr>
+    </w:p>
+    <w:p>
+      <w:pPr>
+        <w:pStyle w:val="a9"/>
+        <w:numPr>
+          <w:ilvl w:val="1"/>
+          <w:numId w:val="26"/>
+        </w:numPr>
+        <w:rPr>
+          <w:rFonts w:ascii="Angsana New" w:hAnsi="Angsana New" w:eastAsia="Angsana New" w:cs="Angsana New"/>
+          <w:b w:val="0"/>
+          <w:bCs w:val="0"/>
+          <w:i w:val="0"/>
+          <w:iCs w:val="0"/>
+          <w:caps w:val="0"/>
+          <w:smallCaps w:val="0"/>
+          <w:noProof w:val="0"/>
+          <w:color w:val="000000" w:themeColor="text1" w:themeTint="FF" w:themeShade="FF"/>
+          <w:sz w:val="32"/>
+          <w:szCs w:val="32"/>
+          <w:lang w:bidi="th-TH"/>
+        </w:rPr>
+      </w:pPr>
+      <w:r>
+        <w:rPr>
+          <w:rFonts w:ascii="Angsana New" w:hAnsi="Angsana New" w:eastAsia="Angsana New" w:cs="Angsana New"/>
+          <w:b w:val="0"/>
+          <w:bCs w:val="0"/>
+          <w:i w:val="0"/>
+          <w:iCs w:val="0"/>
+          <w:caps w:val="0"/>
+          <w:smallCaps w:val="0"/>
+          <w:noProof w:val="0"/>
+          <w:color w:val="000000" w:themeColor="text1" w:themeTint="FF" w:themeShade="FF"/>
+          <w:sz w:val="32"/>
+          <w:szCs w:val="32"/>
+          <w:lang w:val="en-US" w:bidi="th-TH"/>
+        </w:rPr>
+        <w:t>Bug ID: BUG-003</w:t>
+      </w:r>
+    </w:p>
+    <w:p>
+      <w:pPr>
+        <w:pStyle w:val="a9"/>
+        <w:numPr>
+          <w:ilvl w:val="1"/>
+          <w:numId w:val="26"/>
+        </w:numPr>
+        <w:rPr>
+          <w:rFonts w:ascii="Angsana New" w:hAnsi="Angsana New" w:eastAsia="Angsana New" w:cs="Angsana New"/>
+          <w:b w:val="0"/>
+          <w:bCs w:val="0"/>
+          <w:i w:val="0"/>
+          <w:iCs w:val="0"/>
+          <w:caps w:val="0"/>
+          <w:smallCaps w:val="0"/>
+          <w:noProof w:val="0"/>
+          <w:color w:val="000000" w:themeColor="text1" w:themeTint="FF" w:themeShade="FF"/>
+          <w:sz w:val="32"/>
+          <w:szCs w:val="32"/>
+          <w:lang w:bidi="th-TH"/>
+        </w:rPr>
+      </w:pPr>
+      <w:r>
+        <w:rPr>
+          <w:rFonts w:ascii="Angsana New" w:hAnsi="Angsana New" w:eastAsia="Angsana New" w:cs="Angsana New"/>
+          <w:b w:val="0"/>
+          <w:bCs w:val="0"/>
+          <w:i w:val="0"/>
+          <w:iCs w:val="0"/>
+          <w:caps w:val="0"/>
+          <w:smallCaps w:val="0"/>
+          <w:noProof w:val="0"/>
+          <w:color w:val="000000" w:themeColor="text1" w:themeTint="FF" w:themeShade="FF"/>
+          <w:sz w:val="32"/>
+          <w:szCs w:val="32"/>
+          <w:lang w:val="en-US" w:bidi="th-TH"/>
+        </w:rPr>
+        <w:t>Severity: Medium</w:t>
+      </w:r>
+    </w:p>
+    <w:p>
+      <w:pPr>
+        <w:pStyle w:val="a9"/>
+        <w:numPr>
+          <w:ilvl w:val="1"/>
+          <w:numId w:val="26"/>
+        </w:numPr>
+        <w:rPr>
+          <w:rFonts w:ascii="Angsana New" w:hAnsi="Angsana New" w:eastAsia="Angsana New" w:cs="Angsana New"/>
+          <w:b w:val="0"/>
+          <w:bCs w:val="0"/>
+          <w:i w:val="0"/>
+          <w:iCs w:val="0"/>
+          <w:caps w:val="0"/>
+          <w:smallCaps w:val="0"/>
+          <w:noProof w:val="0"/>
+          <w:color w:val="000000" w:themeColor="text1" w:themeTint="FF" w:themeShade="FF"/>
+          <w:sz w:val="32"/>
+          <w:szCs w:val="32"/>
+          <w:lang w:bidi="th-TH"/>
+        </w:rPr>
+      </w:pPr>
+      <w:r>
+        <w:rPr>
+          <w:rFonts w:ascii="Angsana New" w:hAnsi="Angsana New" w:eastAsia="Angsana New" w:cs="Angsana New"/>
+          <w:b w:val="0"/>
+          <w:bCs w:val="0"/>
+          <w:i w:val="0"/>
+          <w:iCs w:val="0"/>
+          <w:caps w:val="0"/>
+          <w:smallCaps w:val="0"/>
+          <w:noProof w:val="0"/>
+          <w:color w:val="000000" w:themeColor="text1" w:themeTint="FF" w:themeShade="FF"/>
+          <w:sz w:val="32"/>
+          <w:szCs w:val="32"/>
+          <w:lang w:val="en-US" w:bidi="th-TH"/>
+        </w:rPr>
+        <w:t>Steps to Reproduce:</w:t>
+      </w:r>
+    </w:p>
+    <w:p>
+      <w:pPr>
+        <w:pStyle w:val="a9"/>
+        <w:numPr>
+          <w:ilvl w:val="2"/>
+          <w:numId w:val="26"/>
+        </w:numPr>
+        <w:rPr>
+          <w:rFonts w:ascii="Angsana New" w:hAnsi="Angsana New" w:eastAsia="Angsana New" w:cs="Angsana New"/>
+          <w:b w:val="0"/>
+          <w:bCs w:val="0"/>
+          <w:i w:val="0"/>
+          <w:iCs w:val="0"/>
+          <w:caps w:val="0"/>
+          <w:smallCaps w:val="0"/>
+          <w:noProof w:val="0"/>
+          <w:color w:val="000000" w:themeColor="text1" w:themeTint="FF" w:themeShade="FF"/>
+          <w:sz w:val="32"/>
+          <w:szCs w:val="32"/>
+          <w:lang w:bidi="th-TH"/>
+        </w:rPr>
+      </w:pPr>
+      <w:r>
+        <w:rPr>
+          <w:rFonts w:ascii="Angsana New" w:hAnsi="Angsana New" w:eastAsia="Angsana New" w:cs="Angsana New"/>
+          <w:b w:val="0"/>
+          <w:bCs w:val="0"/>
+          <w:i w:val="0"/>
+          <w:iCs w:val="0"/>
+          <w:caps w:val="0"/>
+          <w:smallCaps w:val="0"/>
+          <w:noProof w:val="0"/>
+          <w:color w:val="000000" w:themeColor="text1" w:themeTint="FF" w:themeShade="FF"/>
+          <w:sz w:val="32"/>
+          <w:szCs w:val="32"/>
+          <w:lang w:bidi="th-TH"/>
+        </w:rPr>
+        <w:t>เข้าสู่ระบบด้วยสิทธิ์ System Administrator</w:t>
+      </w:r>
+    </w:p>
+    <w:p>
+      <w:pPr>
+        <w:pStyle w:val="a9"/>
+        <w:numPr>
+          <w:ilvl w:val="2"/>
+          <w:numId w:val="26"/>
+        </w:numPr>
+        <w:rPr>
+          <w:rFonts w:ascii="Angsana New" w:hAnsi="Angsana New" w:eastAsia="Angsana New" w:cs="Angsana New"/>
+          <w:b w:val="0"/>
+          <w:bCs w:val="0"/>
+          <w:i w:val="0"/>
+          <w:iCs w:val="0"/>
+          <w:caps w:val="0"/>
+          <w:smallCaps w:val="0"/>
+          <w:noProof w:val="0"/>
+          <w:color w:val="000000" w:themeColor="text1" w:themeTint="FF" w:themeShade="FF"/>
+          <w:sz w:val="32"/>
+          <w:szCs w:val="32"/>
+          <w:lang w:bidi="th-TH"/>
+        </w:rPr>
+      </w:pPr>
+      <w:r>
+        <w:rPr>
+          <w:rFonts w:ascii="Angsana New" w:hAnsi="Angsana New" w:eastAsia="Angsana New" w:cs="Angsana New"/>
+          <w:b w:val="0"/>
+          <w:bCs w:val="0"/>
+          <w:i w:val="0"/>
+          <w:iCs w:val="0"/>
+          <w:caps w:val="0"/>
+          <w:smallCaps w:val="0"/>
+          <w:noProof w:val="0"/>
+          <w:color w:val="000000" w:themeColor="text1" w:themeTint="FF" w:themeShade="FF"/>
+          <w:sz w:val="32"/>
+          <w:szCs w:val="32"/>
+          <w:lang w:bidi="th-TH"/>
+        </w:rPr>
+        <w:t>ไปที่หน้า Borrowing Management ตรวจสอบประวัติของสมาชิก "สมชาย ใจดี" จะพบว่ามีหนังสือสถานะ "Borrowed" (ยืมค้างอยู่) จำนวน 2 รายการ</w:t>
+      </w:r>
+    </w:p>
+    <w:p>
+      <w:pPr>
+        <w:pStyle w:val="a9"/>
+        <w:numPr>
+          <w:ilvl w:val="2"/>
+          <w:numId w:val="26"/>
+        </w:numPr>
+        <w:rPr>
+          <w:rFonts w:ascii="Angsana New" w:hAnsi="Angsana New" w:eastAsia="Angsana New" w:cs="Angsana New"/>
+          <w:b w:val="0"/>
+          <w:bCs w:val="0"/>
+          <w:i w:val="0"/>
+          <w:iCs w:val="0"/>
+          <w:caps w:val="0"/>
+          <w:smallCaps w:val="0"/>
+          <w:noProof w:val="0"/>
+          <w:color w:val="000000" w:themeColor="text1" w:themeTint="FF" w:themeShade="FF"/>
+          <w:sz w:val="32"/>
+          <w:szCs w:val="32"/>
+          <w:lang w:bidi="th-TH"/>
+        </w:rPr>
+      </w:pPr>
+      <w:r>
+        <w:rPr>
+          <w:rFonts w:ascii="Angsana New" w:hAnsi="Angsana New" w:eastAsia="Angsana New" w:cs="Angsana New"/>
+          <w:b w:val="0"/>
+          <w:bCs w:val="0"/>
+          <w:i w:val="0"/>
+          <w:iCs w:val="0"/>
+          <w:caps w:val="0"/>
+          <w:smallCaps w:val="0"/>
+          <w:noProof w:val="0"/>
+          <w:color w:val="000000" w:themeColor="text1" w:themeTint="FF" w:themeShade="FF"/>
+          <w:sz w:val="32"/>
+          <w:szCs w:val="32"/>
+          <w:lang w:bidi="th-TH"/>
+        </w:rPr>
+        <w:t>ไปที่เมนู Members Management</w:t>
+      </w:r>
+    </w:p>
+    <w:p>
+      <w:pPr>
+        <w:pStyle w:val="a9"/>
+        <w:numPr>
+          <w:ilvl w:val="2"/>
+          <w:numId w:val="26"/>
+        </w:numPr>
+        <w:rPr>
+          <w:rFonts w:ascii="Angsana New" w:hAnsi="Angsana New" w:eastAsia="Angsana New" w:cs="Angsana New"/>
+          <w:b w:val="0"/>
+          <w:bCs w:val="0"/>
+          <w:i w:val="0"/>
+          <w:iCs w:val="0"/>
+          <w:caps w:val="0"/>
+          <w:smallCaps w:val="0"/>
+          <w:noProof w:val="0"/>
+          <w:color w:val="000000" w:themeColor="text1" w:themeTint="FF" w:themeShade="FF"/>
+          <w:sz w:val="32"/>
+          <w:szCs w:val="32"/>
+          <w:lang w:bidi="th-TH"/>
+        </w:rPr>
+      </w:pPr>
+      <w:r>
+        <w:rPr>
+          <w:rFonts w:ascii="Angsana New" w:hAnsi="Angsana New" w:eastAsia="Angsana New" w:cs="Angsana New"/>
+          <w:b w:val="0"/>
+          <w:bCs w:val="0"/>
+          <w:i w:val="0"/>
+          <w:iCs w:val="0"/>
+          <w:caps w:val="0"/>
+          <w:smallCaps w:val="0"/>
+          <w:noProof w:val="0"/>
+          <w:color w:val="000000" w:themeColor="text1" w:themeTint="FF" w:themeShade="FF"/>
+          <w:sz w:val="32"/>
+          <w:szCs w:val="32"/>
+          <w:lang w:bidi="th-TH"/>
+        </w:rPr>
+        <w:t>คลิกปุ่ม "Edit" เพื่อแก้ไขข้อมูลของ "สมชาย ใจดี"</w:t>
+      </w:r>
+    </w:p>
+    <w:p>
+      <w:pPr>
+        <w:pStyle w:val="a9"/>
+        <w:numPr>
+          <w:ilvl w:val="2"/>
+          <w:numId w:val="26"/>
+        </w:numPr>
+        <w:rPr>
+          <w:rFonts w:ascii="Angsana New" w:hAnsi="Angsana New" w:eastAsia="Angsana New" w:cs="Angsana New"/>
+          <w:b w:val="0"/>
+          <w:bCs w:val="0"/>
+          <w:i w:val="0"/>
+          <w:iCs w:val="0"/>
+          <w:caps w:val="0"/>
+          <w:smallCaps w:val="0"/>
+          <w:noProof w:val="0"/>
+          <w:color w:val="000000" w:themeColor="text1" w:themeTint="FF" w:themeShade="FF"/>
+          <w:sz w:val="32"/>
+          <w:szCs w:val="32"/>
+          <w:lang w:bidi="th-TH"/>
+        </w:rPr>
+      </w:pPr>
+      <w:r>
+        <w:rPr>
+          <w:rFonts w:ascii="Angsana New" w:hAnsi="Angsana New" w:eastAsia="Angsana New" w:cs="Angsana New"/>
+          <w:b w:val="0"/>
+          <w:bCs w:val="0"/>
+          <w:i w:val="0"/>
+          <w:iCs w:val="0"/>
+          <w:caps w:val="0"/>
+          <w:smallCaps w:val="0"/>
+          <w:noProof w:val="0"/>
+          <w:color w:val="000000" w:themeColor="text1" w:themeTint="FF" w:themeShade="FF"/>
+          <w:sz w:val="32"/>
+          <w:szCs w:val="32"/>
+          <w:lang w:bidi="th-TH"/>
+        </w:rPr>
+        <w:t>ปรับลดค่าในช่อง Max Books ให้เหลือ 1 เล่ม แล้วกดบันทึกข้อมูล</w:t>
+      </w:r>
+    </w:p>
+    <w:p>
+      <w:pPr>
+        <w:pStyle w:val="a9"/>
+        <w:numPr>
+          <w:ilvl w:val="2"/>
+          <w:numId w:val="26"/>
+        </w:numPr>
+        <w:rPr>
+          <w:rFonts w:ascii="Angsana New" w:hAnsi="Angsana New" w:eastAsia="Angsana New" w:cs="Angsana New"/>
+          <w:b w:val="0"/>
+          <w:bCs w:val="0"/>
+          <w:i w:val="0"/>
+          <w:iCs w:val="0"/>
+          <w:caps w:val="0"/>
+          <w:smallCaps w:val="0"/>
+          <w:noProof w:val="0"/>
+          <w:color w:val="000000" w:themeColor="text1" w:themeTint="FF" w:themeShade="FF"/>
+          <w:sz w:val="32"/>
+          <w:szCs w:val="32"/>
+          <w:lang w:bidi="th-TH"/>
+        </w:rPr>
+      </w:pPr>
+      <w:r>
+        <w:rPr>
+          <w:rFonts w:ascii="Angsana New" w:hAnsi="Angsana New" w:eastAsia="Angsana New" w:cs="Angsana New"/>
+          <w:b w:val="0"/>
+          <w:bCs w:val="0"/>
+          <w:i w:val="0"/>
+          <w:iCs w:val="0"/>
+          <w:caps w:val="0"/>
+          <w:smallCaps w:val="0"/>
+          <w:noProof w:val="0"/>
+          <w:color w:val="000000" w:themeColor="text1" w:themeTint="FF" w:themeShade="FF"/>
+          <w:sz w:val="32"/>
+          <w:szCs w:val="32"/>
+          <w:lang w:bidi="th-TH"/>
+        </w:rPr>
+        <w:t>ระบบอนุญาตให้บันทึกสำเร็จ (Max Books กลายเป็น 1 ทั้งที่ยืมค้างอยู่ 2)</w:t>
+      </w:r>
+    </w:p>
+    <w:p>
+      <w:pPr>
+        <w:pStyle w:val="a9"/>
+        <w:numPr>
+          <w:ilvl w:val="1"/>
+          <w:numId w:val="26"/>
+        </w:numPr>
+        <w:rPr>
+          <w:rFonts w:ascii="Angsana New" w:hAnsi="Angsana New" w:eastAsia="Angsana New" w:cs="Angsana New"/>
+          <w:b w:val="0"/>
+          <w:bCs w:val="0"/>
+          <w:i w:val="0"/>
+          <w:iCs w:val="0"/>
+          <w:caps w:val="0"/>
+          <w:smallCaps w:val="0"/>
+          <w:noProof w:val="0"/>
+          <w:color w:val="000000" w:themeColor="text1" w:themeTint="FF" w:themeShade="FF"/>
+          <w:sz w:val="32"/>
+          <w:szCs w:val="32"/>
+          <w:lang w:bidi="th-TH"/>
+        </w:rPr>
+      </w:pPr>
+      <w:r>
+        <w:rPr>
+          <w:rFonts w:ascii="Angsana New" w:hAnsi="Angsana New" w:eastAsia="Angsana New" w:cs="Angsana New"/>
+          <w:b w:val="0"/>
+          <w:bCs w:val="0"/>
+          <w:i w:val="0"/>
+          <w:iCs w:val="0"/>
+          <w:caps w:val="0"/>
+          <w:smallCaps w:val="0"/>
+          <w:noProof w:val="0"/>
+          <w:color w:val="000000" w:themeColor="text1" w:themeTint="FF" w:themeShade="FF"/>
+          <w:sz w:val="32"/>
+          <w:szCs w:val="32"/>
+          <w:lang w:val="en-US" w:bidi="th-TH"/>
+        </w:rPr>
+        <w:t>Evidence: รูปภาพ Screenshot</w:t>
+      </w:r>
+    </w:p>
+    <w:p>
+      <w:pPr>
+        <w:ind w:left="1440"/>
+        <w:rPr>
+          <w:rFonts w:ascii="Angsana New" w:hAnsi="Angsana New" w:eastAsia="Angsana New" w:cs="Angsana New"/>
+          <w:b w:val="0"/>
+          <w:bCs w:val="0"/>
+          <w:i w:val="0"/>
+          <w:iCs w:val="0"/>
+          <w:caps w:val="0"/>
+          <w:smallCaps w:val="0"/>
+          <w:noProof w:val="0"/>
+          <w:color w:val="000000" w:themeColor="text1" w:themeTint="FF" w:themeShade="FF"/>
+          <w:sz w:val="32"/>
+          <w:szCs w:val="32"/>
+          <w:lang w:bidi="th-TH"/>
+        </w:rPr>
+      </w:pPr>
+      <w:r>
+        <w:drawing>
+          <wp:inline wp14:editId="0AD75275" wp14:anchorId="3821D80F">
+            <wp:extent cx="4076700" cy="1362075"/>
+            <wp:effectExtent l="0" t="0" r="0" b="0"/>
+            <wp:docPr id="231493554" name="drawing"/>
+            <wp:cNvGraphicFramePr>
+              <a:graphicFrameLocks noChangeAspect="1"/>
+            </wp:cNvGraphicFramePr>
+            <a:graphic>
+              <a:graphicData xmlns:a="http://schemas.openxmlformats.org/drawingml/2006/main" uri="http://schemas.openxmlformats.org/drawingml/2006/picture">
+                <pic:pic xmlns:pic="http://schemas.openxmlformats.org/drawingml/2006/picture">
+                  <pic:nvPicPr>
+                    <pic:cNvPr id="231493554" name="Picture 231493554"/>
+                    <pic:cNvPicPr/>
+                  </pic:nvPicPr>
+                  <pic:blipFill>
+                    <a:blip xmlns:r="http://schemas.openxmlformats.org/officeDocument/2006/relationships" r:embed="rId1116900569">
+                      <a:extLst>
+                        <a:ext uri="{28A0092B-C50C-407E-A947-70E740481C1C}">
+                          <a14:useLocalDpi xmlns:a14="http://schemas.microsoft.com/office/drawing/2010/main"/>
+                        </a:ext>
+                      </a:extLst>
+                    </a:blip>
+                    <a:stretch>
+                      <a:fillRect/>
+                    </a:stretch>
+                  </pic:blipFill>
+                  <pic:spPr>
+                    <a:xfrm>
+                      <a:off x="0" y="0"/>
+                      <a:ext cx="4076700" cy="1362075"/>
+                    </a:xfrm>
+                    <a:prstGeom prst="rect">
+                      <a:avLst/>
+                    </a:prstGeom>
+                  </pic:spPr>
+                </pic:pic>
+              </a:graphicData>
+            </a:graphic>
+          </wp:inline>
+        </w:drawing>
+      </w:r>
+    </w:p>
+    <w:p>
+      <w:pPr>
+        <w:jc w:val="center"/>
+        <w:rPr>
+          <w:rFonts w:ascii="Angsana New" w:hAnsi="Angsana New" w:eastAsia="Angsana New" w:cs="Angsana New"/>
+          <w:b w:val="0"/>
+          <w:bCs w:val="0"/>
+          <w:i w:val="0"/>
+          <w:iCs w:val="0"/>
+          <w:caps w:val="0"/>
+          <w:smallCaps w:val="0"/>
+          <w:noProof w:val="0"/>
+          <w:color w:val="000000" w:themeColor="text1" w:themeTint="FF" w:themeShade="FF"/>
+          <w:sz w:val="32"/>
+          <w:szCs w:val="32"/>
+          <w:lang w:bidi="th-TH"/>
+        </w:rPr>
+      </w:pPr>
+      <w:r>
+        <w:drawing>
+          <wp:inline wp14:editId="41F62443" wp14:anchorId="5ABC0747">
+            <wp:extent cx="3705225" cy="2686050"/>
+            <wp:effectExtent l="0" t="0" r="0" b="0"/>
+            <wp:docPr id="106700402" name="drawing"/>
+            <wp:cNvGraphicFramePr>
+              <a:graphicFrameLocks noChangeAspect="1"/>
+            </wp:cNvGraphicFramePr>
+            <a:graphic>
+              <a:graphicData xmlns:a="http://schemas.openxmlformats.org/drawingml/2006/main" uri="http://schemas.openxmlformats.org/drawingml/2006/picture">
+                <pic:pic xmlns:pic="http://schemas.openxmlformats.org/drawingml/2006/picture">
+                  <pic:nvPicPr>
+                    <pic:cNvPr id="106700402" name="Picture 106700402"/>
+                    <pic:cNvPicPr/>
+                  </pic:nvPicPr>
+                  <pic:blipFill>
+                    <a:blip xmlns:r="http://schemas.openxmlformats.org/officeDocument/2006/relationships" r:embed="rId1947948798">
+                      <a:extLst>
+                        <a:ext uri="{28A0092B-C50C-407E-A947-70E740481C1C}">
+                          <a14:useLocalDpi xmlns:a14="http://schemas.microsoft.com/office/drawing/2010/main"/>
+                        </a:ext>
+                      </a:extLst>
+                    </a:blip>
+                    <a:stretch>
+                      <a:fillRect/>
+                    </a:stretch>
+                  </pic:blipFill>
+                  <pic:spPr>
+                    <a:xfrm>
+                      <a:off x="0" y="0"/>
+                      <a:ext cx="3705225" cy="2686050"/>
+                    </a:xfrm>
+                    <a:prstGeom prst="rect">
+                      <a:avLst/>
+                    </a:prstGeom>
+                  </pic:spPr>
+                </pic:pic>
+              </a:graphicData>
+            </a:graphic>
+          </wp:inline>
+        </w:drawing>
+      </w:r>
+    </w:p>
+    <w:p>
+      <w:pPr>
+        <w:pStyle w:val="a"/>
+      </w:pPr>
     </w:p>
     <w:p>
       <w:pPr>
@@ -28031,6 +29521,116 @@
 
 <file path=word/numbering.xml><?xml version="1.0" encoding="utf-8"?>
 <w:numbering xmlns:wpc="http://schemas.microsoft.com/office/word/2010/wordprocessingCanvas" xmlns:cx="http://schemas.microsoft.com/office/drawing/2014/chartex" xmlns:cx1="http://schemas.microsoft.com/office/drawing/2015/9/8/chartex" xmlns:cx2="http://schemas.microsoft.com/office/drawing/2015/10/21/chartex" xmlns:cx3="http://schemas.microsoft.com/office/drawing/2016/5/9/chartex" xmlns:cx4="http://schemas.microsoft.com/office/drawing/2016/5/10/chartex" xmlns:cx5="http://schemas.microsoft.com/office/drawing/2016/5/11/chartex" xmlns:cx6="http://schemas.microsoft.com/office/drawing/2016/5/12/chartex" xmlns:cx7="http://schemas.microsoft.com/office/drawing/2016/5/13/chartex" xmlns:cx8="http://schemas.microsoft.com/office/drawing/2016/5/14/chartex" xmlns:mc="http://schemas.openxmlformats.org/markup-compatibility/2006" xmlns:aink="http://schemas.microsoft.com/office/drawing/2016/ink" xmlns:am3d="http://schemas.microsoft.com/office/drawing/2017/model3d" xmlns:o="urn:schemas-microsoft-com:office:office" xmlns:oel="http://schemas.microsoft.com/office/2019/extlst" xmlns:r="http://schemas.openxmlformats.org/officeDocument/2006/relationships" xmlns:m="http://schemas.openxmlformats.org/officeDocument/2006/math" xmlns:v="urn:schemas-microsoft-com:vml" xmlns:wp14="http://schemas.microsoft.com/office/word/2010/wordprocessingDrawing" xmlns:wp="http://schemas.openxmlformats.org/drawingml/2006/wordprocessingDrawing" xmlns:w10="urn:schemas-microsoft-com:office:word" xmlns:w="http://schemas.openxmlformats.org/wordprocessingml/2006/main" xmlns:w14="http://schemas.microsoft.com/office/word/2010/wordml" xmlns:w15="http://schemas.microsoft.com/office/word/2012/wordml" xmlns:w16cex="http://schemas.microsoft.com/office/word/2018/wordml/cex" xmlns:w16cid="http://schemas.microsoft.com/office/word/2016/wordml/cid" xmlns:w16="http://schemas.microsoft.com/office/word/2018/wordml" xmlns:w16du="http://schemas.microsoft.com/office/word/2023/wordml/word16du" xmlns:w16sdtdh="http://schemas.microsoft.com/office/word/2020/wordml/sdtdatahash" xmlns:w16sdtfl="http://schemas.microsoft.com/office/word/2024/wordml/sdtformatlock" xmlns:w16se="http://schemas.microsoft.com/office/word/2015/wordml/symex" xmlns:wpg="http://schemas.microsoft.com/office/word/2010/wordprocessingGroup" xmlns:wpi="http://schemas.microsoft.com/office/word/2010/wordprocessingInk" xmlns:wne="http://schemas.microsoft.com/office/word/2006/wordml" xmlns:wps="http://schemas.microsoft.com/office/word/2010/wordprocessingShape" mc:Ignorable="w14 w15 w16se w16cid w16 w16cex w16sdtdh w16sdtfl w16du wp14">
+  <w:abstractNum xmlns:w="http://schemas.openxmlformats.org/wordprocessingml/2006/main" w:abstractNumId="24">
+    <w:nsid w:val="74d08fc7"/>
+    <w:multiLevelType xmlns:w="http://schemas.openxmlformats.org/wordprocessingml/2006/main" w:val="hybridMultilevel"/>
+    <w:lvl xmlns:w="http://schemas.openxmlformats.org/wordprocessingml/2006/main" w:ilvl="0">
+      <w:start w:val="1"/>
+      <w:numFmt w:val="bullet"/>
+      <w:lvlText w:val=""/>
+      <w:lvlJc w:val="left"/>
+      <w:pPr>
+        <w:ind w:left="720" w:hanging="360"/>
+      </w:pPr>
+      <w:rPr>
+        <w:rFonts w:hint="default" w:ascii="Symbol" w:hAnsi="Symbol"/>
+      </w:rPr>
+    </w:lvl>
+    <w:lvl xmlns:w="http://schemas.openxmlformats.org/wordprocessingml/2006/main" w:ilvl="1">
+      <w:start w:val="1"/>
+      <w:numFmt w:val="bullet"/>
+      <w:lvlText w:val="o"/>
+      <w:lvlJc w:val="left"/>
+      <w:pPr>
+        <w:ind w:left="1440" w:hanging="360"/>
+      </w:pPr>
+      <w:rPr>
+        <w:rFonts w:hint="default" w:ascii="Symbol" w:hAnsi="Symbol"/>
+      </w:rPr>
+    </w:lvl>
+    <w:lvl xmlns:w="http://schemas.openxmlformats.org/wordprocessingml/2006/main" w:ilvl="2">
+      <w:start w:val="1"/>
+      <w:numFmt w:val="decimal"/>
+      <w:lvlText w:val="%3."/>
+      <w:lvlJc w:val="left"/>
+      <w:pPr>
+        <w:ind w:left="2160" w:hanging="360"/>
+      </w:pPr>
+      <w:rPr/>
+    </w:lvl>
+    <w:lvl xmlns:w="http://schemas.openxmlformats.org/wordprocessingml/2006/main" w:ilvl="3">
+      <w:start w:val="1"/>
+      <w:numFmt w:val="bullet"/>
+      <w:lvlText w:val=""/>
+      <w:lvlJc w:val="left"/>
+      <w:pPr>
+        <w:ind w:left="2880" w:hanging="360"/>
+      </w:pPr>
+      <w:rPr>
+        <w:rFonts w:hint="default" w:ascii="Symbol" w:hAnsi="Symbol"/>
+      </w:rPr>
+    </w:lvl>
+    <w:lvl xmlns:w="http://schemas.openxmlformats.org/wordprocessingml/2006/main" w:ilvl="4">
+      <w:start w:val="1"/>
+      <w:numFmt w:val="bullet"/>
+      <w:lvlText w:val="o"/>
+      <w:lvlJc w:val="left"/>
+      <w:pPr>
+        <w:ind w:left="3600" w:hanging="360"/>
+      </w:pPr>
+      <w:rPr>
+        <w:rFonts w:hint="default" w:ascii="Courier New" w:hAnsi="Courier New"/>
+      </w:rPr>
+    </w:lvl>
+    <w:lvl xmlns:w="http://schemas.openxmlformats.org/wordprocessingml/2006/main" w:ilvl="5">
+      <w:start w:val="1"/>
+      <w:numFmt w:val="bullet"/>
+      <w:lvlText w:val=""/>
+      <w:lvlJc w:val="left"/>
+      <w:pPr>
+        <w:ind w:left="4320" w:hanging="360"/>
+      </w:pPr>
+      <w:rPr>
+        <w:rFonts w:hint="default" w:ascii="Wingdings" w:hAnsi="Wingdings"/>
+      </w:rPr>
+    </w:lvl>
+    <w:lvl xmlns:w="http://schemas.openxmlformats.org/wordprocessingml/2006/main" w:ilvl="6">
+      <w:start w:val="1"/>
+      <w:numFmt w:val="bullet"/>
+      <w:lvlText w:val=""/>
+      <w:lvlJc w:val="left"/>
+      <w:pPr>
+        <w:ind w:left="5040" w:hanging="360"/>
+      </w:pPr>
+      <w:rPr>
+        <w:rFonts w:hint="default" w:ascii="Symbol" w:hAnsi="Symbol"/>
+      </w:rPr>
+    </w:lvl>
+    <w:lvl xmlns:w="http://schemas.openxmlformats.org/wordprocessingml/2006/main" w:ilvl="7">
+      <w:start w:val="1"/>
+      <w:numFmt w:val="bullet"/>
+      <w:lvlText w:val="o"/>
+      <w:lvlJc w:val="left"/>
+      <w:pPr>
+        <w:ind w:left="5760" w:hanging="360"/>
+      </w:pPr>
+      <w:rPr>
+        <w:rFonts w:hint="default" w:ascii="Courier New" w:hAnsi="Courier New"/>
+      </w:rPr>
+    </w:lvl>
+    <w:lvl xmlns:w="http://schemas.openxmlformats.org/wordprocessingml/2006/main" w:ilvl="8">
+      <w:start w:val="1"/>
+      <w:numFmt w:val="bullet"/>
+      <w:lvlText w:val=""/>
+      <w:lvlJc w:val="left"/>
+      <w:pPr>
+        <w:ind w:left="6480" w:hanging="360"/>
+      </w:pPr>
+      <w:rPr>
+        <w:rFonts w:hint="default" w:ascii="Wingdings" w:hAnsi="Wingdings"/>
+      </w:rPr>
+    </w:lvl>
+  </w:abstractNum>
   <w:abstractNum w:abstractNumId="0" w15:restartNumberingAfterBreak="0">
     <w:nsid w:val="01D85A18"/>
     <w:multiLevelType w:val="multilevel"/>
@@ -31412,6 +33012,9 @@
       </w:rPr>
     </w:lvl>
   </w:abstractNum>
+  <w:num w:numId="26">
+    <w:abstractNumId w:val="24"/>
+  </w:num>
   <w:num w:numId="1" w16cid:durableId="1100298861">
     <w:abstractNumId w:val="15"/>
   </w:num>

</xml_diff>

<commit_message>
up final project report
</commit_message>
<xml_diff>
--- a/reports/Software Testing and Evaluation.docx
+++ b/reports/Software Testing and Evaluation.docx
@@ -765,8 +765,8 @@
           <w:cs/>
         </w:rPr>
         <w:sectPr>
-          <w:pgSz w:w="12240" w:h="15840"/>
-          <w:pgMar w:top="1440" w:right="1440" w:bottom="1440" w:left="1440" w:header="720" w:footer="720" w:gutter="0"/>
+          <w:pgSz w:w="11906" w:h="16838" w:code="9"/>
+          <w:pgMar w:top="720" w:right="720" w:bottom="720" w:left="720" w:header="720" w:footer="720" w:gutter="0"/>
           <w:cols w:space="720"/>
           <w:docGrid w:linePitch="360"/>
         </w:sectPr>
@@ -1231,7 +1231,6 @@
           <w:szCs w:val="40"/>
           <w:cs/>
         </w:rPr>
-        <w:lastRenderedPageBreak/>
         <w:t>สารบัญ</w:t>
       </w:r>
       <w:bookmarkEnd w:id="1"/>
@@ -4245,8 +4244,8 @@
         </w:rPr>
         <w:sectPr>
           <w:footerReference w:type="default" r:id="rId12"/>
-          <w:pgSz w:w="12240" w:h="15840"/>
-          <w:pgMar w:top="1440" w:right="1440" w:bottom="1440" w:left="1440" w:header="720" w:footer="720" w:gutter="0"/>
+          <w:pgSz w:w="11906" w:h="16838" w:code="9"/>
+          <w:pgMar w:top="720" w:right="720" w:bottom="720" w:left="720" w:header="720" w:footer="720" w:gutter="0"/>
           <w:pgNumType w:fmt="thaiLetters" w:start="1"/>
           <w:cols w:space="720"/>
           <w:docGrid w:linePitch="360"/>
@@ -4776,23 +4775,44 @@
         </w:numPr>
         <w:spacing w:before="100" w:beforeAutospacing="1" w:after="100" w:afterAutospacing="1" w:line="240" w:lineRule="auto"/>
         <w:rPr>
+          <w:rFonts w:asciiTheme="majorBidi" w:eastAsia="Times New Roman" w:hAnsiTheme="majorBidi" w:cstheme="majorBidi" w:hint="cs"/>
+          <w:kern w:val="0"/>
+          <w:sz w:val="32"/>
+          <w:szCs w:val="32"/>
+          <w14:ligatures w14:val="none"/>
+        </w:rPr>
+      </w:pPr>
+      <w:r>
+        <w:rPr>
           <w:rFonts w:asciiTheme="majorBidi" w:eastAsia="Times New Roman" w:hAnsiTheme="majorBidi" w:cstheme="majorBidi"/>
           <w:kern w:val="0"/>
           <w:sz w:val="32"/>
           <w:szCs w:val="32"/>
+          <w:cs/>
           <w14:ligatures w14:val="none"/>
         </w:rPr>
-      </w:pPr>
+        <w:t>เพื่อประยุกต์ใช้เครื่องมือทดสอบอัตโนมัติ (</w:t>
+      </w:r>
       <w:r>
         <w:rPr>
           <w:rFonts w:asciiTheme="majorBidi" w:eastAsia="Times New Roman" w:hAnsiTheme="majorBidi" w:cstheme="majorBidi"/>
           <w:kern w:val="0"/>
           <w:sz w:val="32"/>
           <w:szCs w:val="32"/>
+          <w14:ligatures w14:val="none"/>
+        </w:rPr>
+        <w:t xml:space="preserve">Automated Testing Tool) </w:t>
+      </w:r>
+      <w:r>
+        <w:rPr>
+          <w:rFonts w:asciiTheme="majorBidi" w:eastAsia="Times New Roman" w:hAnsiTheme="majorBidi" w:cstheme="majorBidi"/>
+          <w:kern w:val="0"/>
+          <w:sz w:val="32"/>
+          <w:szCs w:val="32"/>
           <w:cs/>
           <w14:ligatures w14:val="none"/>
         </w:rPr>
-        <w:t>เพื่อประยุกต์ใช้เครื่องมือทดสอบอัตโนมัติ (</w:t>
+        <w:t>อย่าง</w:t>
       </w:r>
       <w:r>
         <w:rPr>
@@ -4802,7 +4822,7 @@
           <w:szCs w:val="32"/>
           <w14:ligatures w14:val="none"/>
         </w:rPr>
-        <w:t xml:space="preserve">Automated Testing Tool) </w:t>
+        <w:t xml:space="preserve"> Playwright </w:t>
       </w:r>
       <w:r>
         <w:rPr>
@@ -4813,39 +4833,8 @@
           <w:cs/>
           <w14:ligatures w14:val="none"/>
         </w:rPr>
-        <w:t>อย่าง</w:t>
-      </w:r>
-      <w:r>
-        <w:rPr>
-          <w:rFonts w:asciiTheme="majorBidi" w:eastAsia="Times New Roman" w:hAnsiTheme="majorBidi" w:cstheme="majorBidi"/>
-          <w:kern w:val="0"/>
-          <w:sz w:val="32"/>
-          <w:szCs w:val="32"/>
-          <w14:ligatures w14:val="none"/>
-        </w:rPr>
-        <w:t xml:space="preserve"> Playwright </w:t>
-      </w:r>
-      <w:r>
-        <w:rPr>
-          <w:rFonts w:asciiTheme="majorBidi" w:eastAsia="Times New Roman" w:hAnsiTheme="majorBidi" w:cstheme="majorBidi"/>
-          <w:kern w:val="0"/>
-          <w:sz w:val="32"/>
-          <w:szCs w:val="32"/>
-          <w:cs/>
-          <w14:ligatures w14:val="none"/>
-        </w:rPr>
         <w:t>ในการเพิ่มประสิทธิภาพการตรวจสอบ</w:t>
       </w:r>
-    </w:p>
-    <w:p>
-      <w:pPr>
-        <w:ind w:left="1440"/>
-        <w:rPr>
-          <w:rFonts w:asciiTheme="majorBidi" w:hAnsiTheme="majorBidi" w:cstheme="majorBidi"/>
-          <w:sz w:val="32"/>
-          <w:szCs w:val="32"/>
-        </w:rPr>
-      </w:pPr>
     </w:p>
     <w:p>
       <w:pPr>
@@ -4869,7 +4858,6 @@
           <w:sz w:val="36"/>
           <w:szCs w:val="36"/>
         </w:rPr>
-        <w:lastRenderedPageBreak/>
         <w:t xml:space="preserve">1.3 </w:t>
       </w:r>
       <w:r>
@@ -5149,6 +5137,7 @@
           <w:cs/>
           <w14:ligatures w14:val="none"/>
         </w:rPr>
+        <w:lastRenderedPageBreak/>
         <w:t>ระบบรายงาน (</w:t>
       </w:r>
       <w:r>
@@ -5253,7 +5242,7 @@
     <w:tbl>
       <w:tblPr>
         <w:tblW w:w="11070" w:type="dxa"/>
-        <w:tblInd w:w="-815" w:type="dxa"/>
+        <w:tblInd w:w="-185" w:type="dxa"/>
         <w:tblBorders>
           <w:top w:val="single" w:sz="4" w:space="0" w:color="auto"/>
           <w:left w:val="single" w:sz="4" w:space="0" w:color="auto"/>
@@ -5921,7 +5910,6 @@
           <w:szCs w:val="40"/>
           <w:cs/>
         </w:rPr>
-        <w:lastRenderedPageBreak/>
         <w:t xml:space="preserve">บทที่ </w:t>
       </w:r>
       <w:r>
@@ -6216,6 +6204,28 @@
     </w:p>
     <w:p>
       <w:pPr>
+        <w:rPr>
+          <w:rFonts w:asciiTheme="majorBidi" w:eastAsiaTheme="majorEastAsia" w:hAnsiTheme="majorBidi" w:cstheme="majorBidi"/>
+          <w:b/>
+          <w:bCs/>
+          <w:sz w:val="36"/>
+          <w:szCs w:val="36"/>
+        </w:rPr>
+      </w:pPr>
+      <w:bookmarkStart w:id="9" w:name="_Toc226291803"/>
+      <w:r>
+        <w:rPr>
+          <w:rFonts w:asciiTheme="majorBidi" w:hAnsiTheme="majorBidi"/>
+          <w:b/>
+          <w:bCs/>
+          <w:sz w:val="36"/>
+          <w:szCs w:val="36"/>
+        </w:rPr>
+        <w:br w:type="page"/>
+      </w:r>
+    </w:p>
+    <w:p>
+      <w:pPr>
         <w:pStyle w:val="2"/>
         <w:rPr>
           <w:rFonts w:asciiTheme="majorBidi" w:hAnsiTheme="majorBidi"/>
@@ -6226,7 +6236,6 @@
           <w:szCs w:val="36"/>
         </w:rPr>
       </w:pPr>
-      <w:bookmarkStart w:id="9" w:name="_Toc226291803"/>
       <w:r>
         <w:rPr>
           <w:rFonts w:asciiTheme="majorBidi" w:hAnsiTheme="majorBidi"/>
@@ -6236,6 +6245,7 @@
           <w:sz w:val="36"/>
           <w:szCs w:val="36"/>
         </w:rPr>
+        <w:lastRenderedPageBreak/>
         <w:t xml:space="preserve">2.2 </w:t>
       </w:r>
       <w:r>
@@ -6844,7 +6854,6 @@
           <w:sz w:val="36"/>
           <w:szCs w:val="36"/>
         </w:rPr>
-        <w:lastRenderedPageBreak/>
         <w:t xml:space="preserve">2.4 </w:t>
       </w:r>
       <w:r>
@@ -6886,7 +6895,7 @@
     <w:tbl>
       <w:tblPr>
         <w:tblW w:w="10980" w:type="dxa"/>
-        <w:tblInd w:w="-728" w:type="dxa"/>
+        <w:tblInd w:w="-278" w:type="dxa"/>
         <w:tblCellMar>
           <w:left w:w="0" w:type="dxa"/>
           <w:right w:w="0" w:type="dxa"/>
@@ -7626,6 +7635,7 @@
                 <w:sz w:val="32"/>
                 <w:szCs w:val="32"/>
               </w:rPr>
+              <w:lastRenderedPageBreak/>
               <w:t xml:space="preserve">4. </w:t>
             </w:r>
             <w:r>
@@ -7990,36 +8000,16 @@
     </w:tbl>
     <w:p>
       <w:pPr>
-        <w:ind w:left="360"/>
-        <w:rPr>
-          <w:rFonts w:asciiTheme="majorBidi" w:hAnsiTheme="majorBidi" w:cstheme="majorBidi"/>
-          <w:sz w:val="32"/>
-          <w:szCs w:val="32"/>
-          <w:cs/>
-        </w:rPr>
-      </w:pPr>
-    </w:p>
-    <w:p>
-      <w:pPr>
-        <w:rPr>
-          <w:rFonts w:asciiTheme="majorBidi" w:hAnsiTheme="majorBidi" w:cstheme="majorBidi"/>
-          <w:sz w:val="32"/>
-          <w:szCs w:val="32"/>
-        </w:rPr>
-      </w:pPr>
-      <w:r>
-        <w:rPr>
-          <w:rFonts w:asciiTheme="majorBidi" w:hAnsiTheme="majorBidi" w:cstheme="majorBidi"/>
-          <w:sz w:val="32"/>
-          <w:szCs w:val="32"/>
-          <w:cs/>
-        </w:rPr>
-        <w:br w:type="page"/>
-      </w:r>
-    </w:p>
-    <w:p>
-      <w:pPr>
-        <w:pStyle w:val="2"/>
+        <w:pStyle w:val="1"/>
+        <w:rPr>
+          <w:rFonts w:asciiTheme="majorBidi" w:hAnsiTheme="majorBidi"/>
+          <w:color w:val="auto"/>
+          <w:sz w:val="32"/>
+          <w:szCs w:val="32"/>
+        </w:rPr>
+      </w:pPr>
+      <w:bookmarkStart w:id="12" w:name="_Toc226291806"/>
+      <w:r>
         <w:rPr>
           <w:rFonts w:asciiTheme="majorBidi" w:hAnsiTheme="majorBidi"/>
           <w:b/>
@@ -8028,18 +8018,6 @@
           <w:sz w:val="36"/>
           <w:szCs w:val="36"/>
         </w:rPr>
-      </w:pPr>
-      <w:bookmarkStart w:id="12" w:name="_Toc226291806"/>
-      <w:r>
-        <w:rPr>
-          <w:rFonts w:asciiTheme="majorBidi" w:hAnsiTheme="majorBidi"/>
-          <w:b/>
-          <w:bCs/>
-          <w:color w:val="auto"/>
-          <w:sz w:val="36"/>
-          <w:szCs w:val="36"/>
-        </w:rPr>
-        <w:lastRenderedPageBreak/>
         <w:t xml:space="preserve">2.5 </w:t>
       </w:r>
       <w:r>
@@ -8380,7 +8358,7 @@
       <w:pPr>
         <w:pStyle w:val="2"/>
         <w:rPr>
-          <w:rFonts w:asciiTheme="majorBidi" w:hAnsiTheme="majorBidi" w:hint="cs"/>
+          <w:rFonts w:asciiTheme="majorBidi" w:hAnsiTheme="majorBidi"/>
           <w:b/>
           <w:bCs/>
           <w:color w:val="auto"/>
@@ -8407,7 +8385,7 @@
       <w:tblPr>
         <w:tblStyle w:val="42"/>
         <w:tblW w:w="11321" w:type="dxa"/>
-        <w:tblInd w:w="-905" w:type="dxa"/>
+        <w:tblInd w:w="-455" w:type="dxa"/>
         <w:tblLook w:val="04A0" w:firstRow="1" w:lastRow="0" w:firstColumn="1" w:lastColumn="0" w:noHBand="0" w:noVBand="1"/>
       </w:tblPr>
       <w:tblGrid>
@@ -8472,7 +8450,7 @@
               <w:jc w:val="center"/>
               <w:cnfStyle w:val="100000000000" w:firstRow="1" w:lastRow="0" w:firstColumn="0" w:lastColumn="0" w:oddVBand="0" w:evenVBand="0" w:oddHBand="0" w:evenHBand="0" w:firstRowFirstColumn="0" w:firstRowLastColumn="0" w:lastRowFirstColumn="0" w:lastRowLastColumn="0"/>
               <w:rPr>
-                <w:rFonts w:asciiTheme="majorBidi" w:hAnsiTheme="majorBidi" w:cstheme="majorBidi" w:hint="cs"/>
+                <w:rFonts w:asciiTheme="majorBidi" w:hAnsiTheme="majorBidi" w:cstheme="majorBidi"/>
                 <w:szCs w:val="24"/>
               </w:rPr>
             </w:pPr>
@@ -8519,7 +8497,7 @@
               <w:jc w:val="center"/>
               <w:cnfStyle w:val="000000100000" w:firstRow="0" w:lastRow="0" w:firstColumn="0" w:lastColumn="0" w:oddVBand="0" w:evenVBand="0" w:oddHBand="1" w:evenHBand="0" w:firstRowFirstColumn="0" w:firstRowLastColumn="0" w:lastRowFirstColumn="0" w:lastRowLastColumn="0"/>
               <w:rPr>
-                <w:rFonts w:asciiTheme="majorBidi" w:hAnsiTheme="majorBidi" w:cstheme="majorBidi" w:hint="cs"/>
+                <w:rFonts w:asciiTheme="majorBidi" w:hAnsiTheme="majorBidi" w:cstheme="majorBidi"/>
                 <w:szCs w:val="24"/>
               </w:rPr>
             </w:pPr>
@@ -8544,7 +8522,7 @@
               <w:jc w:val="center"/>
               <w:cnfStyle w:val="000000100000" w:firstRow="0" w:lastRow="0" w:firstColumn="0" w:lastColumn="0" w:oddVBand="0" w:evenVBand="0" w:oddHBand="1" w:evenHBand="0" w:firstRowFirstColumn="0" w:firstRowLastColumn="0" w:lastRowFirstColumn="0" w:lastRowLastColumn="0"/>
               <w:rPr>
-                <w:rFonts w:asciiTheme="majorBidi" w:hAnsiTheme="majorBidi" w:cstheme="majorBidi" w:hint="cs"/>
+                <w:rFonts w:asciiTheme="majorBidi" w:hAnsiTheme="majorBidi" w:cstheme="majorBidi"/>
                 <w:szCs w:val="24"/>
               </w:rPr>
             </w:pPr>
@@ -8757,7 +8735,7 @@
               <w:jc w:val="center"/>
               <w:cnfStyle w:val="000000000000" w:firstRow="0" w:lastRow="0" w:firstColumn="0" w:lastColumn="0" w:oddVBand="0" w:evenVBand="0" w:oddHBand="0" w:evenHBand="0" w:firstRowFirstColumn="0" w:firstRowLastColumn="0" w:lastRowFirstColumn="0" w:lastRowLastColumn="0"/>
               <w:rPr>
-                <w:rFonts w:asciiTheme="majorBidi" w:hAnsiTheme="majorBidi" w:cstheme="majorBidi" w:hint="cs"/>
+                <w:rFonts w:asciiTheme="majorBidi" w:hAnsiTheme="majorBidi" w:cstheme="majorBidi"/>
                 <w:szCs w:val="24"/>
               </w:rPr>
             </w:pPr>
@@ -8829,7 +8807,7 @@
               <w:jc w:val="center"/>
               <w:cnfStyle w:val="000000000000" w:firstRow="0" w:lastRow="0" w:firstColumn="0" w:lastColumn="0" w:oddVBand="0" w:evenVBand="0" w:oddHBand="0" w:evenHBand="0" w:firstRowFirstColumn="0" w:firstRowLastColumn="0" w:lastRowFirstColumn="0" w:lastRowLastColumn="0"/>
               <w:rPr>
-                <w:rFonts w:asciiTheme="majorBidi" w:hAnsiTheme="majorBidi" w:cstheme="majorBidi" w:hint="cs"/>
+                <w:rFonts w:asciiTheme="majorBidi" w:hAnsiTheme="majorBidi" w:cstheme="majorBidi"/>
                 <w:szCs w:val="24"/>
               </w:rPr>
             </w:pPr>
@@ -10940,7 +10918,7 @@
     <w:p>
       <w:pPr>
         <w:rPr>
-          <w:rFonts w:asciiTheme="majorBidi" w:hAnsiTheme="majorBidi" w:cstheme="majorBidi" w:hint="cs"/>
+          <w:rFonts w:asciiTheme="majorBidi" w:hAnsiTheme="majorBidi" w:cstheme="majorBidi"/>
           <w:sz w:val="32"/>
           <w:szCs w:val="32"/>
         </w:rPr>
@@ -11750,7 +11728,6 @@
           <w:szCs w:val="32"/>
           <w:cs/>
         </w:rPr>
-        <w:lastRenderedPageBreak/>
         <w:t xml:space="preserve">ทดสอบการ </w:t>
       </w:r>
       <w:r>
@@ -11875,7 +11852,6 @@
     </w:p>
     <w:p>
       <w:pPr>
-        <w:ind w:left="360"/>
         <w:rPr>
           <w:rFonts w:asciiTheme="majorBidi" w:hAnsiTheme="majorBidi" w:cstheme="majorBidi"/>
           <w:b/>
@@ -11892,365 +11868,7 @@
           <w:sz w:val="36"/>
           <w:szCs w:val="36"/>
         </w:rPr>
-        <w:t>Journey #2: Catalog Lifecycle Management</w:t>
-      </w:r>
-    </w:p>
-    <w:p>
-      <w:pPr>
-        <w:numPr>
-          <w:ilvl w:val="0"/>
-          <w:numId w:val="23"/>
-        </w:numPr>
-        <w:rPr>
-          <w:rFonts w:asciiTheme="majorBidi" w:hAnsiTheme="majorBidi" w:cstheme="majorBidi"/>
-          <w:sz w:val="32"/>
-          <w:szCs w:val="32"/>
-        </w:rPr>
-      </w:pPr>
-      <w:r>
-        <w:rPr>
-          <w:rFonts w:asciiTheme="majorBidi" w:hAnsiTheme="majorBidi" w:cstheme="majorBidi"/>
-          <w:b/>
-          <w:bCs/>
-          <w:sz w:val="32"/>
-          <w:szCs w:val="32"/>
-          <w:cs/>
-        </w:rPr>
-        <w:t>จุดประสงค์</w:t>
-      </w:r>
-      <w:r>
-        <w:rPr>
-          <w:rFonts w:asciiTheme="majorBidi" w:hAnsiTheme="majorBidi" w:cstheme="majorBidi"/>
-          <w:sz w:val="32"/>
-          <w:szCs w:val="32"/>
-          <w:cs/>
-        </w:rPr>
-        <w:t>:</w:t>
-      </w:r>
-      <w:r>
-        <w:rPr>
-          <w:rFonts w:asciiTheme="majorBidi" w:hAnsiTheme="majorBidi" w:cstheme="majorBidi"/>
-          <w:sz w:val="32"/>
-          <w:szCs w:val="32"/>
-        </w:rPr>
-        <w:t xml:space="preserve"> </w:t>
-      </w:r>
-      <w:r>
-        <w:rPr>
-          <w:rFonts w:asciiTheme="majorBidi" w:hAnsiTheme="majorBidi" w:cstheme="majorBidi"/>
-          <w:sz w:val="32"/>
-          <w:szCs w:val="32"/>
-          <w:cs/>
-        </w:rPr>
-        <w:t>เพื่อทดสอบวงจรชีวิตของหนังสือ ตั้งแต่การนำเข้าจนถึงการลบออกจากระบบ</w:t>
-      </w:r>
-    </w:p>
-    <w:p>
-      <w:pPr>
-        <w:numPr>
-          <w:ilvl w:val="0"/>
-          <w:numId w:val="23"/>
-        </w:numPr>
-        <w:rPr>
-          <w:rFonts w:asciiTheme="majorBidi" w:hAnsiTheme="majorBidi" w:cstheme="majorBidi"/>
-          <w:b/>
-          <w:bCs/>
-          <w:sz w:val="32"/>
-          <w:szCs w:val="32"/>
-        </w:rPr>
-      </w:pPr>
-      <w:r>
-        <w:rPr>
-          <w:rFonts w:asciiTheme="majorBidi" w:hAnsiTheme="majorBidi" w:cstheme="majorBidi"/>
-          <w:b/>
-          <w:bCs/>
-          <w:sz w:val="32"/>
-          <w:szCs w:val="32"/>
-          <w:cs/>
-        </w:rPr>
-        <w:t>รายละเอียดขั้นตอน:</w:t>
-      </w:r>
-    </w:p>
-    <w:p>
-      <w:pPr>
-        <w:numPr>
-          <w:ilvl w:val="1"/>
-          <w:numId w:val="23"/>
-        </w:numPr>
-        <w:rPr>
-          <w:rFonts w:asciiTheme="majorBidi" w:hAnsiTheme="majorBidi" w:cstheme="majorBidi"/>
-          <w:sz w:val="32"/>
-          <w:szCs w:val="32"/>
-        </w:rPr>
-      </w:pPr>
-      <w:r>
-        <w:rPr>
-          <w:rFonts w:asciiTheme="majorBidi" w:hAnsiTheme="majorBidi" w:cstheme="majorBidi"/>
-          <w:sz w:val="32"/>
-          <w:szCs w:val="32"/>
-          <w:cs/>
-        </w:rPr>
-        <w:t>เพิ่มหนังสือใหม่ (</w:t>
-      </w:r>
-      <w:r>
-        <w:rPr>
-          <w:rFonts w:asciiTheme="majorBidi" w:hAnsiTheme="majorBidi" w:cstheme="majorBidi"/>
-          <w:sz w:val="32"/>
-          <w:szCs w:val="32"/>
-        </w:rPr>
-        <w:t xml:space="preserve">Add Book) </w:t>
-      </w:r>
-      <w:r>
-        <w:rPr>
-          <w:rFonts w:asciiTheme="majorBidi" w:hAnsiTheme="majorBidi" w:cstheme="majorBidi"/>
-          <w:sz w:val="32"/>
-          <w:szCs w:val="32"/>
-          <w:cs/>
-        </w:rPr>
-        <w:t xml:space="preserve">พร้อมกรอกข้อมูล </w:t>
-      </w:r>
-      <w:r>
-        <w:rPr>
-          <w:rFonts w:asciiTheme="majorBidi" w:hAnsiTheme="majorBidi" w:cstheme="majorBidi"/>
-          <w:sz w:val="32"/>
-          <w:szCs w:val="32"/>
-        </w:rPr>
-        <w:t>ISBN, Title, Author</w:t>
-      </w:r>
-    </w:p>
-    <w:p>
-      <w:pPr>
-        <w:numPr>
-          <w:ilvl w:val="1"/>
-          <w:numId w:val="23"/>
-        </w:numPr>
-        <w:rPr>
-          <w:rFonts w:asciiTheme="majorBidi" w:hAnsiTheme="majorBidi" w:cstheme="majorBidi"/>
-          <w:sz w:val="32"/>
-          <w:szCs w:val="32"/>
-        </w:rPr>
-      </w:pPr>
-      <w:r>
-        <w:rPr>
-          <w:rFonts w:asciiTheme="majorBidi" w:hAnsiTheme="majorBidi" w:cstheme="majorBidi"/>
-          <w:sz w:val="32"/>
-          <w:szCs w:val="32"/>
-          <w:cs/>
-        </w:rPr>
-        <w:t>ค้นหาหนังสือที่เพิ่งเพิ่ม (</w:t>
-      </w:r>
-      <w:r>
-        <w:rPr>
-          <w:rFonts w:asciiTheme="majorBidi" w:hAnsiTheme="majorBidi" w:cstheme="majorBidi"/>
-          <w:sz w:val="32"/>
-          <w:szCs w:val="32"/>
-        </w:rPr>
-        <w:t xml:space="preserve">Search) </w:t>
-      </w:r>
-      <w:r>
-        <w:rPr>
-          <w:rFonts w:asciiTheme="majorBidi" w:hAnsiTheme="majorBidi" w:cstheme="majorBidi"/>
-          <w:sz w:val="32"/>
-          <w:szCs w:val="32"/>
-          <w:cs/>
-        </w:rPr>
-        <w:t xml:space="preserve">เพื่อตรวจสอบว่าข้อมูลลง </w:t>
-      </w:r>
-      <w:r>
-        <w:rPr>
-          <w:rFonts w:asciiTheme="majorBidi" w:hAnsiTheme="majorBidi" w:cstheme="majorBidi"/>
-          <w:sz w:val="32"/>
-          <w:szCs w:val="32"/>
-        </w:rPr>
-        <w:t xml:space="preserve">Database </w:t>
-      </w:r>
-      <w:r>
-        <w:rPr>
-          <w:rFonts w:asciiTheme="majorBidi" w:hAnsiTheme="majorBidi" w:cstheme="majorBidi"/>
-          <w:sz w:val="32"/>
-          <w:szCs w:val="32"/>
-          <w:cs/>
-        </w:rPr>
-        <w:t>จริงหรือไม่</w:t>
-      </w:r>
-    </w:p>
-    <w:p>
-      <w:pPr>
-        <w:numPr>
-          <w:ilvl w:val="1"/>
-          <w:numId w:val="23"/>
-        </w:numPr>
-        <w:rPr>
-          <w:rFonts w:asciiTheme="majorBidi" w:hAnsiTheme="majorBidi" w:cstheme="majorBidi"/>
-          <w:sz w:val="32"/>
-          <w:szCs w:val="32"/>
-        </w:rPr>
-      </w:pPr>
-      <w:r>
-        <w:rPr>
-          <w:rFonts w:asciiTheme="majorBidi" w:hAnsiTheme="majorBidi" w:cstheme="majorBidi"/>
-          <w:sz w:val="32"/>
-          <w:szCs w:val="32"/>
-          <w:cs/>
-        </w:rPr>
-        <w:t>แก้ไขข้อมูลหนังสือ (</w:t>
-      </w:r>
-      <w:r>
-        <w:rPr>
-          <w:rFonts w:asciiTheme="majorBidi" w:hAnsiTheme="majorBidi" w:cstheme="majorBidi"/>
-          <w:sz w:val="32"/>
-          <w:szCs w:val="32"/>
-        </w:rPr>
-        <w:t xml:space="preserve">Edit) </w:t>
-      </w:r>
-      <w:r>
-        <w:rPr>
-          <w:rFonts w:asciiTheme="majorBidi" w:hAnsiTheme="majorBidi" w:cstheme="majorBidi"/>
-          <w:sz w:val="32"/>
-          <w:szCs w:val="32"/>
-          <w:cs/>
-        </w:rPr>
-        <w:t>และตรวจสอบความถูกต้องหลังบันทึก</w:t>
-      </w:r>
-    </w:p>
-    <w:p>
-      <w:pPr>
-        <w:numPr>
-          <w:ilvl w:val="1"/>
-          <w:numId w:val="23"/>
-        </w:numPr>
-        <w:rPr>
-          <w:rFonts w:asciiTheme="majorBidi" w:hAnsiTheme="majorBidi" w:cstheme="majorBidi"/>
-          <w:sz w:val="32"/>
-          <w:szCs w:val="32"/>
-        </w:rPr>
-      </w:pPr>
-      <w:r>
-        <w:rPr>
-          <w:rFonts w:asciiTheme="majorBidi" w:hAnsiTheme="majorBidi" w:cstheme="majorBidi"/>
-          <w:sz w:val="32"/>
-          <w:szCs w:val="32"/>
-          <w:cs/>
-        </w:rPr>
-        <w:t>ลบหนังสือ (</w:t>
-      </w:r>
-      <w:r>
-        <w:rPr>
-          <w:rFonts w:asciiTheme="majorBidi" w:hAnsiTheme="majorBidi" w:cstheme="majorBidi"/>
-          <w:sz w:val="32"/>
-          <w:szCs w:val="32"/>
-        </w:rPr>
-        <w:t xml:space="preserve">Delete) </w:t>
-      </w:r>
-      <w:r>
-        <w:rPr>
-          <w:rFonts w:asciiTheme="majorBidi" w:hAnsiTheme="majorBidi" w:cstheme="majorBidi"/>
-          <w:sz w:val="32"/>
-          <w:szCs w:val="32"/>
-          <w:cs/>
-        </w:rPr>
-        <w:t>และยืนยันการหายไปของข้อมูลในตาราง</w:t>
-      </w:r>
-    </w:p>
-    <w:p>
-      <w:pPr>
-        <w:numPr>
-          <w:ilvl w:val="0"/>
-          <w:numId w:val="23"/>
-        </w:numPr>
-        <w:rPr>
-          <w:rFonts w:asciiTheme="majorBidi" w:hAnsiTheme="majorBidi" w:cstheme="majorBidi"/>
-          <w:sz w:val="32"/>
-          <w:szCs w:val="32"/>
-        </w:rPr>
-      </w:pPr>
-      <w:r>
-        <w:rPr>
-          <w:rFonts w:asciiTheme="majorBidi" w:hAnsiTheme="majorBidi" w:cstheme="majorBidi"/>
-          <w:b/>
-          <w:bCs/>
-          <w:sz w:val="32"/>
-          <w:szCs w:val="32"/>
-          <w:cs/>
-        </w:rPr>
-        <w:t>เกณฑ์การผ่าน</w:t>
-      </w:r>
-      <w:r>
-        <w:rPr>
-          <w:rFonts w:asciiTheme="majorBidi" w:hAnsiTheme="majorBidi" w:cstheme="majorBidi"/>
-          <w:sz w:val="32"/>
-          <w:szCs w:val="32"/>
-          <w:cs/>
-        </w:rPr>
-        <w:t>:</w:t>
-      </w:r>
-      <w:r>
-        <w:rPr>
-          <w:rFonts w:asciiTheme="majorBidi" w:hAnsiTheme="majorBidi" w:cstheme="majorBidi"/>
-          <w:sz w:val="32"/>
-          <w:szCs w:val="32"/>
-        </w:rPr>
-        <w:t xml:space="preserve"> </w:t>
-      </w:r>
-      <w:r>
-        <w:rPr>
-          <w:rFonts w:asciiTheme="majorBidi" w:hAnsiTheme="majorBidi" w:cstheme="majorBidi"/>
-          <w:sz w:val="32"/>
-          <w:szCs w:val="32"/>
-          <w:cs/>
-        </w:rPr>
-        <w:t xml:space="preserve">ข้อมูลในตารางหน้า </w:t>
-      </w:r>
-      <w:r>
-        <w:rPr>
-          <w:rFonts w:asciiTheme="majorBidi" w:hAnsiTheme="majorBidi" w:cstheme="majorBidi"/>
-          <w:sz w:val="32"/>
-          <w:szCs w:val="32"/>
-        </w:rPr>
-        <w:t xml:space="preserve">UI </w:t>
-      </w:r>
-      <w:r>
-        <w:rPr>
-          <w:rFonts w:asciiTheme="majorBidi" w:hAnsiTheme="majorBidi" w:cstheme="majorBidi"/>
-          <w:sz w:val="32"/>
-          <w:szCs w:val="32"/>
-          <w:cs/>
-        </w:rPr>
-        <w:t xml:space="preserve">ต้อง </w:t>
-      </w:r>
-      <w:r>
-        <w:rPr>
-          <w:rFonts w:asciiTheme="majorBidi" w:hAnsiTheme="majorBidi" w:cstheme="majorBidi"/>
-          <w:sz w:val="32"/>
-          <w:szCs w:val="32"/>
-        </w:rPr>
-        <w:t xml:space="preserve">Sync </w:t>
-      </w:r>
-      <w:r>
-        <w:rPr>
-          <w:rFonts w:asciiTheme="majorBidi" w:hAnsiTheme="majorBidi" w:cstheme="majorBidi"/>
-          <w:sz w:val="32"/>
-          <w:szCs w:val="32"/>
-          <w:cs/>
-        </w:rPr>
-        <w:t xml:space="preserve">กับคำสั่ง </w:t>
-      </w:r>
-      <w:r>
-        <w:rPr>
-          <w:rFonts w:asciiTheme="majorBidi" w:hAnsiTheme="majorBidi" w:cstheme="majorBidi"/>
-          <w:sz w:val="32"/>
-          <w:szCs w:val="32"/>
-        </w:rPr>
-        <w:t xml:space="preserve">CRUD </w:t>
-      </w:r>
-      <w:r>
-        <w:rPr>
-          <w:rFonts w:asciiTheme="majorBidi" w:hAnsiTheme="majorBidi" w:cstheme="majorBidi"/>
-          <w:sz w:val="32"/>
-          <w:szCs w:val="32"/>
-          <w:cs/>
-        </w:rPr>
-        <w:t>ทันที</w:t>
+        <w:br w:type="page"/>
       </w:r>
     </w:p>
     <w:p>
@@ -12272,14 +11890,15 @@
           <w:sz w:val="36"/>
           <w:szCs w:val="36"/>
         </w:rPr>
-        <w:t>Journey #3: Member Management and Restrictions</w:t>
+        <w:lastRenderedPageBreak/>
+        <w:t>Journey #2: Catalog Lifecycle Management</w:t>
       </w:r>
     </w:p>
     <w:p>
       <w:pPr>
         <w:numPr>
           <w:ilvl w:val="0"/>
-          <w:numId w:val="24"/>
+          <w:numId w:val="23"/>
         </w:numPr>
         <w:rPr>
           <w:rFonts w:asciiTheme="majorBidi" w:hAnsiTheme="majorBidi" w:cstheme="majorBidi"/>
@@ -12296,9 +11915,41 @@
           <w:szCs w:val="32"/>
           <w:cs/>
         </w:rPr>
-        <w:t>จุดประสงค์:</w:t>
-      </w:r>
-      <w:r>
+        <w:t>จุดประสงค์</w:t>
+      </w:r>
+      <w:r>
+        <w:rPr>
+          <w:rFonts w:asciiTheme="majorBidi" w:hAnsiTheme="majorBidi" w:cstheme="majorBidi"/>
+          <w:sz w:val="32"/>
+          <w:szCs w:val="32"/>
+          <w:cs/>
+        </w:rPr>
+        <w:t>:</w:t>
+      </w:r>
+      <w:r>
+        <w:rPr>
+          <w:rFonts w:asciiTheme="majorBidi" w:hAnsiTheme="majorBidi" w:cstheme="majorBidi"/>
+          <w:sz w:val="32"/>
+          <w:szCs w:val="32"/>
+        </w:rPr>
+        <w:t xml:space="preserve"> </w:t>
+      </w:r>
+      <w:r>
+        <w:rPr>
+          <w:rFonts w:asciiTheme="majorBidi" w:hAnsiTheme="majorBidi" w:cstheme="majorBidi"/>
+          <w:sz w:val="32"/>
+          <w:szCs w:val="32"/>
+          <w:cs/>
+        </w:rPr>
+        <w:t>เพื่อทดสอบวงจรชีวิตของหนังสือ ตั้งแต่การนำเข้าจนถึงการลบออกจากระบบ</w:t>
+      </w:r>
+    </w:p>
+    <w:p>
+      <w:pPr>
+        <w:numPr>
+          <w:ilvl w:val="0"/>
+          <w:numId w:val="23"/>
+        </w:numPr>
         <w:rPr>
           <w:rFonts w:asciiTheme="majorBidi" w:hAnsiTheme="majorBidi" w:cstheme="majorBidi"/>
           <w:b/>
@@ -12306,29 +11957,6 @@
           <w:sz w:val="32"/>
           <w:szCs w:val="32"/>
         </w:rPr>
-        <w:t xml:space="preserve"> </w:t>
-      </w:r>
-      <w:r>
-        <w:rPr>
-          <w:rFonts w:asciiTheme="majorBidi" w:hAnsiTheme="majorBidi" w:cstheme="majorBidi"/>
-          <w:sz w:val="32"/>
-          <w:szCs w:val="32"/>
-          <w:cs/>
-        </w:rPr>
-        <w:t>เพื่อทดสอบการจัดการฐานข้อมูลสมาชิกและเงื่อนไขการระงับสิทธิ์</w:t>
-      </w:r>
-    </w:p>
-    <w:p>
-      <w:pPr>
-        <w:numPr>
-          <w:ilvl w:val="0"/>
-          <w:numId w:val="24"/>
-        </w:numPr>
-        <w:rPr>
-          <w:rFonts w:asciiTheme="majorBidi" w:hAnsiTheme="majorBidi" w:cstheme="majorBidi"/>
-          <w:sz w:val="32"/>
-          <w:szCs w:val="32"/>
-        </w:rPr>
       </w:pPr>
       <w:r>
         <w:rPr>
@@ -12346,7 +11974,7 @@
       <w:pPr>
         <w:numPr>
           <w:ilvl w:val="1"/>
-          <w:numId w:val="24"/>
+          <w:numId w:val="23"/>
         </w:numPr>
         <w:rPr>
           <w:rFonts w:asciiTheme="majorBidi" w:hAnsiTheme="majorBidi" w:cstheme="majorBidi"/>
@@ -12361,7 +11989,7 @@
           <w:szCs w:val="32"/>
           <w:cs/>
         </w:rPr>
-        <w:t>ลงทะเบียนสมาชิกใหม่ (</w:t>
+        <w:t>เพิ่มหนังสือใหม่ (</w:t>
       </w:r>
       <w:r>
         <w:rPr>
@@ -12369,7 +11997,7 @@
           <w:sz w:val="32"/>
           <w:szCs w:val="32"/>
         </w:rPr>
-        <w:t xml:space="preserve">Register Member) </w:t>
+        <w:t xml:space="preserve">Add Book) </w:t>
       </w:r>
       <w:r>
         <w:rPr>
@@ -12378,7 +12006,7 @@
           <w:szCs w:val="32"/>
           <w:cs/>
         </w:rPr>
-        <w:t>แยกตามประเภท (</w:t>
+        <w:t xml:space="preserve">พร้อมกรอกข้อมูล </w:t>
       </w:r>
       <w:r>
         <w:rPr>
@@ -12386,14 +12014,14 @@
           <w:sz w:val="32"/>
           <w:szCs w:val="32"/>
         </w:rPr>
-        <w:t>Student, Teacher, Public)</w:t>
+        <w:t>ISBN, Title, Author</w:t>
       </w:r>
     </w:p>
     <w:p>
       <w:pPr>
         <w:numPr>
           <w:ilvl w:val="1"/>
-          <w:numId w:val="24"/>
+          <w:numId w:val="23"/>
         </w:numPr>
         <w:rPr>
           <w:rFonts w:asciiTheme="majorBidi" w:hAnsiTheme="majorBidi" w:cstheme="majorBidi"/>
@@ -12408,7 +12036,7 @@
           <w:szCs w:val="32"/>
           <w:cs/>
         </w:rPr>
-        <w:t xml:space="preserve">แก้ไขสถานะสมาชิกเป็น </w:t>
+        <w:t>ค้นหาหนังสือที่เพิ่งเพิ่ม (</w:t>
       </w:r>
       <w:r>
         <w:rPr>
@@ -12416,7 +12044,7 @@
           <w:sz w:val="32"/>
           <w:szCs w:val="32"/>
         </w:rPr>
-        <w:t>'Suspended' (</w:t>
+        <w:t xml:space="preserve">Search) </w:t>
       </w:r>
       <w:r>
         <w:rPr>
@@ -12425,14 +12053,31 @@
           <w:szCs w:val="32"/>
           <w:cs/>
         </w:rPr>
-        <w:t>ระงับการใช้งาน)</w:t>
+        <w:t xml:space="preserve">เพื่อตรวจสอบว่าข้อมูลลง </w:t>
+      </w:r>
+      <w:r>
+        <w:rPr>
+          <w:rFonts w:asciiTheme="majorBidi" w:hAnsiTheme="majorBidi" w:cstheme="majorBidi"/>
+          <w:sz w:val="32"/>
+          <w:szCs w:val="32"/>
+        </w:rPr>
+        <w:t xml:space="preserve">Database </w:t>
+      </w:r>
+      <w:r>
+        <w:rPr>
+          <w:rFonts w:asciiTheme="majorBidi" w:hAnsiTheme="majorBidi" w:cstheme="majorBidi"/>
+          <w:sz w:val="32"/>
+          <w:szCs w:val="32"/>
+          <w:cs/>
+        </w:rPr>
+        <w:t>จริงหรือไม่</w:t>
       </w:r>
     </w:p>
     <w:p>
       <w:pPr>
         <w:numPr>
           <w:ilvl w:val="1"/>
-          <w:numId w:val="24"/>
+          <w:numId w:val="23"/>
         </w:numPr>
         <w:rPr>
           <w:rFonts w:asciiTheme="majorBidi" w:hAnsiTheme="majorBidi" w:cstheme="majorBidi"/>
@@ -12447,7 +12092,7 @@
           <w:szCs w:val="32"/>
           <w:cs/>
         </w:rPr>
-        <w:t>ทดสอบการค้นหาสมาชิกด้วยรหัส (</w:t>
+        <w:t>แก้ไขข้อมูลหนังสือ (</w:t>
       </w:r>
       <w:r>
         <w:rPr>
@@ -12455,14 +12100,62 @@
           <w:sz w:val="32"/>
           <w:szCs w:val="32"/>
         </w:rPr>
-        <w:t>Member Code)</w:t>
+        <w:t xml:space="preserve">Edit) </w:t>
+      </w:r>
+      <w:r>
+        <w:rPr>
+          <w:rFonts w:asciiTheme="majorBidi" w:hAnsiTheme="majorBidi" w:cstheme="majorBidi"/>
+          <w:sz w:val="32"/>
+          <w:szCs w:val="32"/>
+          <w:cs/>
+        </w:rPr>
+        <w:t>และตรวจสอบความถูกต้องหลังบันทึก</w:t>
       </w:r>
     </w:p>
     <w:p>
       <w:pPr>
         <w:numPr>
+          <w:ilvl w:val="1"/>
+          <w:numId w:val="23"/>
+        </w:numPr>
+        <w:rPr>
+          <w:rFonts w:asciiTheme="majorBidi" w:hAnsiTheme="majorBidi" w:cstheme="majorBidi"/>
+          <w:sz w:val="32"/>
+          <w:szCs w:val="32"/>
+        </w:rPr>
+      </w:pPr>
+      <w:r>
+        <w:rPr>
+          <w:rFonts w:asciiTheme="majorBidi" w:hAnsiTheme="majorBidi" w:cstheme="majorBidi"/>
+          <w:sz w:val="32"/>
+          <w:szCs w:val="32"/>
+          <w:cs/>
+        </w:rPr>
+        <w:t>ลบหนังสือ (</w:t>
+      </w:r>
+      <w:r>
+        <w:rPr>
+          <w:rFonts w:asciiTheme="majorBidi" w:hAnsiTheme="majorBidi" w:cstheme="majorBidi"/>
+          <w:sz w:val="32"/>
+          <w:szCs w:val="32"/>
+        </w:rPr>
+        <w:t xml:space="preserve">Delete) </w:t>
+      </w:r>
+      <w:r>
+        <w:rPr>
+          <w:rFonts w:asciiTheme="majorBidi" w:hAnsiTheme="majorBidi" w:cstheme="majorBidi"/>
+          <w:sz w:val="32"/>
+          <w:szCs w:val="32"/>
+          <w:cs/>
+        </w:rPr>
+        <w:t>และยืนยันการหายไปของข้อมูลในตาราง</w:t>
+      </w:r>
+    </w:p>
+    <w:p>
+      <w:pPr>
+        <w:numPr>
           <w:ilvl w:val="0"/>
-          <w:numId w:val="24"/>
+          <w:numId w:val="23"/>
         </w:numPr>
         <w:rPr>
           <w:rFonts w:asciiTheme="majorBidi" w:hAnsiTheme="majorBidi" w:cstheme="majorBidi"/>
@@ -12505,7 +12198,58 @@
           <w:szCs w:val="32"/>
           <w:cs/>
         </w:rPr>
-        <w:t>ระบบต้องรองรับประเภทสมาชิกที่หลากหลาย และสามารถเปลี่ยนสถานะสมาชิกได้จริง</w:t>
+        <w:t xml:space="preserve">ข้อมูลในตารางหน้า </w:t>
+      </w:r>
+      <w:r>
+        <w:rPr>
+          <w:rFonts w:asciiTheme="majorBidi" w:hAnsiTheme="majorBidi" w:cstheme="majorBidi"/>
+          <w:sz w:val="32"/>
+          <w:szCs w:val="32"/>
+        </w:rPr>
+        <w:t xml:space="preserve">UI </w:t>
+      </w:r>
+      <w:r>
+        <w:rPr>
+          <w:rFonts w:asciiTheme="majorBidi" w:hAnsiTheme="majorBidi" w:cstheme="majorBidi"/>
+          <w:sz w:val="32"/>
+          <w:szCs w:val="32"/>
+          <w:cs/>
+        </w:rPr>
+        <w:t xml:space="preserve">ต้อง </w:t>
+      </w:r>
+      <w:r>
+        <w:rPr>
+          <w:rFonts w:asciiTheme="majorBidi" w:hAnsiTheme="majorBidi" w:cstheme="majorBidi"/>
+          <w:sz w:val="32"/>
+          <w:szCs w:val="32"/>
+        </w:rPr>
+        <w:t xml:space="preserve">Sync </w:t>
+      </w:r>
+      <w:r>
+        <w:rPr>
+          <w:rFonts w:asciiTheme="majorBidi" w:hAnsiTheme="majorBidi" w:cstheme="majorBidi"/>
+          <w:sz w:val="32"/>
+          <w:szCs w:val="32"/>
+          <w:cs/>
+        </w:rPr>
+        <w:t xml:space="preserve">กับคำสั่ง </w:t>
+      </w:r>
+      <w:r>
+        <w:rPr>
+          <w:rFonts w:asciiTheme="majorBidi" w:hAnsiTheme="majorBidi" w:cstheme="majorBidi"/>
+          <w:sz w:val="32"/>
+          <w:szCs w:val="32"/>
+        </w:rPr>
+        <w:t xml:space="preserve">CRUD </w:t>
+      </w:r>
+      <w:r>
+        <w:rPr>
+          <w:rFonts w:asciiTheme="majorBidi" w:hAnsiTheme="majorBidi" w:cstheme="majorBidi"/>
+          <w:sz w:val="32"/>
+          <w:szCs w:val="32"/>
+          <w:cs/>
+        </w:rPr>
+        <w:t>ทันที</w:t>
       </w:r>
     </w:p>
     <w:p>
@@ -12519,7 +12263,10 @@
           <w:szCs w:val="36"/>
         </w:rPr>
       </w:pPr>
-      <w:r>
+    </w:p>
+    <w:p>
+      <w:pPr>
+        <w:ind w:left="360"/>
         <w:rPr>
           <w:rFonts w:asciiTheme="majorBidi" w:hAnsiTheme="majorBidi" w:cstheme="majorBidi"/>
           <w:b/>
@@ -12527,7 +12274,282 @@
           <w:sz w:val="36"/>
           <w:szCs w:val="36"/>
         </w:rPr>
-        <w:lastRenderedPageBreak/>
+      </w:pPr>
+      <w:r>
+        <w:rPr>
+          <w:rFonts w:asciiTheme="majorBidi" w:hAnsiTheme="majorBidi" w:cstheme="majorBidi"/>
+          <w:b/>
+          <w:bCs/>
+          <w:sz w:val="36"/>
+          <w:szCs w:val="36"/>
+        </w:rPr>
+        <w:t>Journey #3: Member Management and Restrictions</w:t>
+      </w:r>
+    </w:p>
+    <w:p>
+      <w:pPr>
+        <w:numPr>
+          <w:ilvl w:val="0"/>
+          <w:numId w:val="24"/>
+        </w:numPr>
+        <w:rPr>
+          <w:rFonts w:asciiTheme="majorBidi" w:hAnsiTheme="majorBidi" w:cstheme="majorBidi"/>
+          <w:sz w:val="32"/>
+          <w:szCs w:val="32"/>
+        </w:rPr>
+      </w:pPr>
+      <w:r>
+        <w:rPr>
+          <w:rFonts w:asciiTheme="majorBidi" w:hAnsiTheme="majorBidi" w:cstheme="majorBidi"/>
+          <w:b/>
+          <w:bCs/>
+          <w:sz w:val="32"/>
+          <w:szCs w:val="32"/>
+          <w:cs/>
+        </w:rPr>
+        <w:t>จุดประสงค์:</w:t>
+      </w:r>
+      <w:r>
+        <w:rPr>
+          <w:rFonts w:asciiTheme="majorBidi" w:hAnsiTheme="majorBidi" w:cstheme="majorBidi"/>
+          <w:b/>
+          <w:bCs/>
+          <w:sz w:val="32"/>
+          <w:szCs w:val="32"/>
+        </w:rPr>
+        <w:t xml:space="preserve"> </w:t>
+      </w:r>
+      <w:r>
+        <w:rPr>
+          <w:rFonts w:asciiTheme="majorBidi" w:hAnsiTheme="majorBidi" w:cstheme="majorBidi"/>
+          <w:sz w:val="32"/>
+          <w:szCs w:val="32"/>
+          <w:cs/>
+        </w:rPr>
+        <w:t>เพื่อทดสอบการจัดการฐานข้อมูลสมาชิกและเงื่อนไขการระงับสิทธิ์</w:t>
+      </w:r>
+    </w:p>
+    <w:p>
+      <w:pPr>
+        <w:numPr>
+          <w:ilvl w:val="0"/>
+          <w:numId w:val="24"/>
+        </w:numPr>
+        <w:rPr>
+          <w:rFonts w:asciiTheme="majorBidi" w:hAnsiTheme="majorBidi" w:cstheme="majorBidi"/>
+          <w:sz w:val="32"/>
+          <w:szCs w:val="32"/>
+        </w:rPr>
+      </w:pPr>
+      <w:r>
+        <w:rPr>
+          <w:rFonts w:asciiTheme="majorBidi" w:hAnsiTheme="majorBidi" w:cstheme="majorBidi"/>
+          <w:b/>
+          <w:bCs/>
+          <w:sz w:val="32"/>
+          <w:szCs w:val="32"/>
+          <w:cs/>
+        </w:rPr>
+        <w:t>รายละเอียดขั้นตอน:</w:t>
+      </w:r>
+    </w:p>
+    <w:p>
+      <w:pPr>
+        <w:numPr>
+          <w:ilvl w:val="1"/>
+          <w:numId w:val="24"/>
+        </w:numPr>
+        <w:rPr>
+          <w:rFonts w:asciiTheme="majorBidi" w:hAnsiTheme="majorBidi" w:cstheme="majorBidi"/>
+          <w:sz w:val="32"/>
+          <w:szCs w:val="32"/>
+        </w:rPr>
+      </w:pPr>
+      <w:r>
+        <w:rPr>
+          <w:rFonts w:asciiTheme="majorBidi" w:hAnsiTheme="majorBidi" w:cstheme="majorBidi"/>
+          <w:sz w:val="32"/>
+          <w:szCs w:val="32"/>
+          <w:cs/>
+        </w:rPr>
+        <w:t>ลงทะเบียนสมาชิกใหม่ (</w:t>
+      </w:r>
+      <w:r>
+        <w:rPr>
+          <w:rFonts w:asciiTheme="majorBidi" w:hAnsiTheme="majorBidi" w:cstheme="majorBidi"/>
+          <w:sz w:val="32"/>
+          <w:szCs w:val="32"/>
+        </w:rPr>
+        <w:t xml:space="preserve">Register Member) </w:t>
+      </w:r>
+      <w:r>
+        <w:rPr>
+          <w:rFonts w:asciiTheme="majorBidi" w:hAnsiTheme="majorBidi" w:cstheme="majorBidi"/>
+          <w:sz w:val="32"/>
+          <w:szCs w:val="32"/>
+          <w:cs/>
+        </w:rPr>
+        <w:t>แยกตามประเภท (</w:t>
+      </w:r>
+      <w:r>
+        <w:rPr>
+          <w:rFonts w:asciiTheme="majorBidi" w:hAnsiTheme="majorBidi" w:cstheme="majorBidi"/>
+          <w:sz w:val="32"/>
+          <w:szCs w:val="32"/>
+        </w:rPr>
+        <w:t>Student, Teacher, Public)</w:t>
+      </w:r>
+    </w:p>
+    <w:p>
+      <w:pPr>
+        <w:numPr>
+          <w:ilvl w:val="1"/>
+          <w:numId w:val="24"/>
+        </w:numPr>
+        <w:rPr>
+          <w:rFonts w:asciiTheme="majorBidi" w:hAnsiTheme="majorBidi" w:cstheme="majorBidi"/>
+          <w:sz w:val="32"/>
+          <w:szCs w:val="32"/>
+        </w:rPr>
+      </w:pPr>
+      <w:r>
+        <w:rPr>
+          <w:rFonts w:asciiTheme="majorBidi" w:hAnsiTheme="majorBidi" w:cstheme="majorBidi"/>
+          <w:sz w:val="32"/>
+          <w:szCs w:val="32"/>
+          <w:cs/>
+        </w:rPr>
+        <w:t xml:space="preserve">แก้ไขสถานะสมาชิกเป็น </w:t>
+      </w:r>
+      <w:r>
+        <w:rPr>
+          <w:rFonts w:asciiTheme="majorBidi" w:hAnsiTheme="majorBidi" w:cstheme="majorBidi"/>
+          <w:sz w:val="32"/>
+          <w:szCs w:val="32"/>
+        </w:rPr>
+        <w:t>'Suspended' (</w:t>
+      </w:r>
+      <w:r>
+        <w:rPr>
+          <w:rFonts w:asciiTheme="majorBidi" w:hAnsiTheme="majorBidi" w:cstheme="majorBidi"/>
+          <w:sz w:val="32"/>
+          <w:szCs w:val="32"/>
+          <w:cs/>
+        </w:rPr>
+        <w:t>ระงับการใช้งาน)</w:t>
+      </w:r>
+    </w:p>
+    <w:p>
+      <w:pPr>
+        <w:numPr>
+          <w:ilvl w:val="1"/>
+          <w:numId w:val="24"/>
+        </w:numPr>
+        <w:rPr>
+          <w:rFonts w:asciiTheme="majorBidi" w:hAnsiTheme="majorBidi" w:cstheme="majorBidi"/>
+          <w:sz w:val="32"/>
+          <w:szCs w:val="32"/>
+        </w:rPr>
+      </w:pPr>
+      <w:r>
+        <w:rPr>
+          <w:rFonts w:asciiTheme="majorBidi" w:hAnsiTheme="majorBidi" w:cstheme="majorBidi"/>
+          <w:sz w:val="32"/>
+          <w:szCs w:val="32"/>
+          <w:cs/>
+        </w:rPr>
+        <w:t>ทดสอบการค้นหาสมาชิกด้วยรหัส (</w:t>
+      </w:r>
+      <w:r>
+        <w:rPr>
+          <w:rFonts w:asciiTheme="majorBidi" w:hAnsiTheme="majorBidi" w:cstheme="majorBidi"/>
+          <w:sz w:val="32"/>
+          <w:szCs w:val="32"/>
+        </w:rPr>
+        <w:t>Member Code)</w:t>
+      </w:r>
+    </w:p>
+    <w:p>
+      <w:pPr>
+        <w:numPr>
+          <w:ilvl w:val="0"/>
+          <w:numId w:val="24"/>
+        </w:numPr>
+        <w:rPr>
+          <w:rFonts w:asciiTheme="majorBidi" w:hAnsiTheme="majorBidi" w:cstheme="majorBidi"/>
+          <w:sz w:val="32"/>
+          <w:szCs w:val="32"/>
+        </w:rPr>
+      </w:pPr>
+      <w:r>
+        <w:rPr>
+          <w:rFonts w:asciiTheme="majorBidi" w:hAnsiTheme="majorBidi" w:cstheme="majorBidi"/>
+          <w:b/>
+          <w:bCs/>
+          <w:sz w:val="32"/>
+          <w:szCs w:val="32"/>
+          <w:cs/>
+        </w:rPr>
+        <w:t>เกณฑ์การผ่าน</w:t>
+      </w:r>
+      <w:r>
+        <w:rPr>
+          <w:rFonts w:asciiTheme="majorBidi" w:hAnsiTheme="majorBidi" w:cstheme="majorBidi"/>
+          <w:sz w:val="32"/>
+          <w:szCs w:val="32"/>
+          <w:cs/>
+        </w:rPr>
+        <w:t>:</w:t>
+      </w:r>
+      <w:r>
+        <w:rPr>
+          <w:rFonts w:asciiTheme="majorBidi" w:hAnsiTheme="majorBidi" w:cstheme="majorBidi"/>
+          <w:sz w:val="32"/>
+          <w:szCs w:val="32"/>
+        </w:rPr>
+        <w:t xml:space="preserve"> </w:t>
+      </w:r>
+      <w:r>
+        <w:rPr>
+          <w:rFonts w:asciiTheme="majorBidi" w:hAnsiTheme="majorBidi" w:cstheme="majorBidi"/>
+          <w:sz w:val="32"/>
+          <w:szCs w:val="32"/>
+          <w:cs/>
+        </w:rPr>
+        <w:t>ระบบต้องรองรับประเภทสมาชิกที่หลากหลาย และสามารถเปลี่ยนสถานะสมาชิกได้จริง</w:t>
+      </w:r>
+    </w:p>
+    <w:p>
+      <w:pPr>
+        <w:ind w:left="360"/>
+        <w:rPr>
+          <w:rFonts w:asciiTheme="majorBidi" w:hAnsiTheme="majorBidi" w:cstheme="majorBidi"/>
+          <w:b/>
+          <w:bCs/>
+          <w:sz w:val="36"/>
+          <w:szCs w:val="36"/>
+        </w:rPr>
+      </w:pPr>
+    </w:p>
+    <w:p>
+      <w:pPr>
+        <w:ind w:left="360"/>
+        <w:rPr>
+          <w:rFonts w:asciiTheme="majorBidi" w:hAnsiTheme="majorBidi" w:cstheme="majorBidi"/>
+          <w:b/>
+          <w:bCs/>
+          <w:sz w:val="36"/>
+          <w:szCs w:val="36"/>
+        </w:rPr>
+      </w:pPr>
+      <w:r>
+        <w:rPr>
+          <w:rFonts w:asciiTheme="majorBidi" w:hAnsiTheme="majorBidi" w:cstheme="majorBidi"/>
+          <w:b/>
+          <w:bCs/>
+          <w:sz w:val="36"/>
+          <w:szCs w:val="36"/>
+        </w:rPr>
         <w:t>Journey #4: Core Transaction (Borrowing and Returning)</w:t>
       </w:r>
     </w:p>
@@ -12738,6 +12760,7 @@
           <w:szCs w:val="32"/>
           <w:cs/>
         </w:rPr>
+        <w:lastRenderedPageBreak/>
         <w:t>ทำรายการคืนหนังสือ (</w:t>
       </w:r>
       <w:r>
@@ -12862,6 +12885,17 @@
         </w:rPr>
         <w:t>ต้องสอดคล้องกัน</w:t>
       </w:r>
+    </w:p>
+    <w:p>
+      <w:pPr>
+        <w:rPr>
+          <w:rFonts w:asciiTheme="majorBidi" w:hAnsiTheme="majorBidi" w:cstheme="majorBidi"/>
+          <w:b/>
+          <w:bCs/>
+          <w:sz w:val="36"/>
+          <w:szCs w:val="36"/>
+        </w:rPr>
+      </w:pPr>
     </w:p>
     <w:p>
       <w:pPr>
@@ -13270,8 +13304,8 @@
         <w:tblLook w:val="04A0" w:firstRow="1" w:lastRow="0" w:firstColumn="1" w:lastColumn="0" w:noHBand="0" w:noVBand="1"/>
       </w:tblPr>
       <w:tblGrid>
-        <w:gridCol w:w="2411"/>
-        <w:gridCol w:w="6939"/>
+        <w:gridCol w:w="2604"/>
+        <w:gridCol w:w="7852"/>
       </w:tblGrid>
       <w:tr>
         <w:trPr>
@@ -14759,14 +14793,34 @@
                 <w:szCs w:val="32"/>
               </w:rPr>
             </w:pPr>
-            <w:r>
-              <w:rPr>
-                <w:rFonts w:asciiTheme="majorBidi" w:hAnsiTheme="majorBidi" w:cstheme="majorBidi"/>
-                <w:sz w:val="32"/>
-                <w:szCs w:val="32"/>
-              </w:rPr>
-              <w:t>ระบบไม่อนุญาตให้เข้าสู่ระบบ และแสดงข้อความแจ้งเตือน</w:t>
-            </w:r>
+            <w:proofErr w:type="spellStart"/>
+            <w:r>
+              <w:rPr>
+                <w:rFonts w:asciiTheme="majorBidi" w:hAnsiTheme="majorBidi" w:cstheme="majorBidi"/>
+                <w:sz w:val="32"/>
+                <w:szCs w:val="32"/>
+              </w:rPr>
+              <w:t>ระบบอนุญาตให้เข้าสู่ระบบ</w:t>
+            </w:r>
+            <w:proofErr w:type="spellEnd"/>
+            <w:r>
+              <w:rPr>
+                <w:rFonts w:asciiTheme="majorBidi" w:hAnsiTheme="majorBidi" w:cstheme="majorBidi"/>
+                <w:sz w:val="32"/>
+                <w:szCs w:val="32"/>
+              </w:rPr>
+              <w:t xml:space="preserve"> </w:t>
+            </w:r>
+            <w:proofErr w:type="spellStart"/>
+            <w:r>
+              <w:rPr>
+                <w:rFonts w:asciiTheme="majorBidi" w:hAnsiTheme="majorBidi" w:cstheme="majorBidi"/>
+                <w:sz w:val="32"/>
+                <w:szCs w:val="32"/>
+              </w:rPr>
+              <w:t>และแสดงข้อความแจ้งเตือน</w:t>
+            </w:r>
+            <w:proofErr w:type="spellEnd"/>
           </w:p>
         </w:tc>
         <w:tc>
@@ -15052,14 +15106,34 @@
                 <w:szCs w:val="32"/>
               </w:rPr>
             </w:pPr>
-            <w:r>
-              <w:rPr>
-                <w:rFonts w:asciiTheme="majorBidi" w:hAnsiTheme="majorBidi" w:cstheme="majorBidi"/>
-                <w:sz w:val="32"/>
-                <w:szCs w:val="32"/>
-              </w:rPr>
-              <w:t>ระบบไม่อนุญาตให้เข้าสู่ระบบ และแสดงข้อความแจ้งเตือน</w:t>
-            </w:r>
+            <w:proofErr w:type="spellStart"/>
+            <w:r>
+              <w:rPr>
+                <w:rFonts w:asciiTheme="majorBidi" w:hAnsiTheme="majorBidi" w:cstheme="majorBidi"/>
+                <w:sz w:val="32"/>
+                <w:szCs w:val="32"/>
+              </w:rPr>
+              <w:t>ระบบอนุญาตให้เข้าสู่ระบบ</w:t>
+            </w:r>
+            <w:proofErr w:type="spellEnd"/>
+            <w:r>
+              <w:rPr>
+                <w:rFonts w:asciiTheme="majorBidi" w:hAnsiTheme="majorBidi" w:cstheme="majorBidi"/>
+                <w:sz w:val="32"/>
+                <w:szCs w:val="32"/>
+              </w:rPr>
+              <w:t xml:space="preserve"> </w:t>
+            </w:r>
+            <w:proofErr w:type="spellStart"/>
+            <w:r>
+              <w:rPr>
+                <w:rFonts w:asciiTheme="majorBidi" w:hAnsiTheme="majorBidi" w:cstheme="majorBidi"/>
+                <w:sz w:val="32"/>
+                <w:szCs w:val="32"/>
+              </w:rPr>
+              <w:t>และแสดงข้อความแจ้งเตือน</w:t>
+            </w:r>
+            <w:proofErr w:type="spellEnd"/>
           </w:p>
         </w:tc>
         <w:tc>
@@ -15428,7 +15502,6 @@
                 <w:sz w:val="32"/>
                 <w:szCs w:val="32"/>
               </w:rPr>
-              <w:lastRenderedPageBreak/>
               <w:t>TC-04</w:t>
             </w:r>
           </w:p>
@@ -15713,6 +15786,7 @@
                 <w:sz w:val="32"/>
                 <w:szCs w:val="32"/>
               </w:rPr>
+              <w:lastRenderedPageBreak/>
               <w:t>TC-05</w:t>
             </w:r>
           </w:p>
@@ -16635,7 +16709,6 @@
                 <w:sz w:val="32"/>
                 <w:szCs w:val="32"/>
               </w:rPr>
-              <w:lastRenderedPageBreak/>
               <w:t>TC-09</w:t>
             </w:r>
           </w:p>
@@ -16937,6 +17010,7 @@
                 <w:sz w:val="32"/>
                 <w:szCs w:val="32"/>
               </w:rPr>
+              <w:lastRenderedPageBreak/>
               <w:t>TC-10</w:t>
             </w:r>
           </w:p>
@@ -17748,7 +17822,6 @@
                 <w:sz w:val="32"/>
                 <w:szCs w:val="32"/>
               </w:rPr>
-              <w:lastRenderedPageBreak/>
               <w:t>TC-13</w:t>
             </w:r>
           </w:p>
@@ -18095,6 +18168,14 @@
                 <w:szCs w:val="32"/>
               </w:rPr>
               <w:br/>
+            </w:r>
+            <w:r>
+              <w:rPr>
+                <w:rFonts w:asciiTheme="majorBidi" w:hAnsiTheme="majorBidi" w:cstheme="majorBidi"/>
+                <w:sz w:val="32"/>
+                <w:szCs w:val="32"/>
+              </w:rPr>
+              <w:lastRenderedPageBreak/>
               <w:t xml:space="preserve">2. </w:t>
             </w:r>
             <w:r>
@@ -18160,6 +18241,7 @@
                 <w:szCs w:val="32"/>
                 <w:cs/>
               </w:rPr>
+              <w:lastRenderedPageBreak/>
               <w:t>ตารางต้องแสดงเฉพาะรายชื่อหนังสือที่ตรงกับคำค้นหา</w:t>
             </w:r>
           </w:p>
@@ -19007,7 +19089,6 @@
                 <w:sz w:val="32"/>
                 <w:szCs w:val="32"/>
               </w:rPr>
-              <w:lastRenderedPageBreak/>
               <w:t>TC-18</w:t>
             </w:r>
           </w:p>
@@ -19510,6 +19591,7 @@
                 <w:sz w:val="32"/>
                 <w:szCs w:val="32"/>
               </w:rPr>
+              <w:lastRenderedPageBreak/>
               <w:t>TC-20</w:t>
             </w:r>
           </w:p>
@@ -19864,16 +19946,7 @@
                 <w:sz w:val="32"/>
                 <w:szCs w:val="32"/>
               </w:rPr>
-              <w:t xml:space="preserve">Code, </w:t>
-            </w:r>
-            <w:r>
-              <w:rPr>
-                <w:rFonts w:asciiTheme="majorBidi" w:hAnsiTheme="majorBidi" w:cstheme="majorBidi"/>
-                <w:sz w:val="32"/>
-                <w:szCs w:val="32"/>
-              </w:rPr>
-              <w:lastRenderedPageBreak/>
-              <w:t>Name, Type)</w:t>
+              <w:t>Code, Name, Type)</w:t>
             </w:r>
             <w:r>
               <w:rPr>
@@ -19930,7 +20003,6 @@
                 <w:szCs w:val="32"/>
                 <w:cs/>
               </w:rPr>
-              <w:lastRenderedPageBreak/>
               <w:t>ข้อมูลสมาชิกใหม่ต้องปรากฏในตาราง และมีสถานะเริ่มต้นเป็น</w:t>
             </w:r>
             <w:r>
@@ -20642,6 +20714,14 @@
                 <w:szCs w:val="32"/>
               </w:rPr>
               <w:br/>
+            </w:r>
+            <w:r>
+              <w:rPr>
+                <w:rFonts w:asciiTheme="majorBidi" w:hAnsiTheme="majorBidi" w:cstheme="majorBidi"/>
+                <w:sz w:val="32"/>
+                <w:szCs w:val="32"/>
+              </w:rPr>
+              <w:lastRenderedPageBreak/>
               <w:t xml:space="preserve">2. </w:t>
             </w:r>
             <w:r>
@@ -20699,7 +20779,18 @@
                 <w:szCs w:val="32"/>
                 <w:cs/>
               </w:rPr>
-              <w:t xml:space="preserve">ระบบควรตั้งค่าจำนวนหนังสือสูงสุดที่ยืมได้ตามประเภท (เช่น </w:t>
+              <w:lastRenderedPageBreak/>
+              <w:t>ระบบควรตั้งค่าจำนวนหนังสือสูงสุดที่ยืมได้ตาม</w:t>
+            </w:r>
+            <w:r>
+              <w:rPr>
+                <w:rFonts w:asciiTheme="majorBidi" w:hAnsiTheme="majorBidi" w:cstheme="majorBidi"/>
+                <w:sz w:val="32"/>
+                <w:szCs w:val="32"/>
+                <w:cs/>
+              </w:rPr>
+              <w:lastRenderedPageBreak/>
+              <w:t xml:space="preserve">ประเภท (เช่น </w:t>
             </w:r>
             <w:r>
               <w:rPr>
@@ -20746,6 +20837,7 @@
                 <w:sz w:val="32"/>
                 <w:szCs w:val="32"/>
               </w:rPr>
+              <w:lastRenderedPageBreak/>
               <w:t>ระบบยอมให้ผู้ใช้กรอกค่า Max Books ของ Student เกิน 3 เล่ม และบันทึกลงฐานข้อมูลได้</w:t>
             </w:r>
           </w:p>
@@ -21074,7 +21166,6 @@
                 <w:sz w:val="32"/>
                 <w:szCs w:val="32"/>
               </w:rPr>
-              <w:lastRenderedPageBreak/>
               <w:t>TC-26</w:t>
             </w:r>
           </w:p>
@@ -21911,6 +22002,7 @@
                 <w:sz w:val="32"/>
                 <w:szCs w:val="32"/>
               </w:rPr>
+              <w:lastRenderedPageBreak/>
               <w:t>TC-29</w:t>
             </w:r>
           </w:p>
@@ -22145,7 +22237,6 @@
                 <w:sz w:val="32"/>
                 <w:szCs w:val="32"/>
               </w:rPr>
-              <w:lastRenderedPageBreak/>
               <w:t>TC-30</w:t>
             </w:r>
           </w:p>
@@ -24495,17 +24586,7 @@
                 <w:szCs w:val="32"/>
                 <w:cs/>
               </w:rPr>
-              <w:t>ขยายเวลา) ในรายการ</w:t>
-            </w:r>
-            <w:r>
-              <w:rPr>
-                <w:rFonts w:asciiTheme="majorBidi" w:hAnsiTheme="majorBidi" w:cstheme="majorBidi"/>
-                <w:sz w:val="32"/>
-                <w:szCs w:val="32"/>
-                <w:cs/>
-              </w:rPr>
-              <w:lastRenderedPageBreak/>
-              <w:t>ยืม</w:t>
+              <w:t>ขยายเวลา) ในรายการยืม</w:t>
             </w:r>
             <w:r>
               <w:rPr>
@@ -24554,7 +24635,6 @@
                 <w:szCs w:val="32"/>
                 <w:cs/>
               </w:rPr>
-              <w:lastRenderedPageBreak/>
               <w:t xml:space="preserve">ระบบต้องอัปเดต </w:t>
             </w:r>
             <w:r>
@@ -24572,17 +24652,7 @@
                 <w:szCs w:val="32"/>
                 <w:cs/>
               </w:rPr>
-              <w:t>ใหม่ในฐานข้อมูล</w:t>
-            </w:r>
-            <w:r>
-              <w:rPr>
-                <w:rFonts w:asciiTheme="majorBidi" w:hAnsiTheme="majorBidi" w:cstheme="majorBidi"/>
-                <w:sz w:val="32"/>
-                <w:szCs w:val="32"/>
-                <w:cs/>
-              </w:rPr>
-              <w:lastRenderedPageBreak/>
-              <w:t>และหน้าจอได้อย่างถูกต้อง</w:t>
+              <w:t>ใหม่ในฐานข้อมูลและหน้าจอได้อย่างถูกต้อง</w:t>
             </w:r>
           </w:p>
         </w:tc>
@@ -24612,7 +24682,6 @@
                 <w:sz w:val="32"/>
                 <w:szCs w:val="32"/>
               </w:rPr>
-              <w:lastRenderedPageBreak/>
               <w:t>ไม่พบปุ่ม 'Extend' บนหน้ารายการยืม</w:t>
             </w:r>
           </w:p>
@@ -24681,6 +24750,7 @@
                 <w:sz w:val="32"/>
                 <w:szCs w:val="32"/>
               </w:rPr>
+              <w:lastRenderedPageBreak/>
               <w:t>TC-40</w:t>
             </w:r>
           </w:p>
@@ -25956,7 +26026,6 @@
                 <w:sz w:val="32"/>
                 <w:szCs w:val="32"/>
               </w:rPr>
-              <w:lastRenderedPageBreak/>
               <w:t>TC-45</w:t>
             </w:r>
           </w:p>
@@ -26466,6 +26535,7 @@
                 <w:sz w:val="32"/>
                 <w:szCs w:val="32"/>
               </w:rPr>
+              <w:lastRenderedPageBreak/>
               <w:t>TC-47</w:t>
             </w:r>
           </w:p>
@@ -27343,11 +27413,30 @@
     <w:p>
       <w:pPr>
         <w:rPr>
+          <w:rFonts w:asciiTheme="majorBidi" w:hAnsiTheme="majorBidi" w:cstheme="majorBidi"/>
+          <w:sz w:val="32"/>
+          <w:szCs w:val="32"/>
+          <w:cs/>
+        </w:rPr>
+      </w:pPr>
+    </w:p>
+    <w:p>
+      <w:pPr>
+        <w:rPr>
           <w:rFonts w:asciiTheme="majorBidi" w:hAnsiTheme="majorBidi" w:cstheme="majorBidi" w:hint="cs"/>
           <w:sz w:val="32"/>
           <w:szCs w:val="32"/>
         </w:rPr>
       </w:pPr>
+      <w:r>
+        <w:rPr>
+          <w:rFonts w:asciiTheme="majorBidi" w:hAnsiTheme="majorBidi" w:cstheme="majorBidi"/>
+          <w:sz w:val="32"/>
+          <w:szCs w:val="32"/>
+          <w:cs/>
+        </w:rPr>
+        <w:br w:type="page"/>
+      </w:r>
     </w:p>
     <w:p>
       <w:pPr>
@@ -27359,6 +27448,7 @@
         </w:rPr>
       </w:pPr>
       <w:bookmarkStart w:id="20" w:name="_Toc226291814"/>
+      <w:proofErr w:type="spellStart"/>
       <w:r>
         <w:rPr>
           <w:rFonts w:ascii="Angsana New" w:eastAsia="Angsana New" w:hAnsi="Angsana New" w:cs="Angsana New"/>
@@ -27368,7 +27458,40 @@
           <w:szCs w:val="40"/>
         </w:rPr>
         <w:lastRenderedPageBreak/>
-        <w:t>บทที่ 5: รายงานข้อผิดพลาด (Bug Reports)</w:t>
+        <w:t>บทที่</w:t>
+      </w:r>
+      <w:proofErr w:type="spellEnd"/>
+      <w:r>
+        <w:rPr>
+          <w:rFonts w:ascii="Angsana New" w:eastAsia="Angsana New" w:hAnsi="Angsana New" w:cs="Angsana New"/>
+          <w:b/>
+          <w:bCs/>
+          <w:color w:val="auto"/>
+          <w:szCs w:val="40"/>
+        </w:rPr>
+        <w:t xml:space="preserve"> 5: </w:t>
+      </w:r>
+      <w:proofErr w:type="spellStart"/>
+      <w:r>
+        <w:rPr>
+          <w:rFonts w:ascii="Angsana New" w:eastAsia="Angsana New" w:hAnsi="Angsana New" w:cs="Angsana New"/>
+          <w:b/>
+          <w:bCs/>
+          <w:color w:val="auto"/>
+          <w:szCs w:val="40"/>
+        </w:rPr>
+        <w:t>รายงานข้อผิดพลาด</w:t>
+      </w:r>
+      <w:proofErr w:type="spellEnd"/>
+      <w:r>
+        <w:rPr>
+          <w:rFonts w:ascii="Angsana New" w:eastAsia="Angsana New" w:hAnsi="Angsana New" w:cs="Angsana New"/>
+          <w:b/>
+          <w:bCs/>
+          <w:color w:val="auto"/>
+          <w:szCs w:val="40"/>
+        </w:rPr>
+        <w:t xml:space="preserve"> (Bug Reports)</w:t>
       </w:r>
       <w:bookmarkEnd w:id="20"/>
     </w:p>
@@ -28291,6 +28414,23 @@
     </w:p>
     <w:p>
       <w:pPr>
+        <w:rPr>
+          <w:rFonts w:ascii="Angsana New" w:eastAsia="Angsana New" w:hAnsi="Angsana New" w:cs="Angsana New"/>
+          <w:sz w:val="32"/>
+          <w:szCs w:val="32"/>
+        </w:rPr>
+      </w:pPr>
+      <w:r>
+        <w:rPr>
+          <w:rFonts w:ascii="Angsana New" w:eastAsia="Angsana New" w:hAnsi="Angsana New" w:cs="Angsana New"/>
+          <w:sz w:val="32"/>
+          <w:szCs w:val="32"/>
+        </w:rPr>
+        <w:br w:type="page"/>
+      </w:r>
+    </w:p>
+    <w:p>
+      <w:pPr>
         <w:pStyle w:val="a9"/>
         <w:numPr>
           <w:ilvl w:val="1"/>
@@ -28549,93 +28689,20 @@
     </w:p>
     <w:p>
       <w:pPr>
-        <w:pStyle w:val="a9"/>
-        <w:ind w:left="2160"/>
-      </w:pPr>
-    </w:p>
-    <w:p>
-      <w:pPr>
-        <w:pStyle w:val="a9"/>
-        <w:ind w:left="2160"/>
-      </w:pPr>
-    </w:p>
-    <w:p>
-      <w:pPr>
-        <w:pStyle w:val="a9"/>
-        <w:ind w:left="2160"/>
-      </w:pPr>
-    </w:p>
-    <w:p>
-      <w:pPr>
-        <w:pStyle w:val="a9"/>
-        <w:ind w:left="2160"/>
-      </w:pPr>
-    </w:p>
-    <w:p>
-      <w:pPr>
-        <w:pStyle w:val="a9"/>
-        <w:ind w:left="2160"/>
-      </w:pPr>
-    </w:p>
-    <w:p>
-      <w:pPr>
-        <w:pStyle w:val="a9"/>
-        <w:ind w:left="2160"/>
-      </w:pPr>
-    </w:p>
-    <w:p>
-      <w:pPr>
-        <w:pStyle w:val="a9"/>
-        <w:ind w:left="2160"/>
-      </w:pPr>
-    </w:p>
-    <w:p>
-      <w:pPr>
-        <w:pStyle w:val="a9"/>
-        <w:ind w:left="2160"/>
-      </w:pPr>
-    </w:p>
-    <w:p>
-      <w:pPr>
-        <w:pStyle w:val="a9"/>
-        <w:ind w:left="2160"/>
-      </w:pPr>
-    </w:p>
-    <w:p>
-      <w:pPr>
-        <w:pStyle w:val="a9"/>
-        <w:ind w:left="2160"/>
-      </w:pPr>
-    </w:p>
-    <w:p>
-      <w:pPr>
-        <w:pStyle w:val="a9"/>
-        <w:ind w:left="2160"/>
-      </w:pPr>
-    </w:p>
-    <w:p>
-      <w:pPr>
-        <w:pStyle w:val="a9"/>
-        <w:ind w:left="2160"/>
-      </w:pPr>
-    </w:p>
-    <w:p>
-      <w:pPr>
-        <w:pStyle w:val="a9"/>
-        <w:ind w:left="2160"/>
-      </w:pPr>
-    </w:p>
-    <w:p>
-      <w:pPr>
-        <w:pStyle w:val="a9"/>
-        <w:ind w:left="2160"/>
-      </w:pPr>
-    </w:p>
-    <w:p>
-      <w:pPr>
-        <w:pStyle w:val="a9"/>
-        <w:ind w:left="2160"/>
-      </w:pPr>
+        <w:rPr>
+          <w:rFonts w:ascii="Angsana New" w:eastAsia="Angsana New" w:hAnsi="Angsana New" w:cs="Angsana New"/>
+          <w:sz w:val="32"/>
+          <w:szCs w:val="32"/>
+        </w:rPr>
+      </w:pPr>
+      <w:r>
+        <w:rPr>
+          <w:rFonts w:ascii="Angsana New" w:eastAsia="Angsana New" w:hAnsi="Angsana New" w:cs="Angsana New"/>
+          <w:sz w:val="32"/>
+          <w:szCs w:val="32"/>
+        </w:rPr>
+        <w:br w:type="page"/>
+      </w:r>
     </w:p>
     <w:p>
       <w:pPr>
@@ -28656,6 +28723,7 @@
           <w:sz w:val="32"/>
           <w:szCs w:val="32"/>
         </w:rPr>
+        <w:lastRenderedPageBreak/>
         <w:t>Bug ID: BUG-UI-002</w:t>
       </w:r>
     </w:p>
@@ -30037,7 +30105,6 @@
           <w:sz w:val="32"/>
           <w:szCs w:val="32"/>
         </w:rPr>
-        <w:lastRenderedPageBreak/>
         <w:t>4) Security (ความปลอดภัย)</w:t>
       </w:r>
     </w:p>
@@ -30083,6 +30150,7 @@
           <w:sz w:val="32"/>
           <w:szCs w:val="32"/>
         </w:rPr>
+        <w:lastRenderedPageBreak/>
         <w:t>5) Performance Efficiency (ประสิทธิภาพของระบบ)</w:t>
       </w:r>
     </w:p>
@@ -30254,7 +30322,6 @@
           <w:sz w:val="32"/>
           <w:szCs w:val="32"/>
         </w:rPr>
-        <w:lastRenderedPageBreak/>
         <w:t>แสดงให้เห็นว่าระบบมีความพร้อมในการใช้งานในระดับหนึ่ง อย่างไรก็ตาม ยังพบข้อผิดพลาดในบางส่วนของระบบ โดยเฉพาะฟีเจอร์ที่ยังพัฒนาไม่ครบ เช่น การค้นหาสมาชิก (Search Member), การขยายระยะเวลาการยืม (Extend), และการแสดงผลรายงาน (Reports)</w:t>
       </w:r>
     </w:p>
@@ -30357,6 +30424,7 @@
           <w:sz w:val="32"/>
           <w:szCs w:val="32"/>
         </w:rPr>
+        <w:lastRenderedPageBreak/>
         <w:t>ควรเพิ่มการตรวจสอบข้อมูล (Input Validation)</w:t>
       </w:r>
       <w:r>
@@ -30493,7 +30561,6 @@
           <w:sz w:val="32"/>
           <w:szCs w:val="32"/>
         </w:rPr>
-        <w:lastRenderedPageBreak/>
         <w:t>ควรมีการทดสอบเพิ่มเติมในสภาพแวดล้อมจริง (Production Environment)</w:t>
       </w:r>
       <w:r>
@@ -30967,8 +31034,8 @@
     <w:p/>
     <w:sectPr>
       <w:footerReference w:type="default" r:id="rId26"/>
-      <w:pgSz w:w="12240" w:h="15840"/>
-      <w:pgMar w:top="1440" w:right="1440" w:bottom="1440" w:left="1440" w:header="720" w:footer="720" w:gutter="0"/>
+      <w:pgSz w:w="11906" w:h="16838" w:code="9"/>
+      <w:pgMar w:top="720" w:right="720" w:bottom="720" w:left="720" w:header="720" w:footer="720" w:gutter="0"/>
       <w:pgNumType w:start="1"/>
       <w:cols w:space="720"/>
       <w:docGrid w:linePitch="360"/>
@@ -38283,6 +38350,10 @@
 </file>
 
 <file path=customXml/item1.xml><?xml version="1.0" encoding="utf-8"?>
+<b:Sources xmlns:b="http://schemas.openxmlformats.org/officeDocument/2006/bibliography" xmlns="http://schemas.openxmlformats.org/officeDocument/2006/bibliography" SelectedStyle="\APASixthEditionOfficeOnline.xsl" StyleName="APA" Version="6"/>
+</file>
+
+<file path=customXml/item2.xml><?xml version="1.0" encoding="utf-8"?>
 <p:properties xmlns:p="http://schemas.microsoft.com/office/2006/metadata/properties" xmlns:xsi="http://www.w3.org/2001/XMLSchema-instance" xmlns:pc="http://schemas.microsoft.com/office/infopath/2007/PartnerControls">
   <documentManagement>
     <_activity xmlns="d1d38ede-9d60-43de-b392-1c0d93d681a5" xsi:nil="true"/>
@@ -38290,11 +38361,16 @@
 </p:properties>
 </file>
 
-<file path=customXml/item2.xml><?xml version="1.0" encoding="utf-8"?>
-<b:Sources xmlns:b="http://schemas.openxmlformats.org/officeDocument/2006/bibliography" xmlns="http://schemas.openxmlformats.org/officeDocument/2006/bibliography" SelectedStyle="\APASixthEditionOfficeOnline.xsl" StyleName="APA" Version="6"/>
+<file path=customXml/item3.xml><?xml version="1.0" encoding="utf-8"?>
+<?mso-contentType ?>
+<FormTemplates xmlns="http://schemas.microsoft.com/sharepoint/v3/contenttype/forms">
+  <Display>DocumentLibraryForm</Display>
+  <Edit>DocumentLibraryForm</Edit>
+  <New>DocumentLibraryForm</New>
+</FormTemplates>
 </file>
 
-<file path=customXml/item3.xml><?xml version="1.0" encoding="utf-8"?>
+<file path=customXml/item4.xml><?xml version="1.0" encoding="utf-8"?>
 <ct:contentTypeSchema xmlns:ct="http://schemas.microsoft.com/office/2006/metadata/contentType" xmlns:ma="http://schemas.microsoft.com/office/2006/metadata/properties/metaAttributes" ct:_="" ma:_="" ma:contentTypeName="Document" ma:contentTypeID="0x010100259431974BEB9F45A22B82E39D1D735A" ma:contentTypeVersion="16" ma:contentTypeDescription="Create a new document." ma:contentTypeScope="" ma:versionID="530b8aea005d8c7cbbead45254c816c5">
   <xsd:schema xmlns:xsd="http://www.w3.org/2001/XMLSchema" xmlns:xs="http://www.w3.org/2001/XMLSchema" xmlns:p="http://schemas.microsoft.com/office/2006/metadata/properties" xmlns:ns3="d1d38ede-9d60-43de-b392-1c0d93d681a5" xmlns:ns4="443f97fc-1572-46b9-bf28-b6cb1d13fa37" targetNamespace="http://schemas.microsoft.com/office/2006/metadata/properties" ma:root="true" ma:fieldsID="b3ba9dd7554cb414ba39956f952556ad" ns3:_="" ns4:_="">
     <xsd:import namespace="d1d38ede-9d60-43de-b392-1c0d93d681a5"/>
@@ -38533,16 +38609,15 @@
 </ct:contentTypeSchema>
 </file>
 
-<file path=customXml/item4.xml><?xml version="1.0" encoding="utf-8"?>
-<?mso-contentType ?>
-<FormTemplates xmlns="http://schemas.microsoft.com/sharepoint/v3/contenttype/forms">
-  <Display>DocumentLibraryForm</Display>
-  <Edit>DocumentLibraryForm</Edit>
-  <New>DocumentLibraryForm</New>
-</FormTemplates>
+<file path=customXml/itemProps1.xml><?xml version="1.0" encoding="utf-8"?>
+<ds:datastoreItem xmlns:ds="http://schemas.openxmlformats.org/officeDocument/2006/customXml" ds:itemID="{9B97FB2E-4396-4617-9E09-8EC6EB098492}">
+  <ds:schemaRefs>
+    <ds:schemaRef ds:uri="http://schemas.openxmlformats.org/officeDocument/2006/bibliography"/>
+  </ds:schemaRefs>
+</ds:datastoreItem>
 </file>
 
-<file path=customXml/itemProps1.xml><?xml version="1.0" encoding="utf-8"?>
+<file path=customXml/itemProps2.xml><?xml version="1.0" encoding="utf-8"?>
 <ds:datastoreItem xmlns:ds="http://schemas.openxmlformats.org/officeDocument/2006/customXml" ds:itemID="{42984361-D6F6-427D-ACBB-FF1D8068CC55}">
   <ds:schemaRefs>
     <ds:schemaRef ds:uri="http://schemas.microsoft.com/office/2006/metadata/properties"/>
@@ -38552,15 +38627,15 @@
 </ds:datastoreItem>
 </file>
 
-<file path=customXml/itemProps2.xml><?xml version="1.0" encoding="utf-8"?>
-<ds:datastoreItem xmlns:ds="http://schemas.openxmlformats.org/officeDocument/2006/customXml" ds:itemID="{9B97FB2E-4396-4617-9E09-8EC6EB098492}">
+<file path=customXml/itemProps3.xml><?xml version="1.0" encoding="utf-8"?>
+<ds:datastoreItem xmlns:ds="http://schemas.openxmlformats.org/officeDocument/2006/customXml" ds:itemID="{7015E301-260E-4686-A297-32850535F46E}">
   <ds:schemaRefs>
-    <ds:schemaRef ds:uri="http://schemas.openxmlformats.org/officeDocument/2006/bibliography"/>
+    <ds:schemaRef ds:uri="http://schemas.microsoft.com/sharepoint/v3/contenttype/forms"/>
   </ds:schemaRefs>
 </ds:datastoreItem>
 </file>
 
-<file path=customXml/itemProps3.xml><?xml version="1.0" encoding="utf-8"?>
+<file path=customXml/itemProps4.xml><?xml version="1.0" encoding="utf-8"?>
 <ds:datastoreItem xmlns:ds="http://schemas.openxmlformats.org/officeDocument/2006/customXml" ds:itemID="{3796158E-5BC9-42FC-B15E-F64CA70A6C72}">
   <ds:schemaRefs>
     <ds:schemaRef ds:uri="http://schemas.microsoft.com/office/2006/metadata/contentType"/>
@@ -38579,14 +38654,6 @@
 </ds:datastoreItem>
 </file>
 
-<file path=customXml/itemProps4.xml><?xml version="1.0" encoding="utf-8"?>
-<ds:datastoreItem xmlns:ds="http://schemas.openxmlformats.org/officeDocument/2006/customXml" ds:itemID="{7015E301-260E-4686-A297-32850535F46E}">
-  <ds:schemaRefs>
-    <ds:schemaRef ds:uri="http://schemas.microsoft.com/sharepoint/v3/contenttype/forms"/>
-  </ds:schemaRefs>
-</ds:datastoreItem>
-</file>
-
 <file path=docMetadata/LabelInfo.xml><?xml version="1.0" encoding="utf-8"?>
 <clbl:labelList xmlns:clbl="http://schemas.microsoft.com/office/2020/mipLabelMetadata">
   <clbl:label id="{b69dd9f4-0c6d-4310-9d05-2cf943075335}" enabled="0" method="" siteId="{b69dd9f4-0c6d-4310-9d05-2cf943075335}" removed="1"/>

</xml_diff>

<commit_message>
Up the final Presentation
</commit_message>
<xml_diff>
--- a/reports/Software Testing and Evaluation.docx
+++ b/reports/Software Testing and Evaluation.docx
@@ -14464,7 +14464,6 @@
       <w:pPr>
         <w:pStyle w:val="2"/>
         <w:rPr>
-          <w:rFonts w:hint="cs"/>
           <w:b/>
           <w:bCs/>
           <w:color w:val="auto"/>
@@ -19275,7 +19274,7 @@
                 <w:sz w:val="32"/>
                 <w:szCs w:val="32"/>
               </w:rPr>
-              <w:t>ระบบไม่แสดงข้อมูลหนังสือทั้งหมดออกมา</w:t>
+              <w:t>ระบบแสดงข้อมูลหนังสือทั้งหมดออกมา</w:t>
             </w:r>
           </w:p>
         </w:tc>
@@ -19302,6 +19301,15 @@
             </w:pPr>
             <w:r>
               <w:rPr>
+                <w:rFonts w:ascii="Angsana New" w:eastAsia="Angsana New" w:hAnsi="Angsana New" w:cs="Angsana New" w:hint="cs"/>
+                <w:sz w:val="32"/>
+                <w:szCs w:val="32"/>
+                <w:cs/>
+              </w:rPr>
+              <w:t>ไม่</w:t>
+            </w:r>
+            <w:r>
+              <w:rPr>
                 <w:rFonts w:ascii="Angsana New" w:eastAsia="Angsana New" w:hAnsi="Angsana New" w:cs="Angsana New"/>
                 <w:sz w:val="32"/>
                 <w:szCs w:val="32"/>
@@ -27658,7 +27666,7 @@
       <w:pPr>
         <w:pStyle w:val="2"/>
         <w:rPr>
-          <w:rFonts w:asciiTheme="majorBidi" w:hAnsiTheme="majorBidi" w:hint="cs"/>
+          <w:rFonts w:asciiTheme="majorBidi" w:hAnsiTheme="majorBidi"/>
           <w:b/>
           <w:bCs/>
           <w:color w:val="auto"/>
@@ -27703,7 +27711,6 @@
         </w:rPr>
       </w:pPr>
       <w:bookmarkStart w:id="22" w:name="_Toc226364142"/>
-      <w:proofErr w:type="spellStart"/>
       <w:r>
         <w:rPr>
           <w:rFonts w:ascii="Angsana New" w:eastAsia="Angsana New" w:hAnsi="Angsana New" w:cs="Angsana New"/>
@@ -27712,40 +27719,7 @@
           <w:color w:val="auto"/>
           <w:szCs w:val="40"/>
         </w:rPr>
-        <w:t>บทที่</w:t>
-      </w:r>
-      <w:proofErr w:type="spellEnd"/>
-      <w:r>
-        <w:rPr>
-          <w:rFonts w:ascii="Angsana New" w:eastAsia="Angsana New" w:hAnsi="Angsana New" w:cs="Angsana New"/>
-          <w:b/>
-          <w:bCs/>
-          <w:color w:val="auto"/>
-          <w:szCs w:val="40"/>
-        </w:rPr>
-        <w:t xml:space="preserve"> 5: </w:t>
-      </w:r>
-      <w:proofErr w:type="spellStart"/>
-      <w:r>
-        <w:rPr>
-          <w:rFonts w:ascii="Angsana New" w:eastAsia="Angsana New" w:hAnsi="Angsana New" w:cs="Angsana New"/>
-          <w:b/>
-          <w:bCs/>
-          <w:color w:val="auto"/>
-          <w:szCs w:val="40"/>
-        </w:rPr>
-        <w:t>รายงานข้อผิดพลาด</w:t>
-      </w:r>
-      <w:proofErr w:type="spellEnd"/>
-      <w:r>
-        <w:rPr>
-          <w:rFonts w:ascii="Angsana New" w:eastAsia="Angsana New" w:hAnsi="Angsana New" w:cs="Angsana New"/>
-          <w:b/>
-          <w:bCs/>
-          <w:color w:val="auto"/>
-          <w:szCs w:val="40"/>
-        </w:rPr>
-        <w:t xml:space="preserve"> (Bug Reports)</w:t>
+        <w:t>บทที่ 5: รายงานข้อผิดพลาด (Bug Reports)</w:t>
       </w:r>
       <w:bookmarkEnd w:id="22"/>
     </w:p>
@@ -38750,6 +38724,10 @@
 </file>
 
 <file path=customXml/item1.xml><?xml version="1.0" encoding="utf-8"?>
+<b:Sources xmlns:b="http://schemas.openxmlformats.org/officeDocument/2006/bibliography" xmlns="http://schemas.openxmlformats.org/officeDocument/2006/bibliography" SelectedStyle="\APASixthEditionOfficeOnline.xsl" StyleName="APA" Version="6"/>
+</file>
+
+<file path=customXml/item2.xml><?xml version="1.0" encoding="utf-8"?>
 <p:properties xmlns:p="http://schemas.microsoft.com/office/2006/metadata/properties" xmlns:xsi="http://www.w3.org/2001/XMLSchema-instance" xmlns:pc="http://schemas.microsoft.com/office/infopath/2007/PartnerControls">
   <documentManagement>
     <_activity xmlns="d1d38ede-9d60-43de-b392-1c0d93d681a5" xsi:nil="true"/>
@@ -38757,11 +38735,16 @@
 </p:properties>
 </file>
 
-<file path=customXml/item2.xml><?xml version="1.0" encoding="utf-8"?>
-<b:Sources xmlns:b="http://schemas.openxmlformats.org/officeDocument/2006/bibliography" xmlns="http://schemas.openxmlformats.org/officeDocument/2006/bibliography" SelectedStyle="\APASixthEditionOfficeOnline.xsl" StyleName="APA" Version="6"/>
+<file path=customXml/item3.xml><?xml version="1.0" encoding="utf-8"?>
+<?mso-contentType ?>
+<FormTemplates xmlns="http://schemas.microsoft.com/sharepoint/v3/contenttype/forms">
+  <Display>DocumentLibraryForm</Display>
+  <Edit>DocumentLibraryForm</Edit>
+  <New>DocumentLibraryForm</New>
+</FormTemplates>
 </file>
 
-<file path=customXml/item3.xml><?xml version="1.0" encoding="utf-8"?>
+<file path=customXml/item4.xml><?xml version="1.0" encoding="utf-8"?>
 <ct:contentTypeSchema xmlns:ct="http://schemas.microsoft.com/office/2006/metadata/contentType" xmlns:ma="http://schemas.microsoft.com/office/2006/metadata/properties/metaAttributes" ct:_="" ma:_="" ma:contentTypeName="Document" ma:contentTypeID="0x010100259431974BEB9F45A22B82E39D1D735A" ma:contentTypeVersion="16" ma:contentTypeDescription="Create a new document." ma:contentTypeScope="" ma:versionID="530b8aea005d8c7cbbead45254c816c5">
   <xsd:schema xmlns:xsd="http://www.w3.org/2001/XMLSchema" xmlns:xs="http://www.w3.org/2001/XMLSchema" xmlns:p="http://schemas.microsoft.com/office/2006/metadata/properties" xmlns:ns3="d1d38ede-9d60-43de-b392-1c0d93d681a5" xmlns:ns4="443f97fc-1572-46b9-bf28-b6cb1d13fa37" targetNamespace="http://schemas.microsoft.com/office/2006/metadata/properties" ma:root="true" ma:fieldsID="b3ba9dd7554cb414ba39956f952556ad" ns3:_="" ns4:_="">
     <xsd:import namespace="d1d38ede-9d60-43de-b392-1c0d93d681a5"/>
@@ -39000,16 +38983,15 @@
 </ct:contentTypeSchema>
 </file>
 
-<file path=customXml/item4.xml><?xml version="1.0" encoding="utf-8"?>
-<?mso-contentType ?>
-<FormTemplates xmlns="http://schemas.microsoft.com/sharepoint/v3/contenttype/forms">
-  <Display>DocumentLibraryForm</Display>
-  <Edit>DocumentLibraryForm</Edit>
-  <New>DocumentLibraryForm</New>
-</FormTemplates>
+<file path=customXml/itemProps1.xml><?xml version="1.0" encoding="utf-8"?>
+<ds:datastoreItem xmlns:ds="http://schemas.openxmlformats.org/officeDocument/2006/customXml" ds:itemID="{9B97FB2E-4396-4617-9E09-8EC6EB098492}">
+  <ds:schemaRefs>
+    <ds:schemaRef ds:uri="http://schemas.openxmlformats.org/officeDocument/2006/bibliography"/>
+  </ds:schemaRefs>
+</ds:datastoreItem>
 </file>
 
-<file path=customXml/itemProps1.xml><?xml version="1.0" encoding="utf-8"?>
+<file path=customXml/itemProps2.xml><?xml version="1.0" encoding="utf-8"?>
 <ds:datastoreItem xmlns:ds="http://schemas.openxmlformats.org/officeDocument/2006/customXml" ds:itemID="{42984361-D6F6-427D-ACBB-FF1D8068CC55}">
   <ds:schemaRefs>
     <ds:schemaRef ds:uri="http://schemas.microsoft.com/office/2006/metadata/properties"/>
@@ -39019,15 +39001,15 @@
 </ds:datastoreItem>
 </file>
 
-<file path=customXml/itemProps2.xml><?xml version="1.0" encoding="utf-8"?>
-<ds:datastoreItem xmlns:ds="http://schemas.openxmlformats.org/officeDocument/2006/customXml" ds:itemID="{9B97FB2E-4396-4617-9E09-8EC6EB098492}">
+<file path=customXml/itemProps3.xml><?xml version="1.0" encoding="utf-8"?>
+<ds:datastoreItem xmlns:ds="http://schemas.openxmlformats.org/officeDocument/2006/customXml" ds:itemID="{7015E301-260E-4686-A297-32850535F46E}">
   <ds:schemaRefs>
-    <ds:schemaRef ds:uri="http://schemas.openxmlformats.org/officeDocument/2006/bibliography"/>
+    <ds:schemaRef ds:uri="http://schemas.microsoft.com/sharepoint/v3/contenttype/forms"/>
   </ds:schemaRefs>
 </ds:datastoreItem>
 </file>
 
-<file path=customXml/itemProps3.xml><?xml version="1.0" encoding="utf-8"?>
+<file path=customXml/itemProps4.xml><?xml version="1.0" encoding="utf-8"?>
 <ds:datastoreItem xmlns:ds="http://schemas.openxmlformats.org/officeDocument/2006/customXml" ds:itemID="{3796158E-5BC9-42FC-B15E-F64CA70A6C72}">
   <ds:schemaRefs>
     <ds:schemaRef ds:uri="http://schemas.microsoft.com/office/2006/metadata/contentType"/>
@@ -39046,14 +39028,6 @@
 </ds:datastoreItem>
 </file>
 
-<file path=customXml/itemProps4.xml><?xml version="1.0" encoding="utf-8"?>
-<ds:datastoreItem xmlns:ds="http://schemas.openxmlformats.org/officeDocument/2006/customXml" ds:itemID="{7015E301-260E-4686-A297-32850535F46E}">
-  <ds:schemaRefs>
-    <ds:schemaRef ds:uri="http://schemas.microsoft.com/sharepoint/v3/contenttype/forms"/>
-  </ds:schemaRefs>
-</ds:datastoreItem>
-</file>
-
 <file path=docMetadata/LabelInfo.xml><?xml version="1.0" encoding="utf-8"?>
 <clbl:labelList xmlns:clbl="http://schemas.microsoft.com/office/2020/mipLabelMetadata">
   <clbl:label id="{b69dd9f4-0c6d-4310-9d05-2cf943075335}" enabled="0" method="" siteId="{b69dd9f4-0c6d-4310-9d05-2cf943075335}" removed="1"/>

</xml_diff>